<commit_message>
feat: implémenter les règles de gestion manquantes RG06, RG08, RG09, RG45, RG46
- RG06: Porte à 5 tentatives de connexion avant blocage (MAX_ATTEMPTS)
- RG08: Vérification qu'une convention a des rubriques avant création d'une demande
- RG09: Tests couvrant la contrainte rubriques ≤ montant convention
- RG45/RG46: Remplacement du chat porteur par l'accès FAQ uniquement
- Adapte les tests existants aux nouvelles valeurs
</commit_message>
<xml_diff>
--- a/rapport/components/chap1.docx
+++ b/rapport/components/chap1.docx
@@ -2455,7 +2455,7 @@
         <w:rPr>
           <w:rFonts w:ascii="Garamond" w:hAnsi="Garamond" w:eastAsia="Garamond" w:cs="Garamond"/>
         </w:rPr>
-        <w:t xml:space="preserve">UJKZ, la gestion opérationnelle des ressources financières issues des partenaires extérieurs demeure complexe après la signature des conventions.</w:t>
+        <w:t xml:space="preserve">UJKZ, la gestion opérationnelle des ressources financières issues des partenaires extérieurs demeure complexe .</w:t>
       </w:r>
       <w:r>
         <w:rPr>
@@ -2633,27 +2633,6 @@
         <w:rPr>
           <w:rFonts w:ascii="Garamond" w:hAnsi="Garamond" w:cs="Garamond"/>
           <w:highlight w:val="none"/>
-        </w:rPr>
-      </w:r>
-      <w:r>
-        <w:rPr>
-          <w:rFonts w:ascii="Garamond" w:hAnsi="Garamond" w:cs="Garamond"/>
-          <w:highlight w:val="none"/>
-        </w:rPr>
-      </w:r>
-      <w:r>
-        <w:rPr>
-          <w:rFonts w:ascii="Garamond" w:hAnsi="Garamond" w:eastAsia="Garamond" w:cs="Garamond"/>
-        </w:rPr>
-      </w:r>
-      <w:r>
-        <w:rPr>
-          <w:rFonts w:ascii="Garamond" w:hAnsi="Garamond" w:cs="Garamond"/>
-        </w:rPr>
-      </w:r>
-      <w:r>
-        <w:rPr>
-          <w:rFonts w:ascii="Garamond" w:hAnsi="Garamond" w:cs="Garamond"/>
         </w:rPr>
       </w:r>
       <w:r>

</xml_diff>

<commit_message>
fix: paiement_mode nullable — opérateur null-safe sur 5 contrôleurs
Corrige 'Call to a member function label() on null' dans le dashboard AC
quand paiement_mode est null (paiements directs sans mode).
Ajout de ?->value et ?->label() sur DashboardController,
PaiementController (AC), et les 3 DemandeDepenseController (DAF, AC, Porteur).
</commit_message>
<xml_diff>
--- a/rapport/components/chap1.docx
+++ b/rapport/components/chap1.docx
@@ -36,20 +36,20 @@
       </w:r>
       <w:r>
         <w:rPr>
+          <w:rFonts w:ascii="Garamond" w:hAnsi="Garamond" w:eastAsia="Garamond" w:cs="Garamond"/>
+          <w:color w:val="auto"/>
+          <w:sz w:val="32"/>
+          <w:szCs w:val="32"/>
+        </w:rPr>
+      </w:r>
+      <w:r>
+        <w:rPr>
           <w:rFonts w:ascii="Garamond" w:hAnsi="Garamond" w:cs="Garamond"/>
           <w:color w:val="auto"/>
           <w:sz w:val="32"/>
           <w:szCs w:val="32"/>
         </w:rPr>
       </w:r>
-      <w:r>
-        <w:rPr>
-          <w:rFonts w:ascii="Garamond" w:hAnsi="Garamond" w:cs="Garamond"/>
-          <w:color w:val="auto"/>
-          <w:sz w:val="32"/>
-          <w:szCs w:val="32"/>
-        </w:rPr>
-      </w:r>
     </w:p>
     <w:p>
       <w:pPr>
@@ -73,7 +73,7 @@
       </w:r>
       <w:r>
         <w:rPr>
-          <w:rFonts w:ascii="Garamond" w:hAnsi="Garamond" w:cs="Garamond"/>
+          <w:rFonts w:ascii="Garamond" w:hAnsi="Garamond" w:eastAsia="Garamond" w:cs="Garamond"/>
           <w:sz w:val="32"/>
           <w:szCs w:val="32"/>
         </w:rPr>
@@ -112,6 +112,15 @@
       </w:r>
       <w:r>
         <w:rPr>
+          <w:rFonts w:ascii="Garamond" w:hAnsi="Garamond" w:eastAsia="Garamond" w:cs="Garamond"/>
+          <w:b/>
+          <w:bCs/>
+          <w:sz w:val="28"/>
+          <w:szCs w:val="28"/>
+        </w:rPr>
+      </w:r>
+      <w:r>
+        <w:rPr>
           <w:rFonts w:ascii="Garamond" w:hAnsi="Garamond" w:cs="Garamond"/>
           <w:b/>
           <w:bCs/>
@@ -119,7 +128,128 @@
           <w:szCs w:val="28"/>
         </w:rPr>
       </w:r>
-      <w:r>
+    </w:p>
+    <w:p>
+      <w:pPr>
+        <w:pBdr/>
+        <w:spacing w:line="360" w:lineRule="auto"/>
+        <w:ind/>
+        <w:jc w:val="both"/>
+        <w:rPr>
+          <w:rFonts w:ascii="Garamond" w:hAnsi="Garamond" w:cs="Garamond"/>
+        </w:rPr>
+      </w:pPr>
+      <w:r>
+        <w:rPr>
+          <w:rFonts w:ascii="Garamond" w:hAnsi="Garamond" w:eastAsia="Garamond" w:cs="Garamond"/>
+        </w:rPr>
+      </w:r>
+      <w:r>
+        <w:rPr>
+          <w:rFonts w:ascii="Garamond" w:hAnsi="Garamond" w:eastAsia="Garamond" w:cs="Garamond"/>
+        </w:rPr>
+        <w:t xml:space="preserve">Ce chapitre présente le cadre général dans lequel s’est déroulé le stage. Il s’articule autour de deux principaux axes.</w:t>
+      </w:r>
+      <w:r>
+        <w:rPr>
+          <w:rFonts w:ascii="Garamond" w:hAnsi="Garamond" w:eastAsia="Garamond" w:cs="Garamond"/>
+          <w:highlight w:val="none"/>
+        </w:rPr>
+        <w:t xml:space="preserve">Le premier porte sur les structures impliquées : l’École Supérieure d’Informatique (ESI), qui assure notre formation et la Direction des Services Informatiques (DSI) de l’Université Joseph KI-ZERBO(UJKZ), qui nous a accueillis durant le stage. </w:t>
+      </w:r>
+      <w:r>
+        <w:rPr>
+          <w:rFonts w:ascii="Garamond" w:hAnsi="Garamond" w:eastAsia="Garamond" w:cs="Garamond"/>
+        </w:rPr>
+        <w:t xml:space="preserve">Le second porte sur le projet lui même : son contexte,la problématique, les résultats attendus et les </w:t>
+      </w:r>
+      <w:r>
+        <w:rPr>
+          <w:rFonts w:ascii="Garamond" w:hAnsi="Garamond" w:eastAsia="Garamond" w:cs="Garamond"/>
+          <w:highlight w:val="none"/>
+        </w:rPr>
+        <w:t xml:space="preserve">acteurs impliqués dans sa réalisation.</w:t>
+      </w:r>
+      <w:r>
+        <w:rPr>
+          <w:rFonts w:ascii="Garamond" w:hAnsi="Garamond" w:cs="Garamond"/>
+        </w:rPr>
+      </w:r>
+      <w:r>
+        <w:rPr>
+          <w:rFonts w:ascii="Garamond" w:hAnsi="Garamond" w:cs="Garamond"/>
+        </w:rPr>
+      </w:r>
+    </w:p>
+    <w:p>
+      <w:pPr>
+        <w:pStyle w:val="935"/>
+        <w:numPr>
+          <w:ilvl w:val="0"/>
+          <w:numId w:val="10"/>
+        </w:numPr>
+        <w:pBdr/>
+        <w:spacing w:line="360" w:lineRule="auto"/>
+        <w:ind/>
+        <w:jc w:val="both"/>
+        <w:rPr>
+          <w:rFonts w:ascii="Garamond" w:hAnsi="Garamond" w:cs="Garamond"/>
+          <w:b/>
+          <w:bCs/>
+          <w:sz w:val="32"/>
+          <w:szCs w:val="32"/>
+        </w:rPr>
+      </w:pPr>
+      <w:r>
+        <w:rPr>
+          <w:rFonts w:ascii="Garamond" w:hAnsi="Garamond" w:eastAsia="Garamond" w:cs="Garamond"/>
+          <w:b/>
+          <w:bCs/>
+          <w:sz w:val="28"/>
+          <w:szCs w:val="28"/>
+        </w:rPr>
+        <w:t xml:space="preserve">Présentation</w:t>
+      </w:r>
+      <w:r>
+        <w:rPr>
+          <w:rFonts w:ascii="Garamond" w:hAnsi="Garamond" w:eastAsia="Garamond" w:cs="Garamond"/>
+          <w:b/>
+          <w:bCs/>
+          <w:sz w:val="28"/>
+          <w:szCs w:val="28"/>
+        </w:rPr>
+        <w:t xml:space="preserve"> de la structure de formation</w:t>
+      </w:r>
+      <w:r>
+        <w:rPr>
+          <w:rFonts w:ascii="Garamond" w:hAnsi="Garamond" w:eastAsia="Garamond" w:cs="Garamond"/>
+          <w:b/>
+          <w:bCs/>
+          <w:sz w:val="32"/>
+          <w:szCs w:val="32"/>
+        </w:rPr>
+      </w:r>
+      <w:r>
+        <w:rPr>
+          <w:rFonts w:ascii="Garamond" w:hAnsi="Garamond" w:cs="Garamond"/>
+          <w:b/>
+          <w:bCs/>
+          <w:sz w:val="32"/>
+          <w:szCs w:val="32"/>
+        </w:rPr>
+      </w:r>
+    </w:p>
+    <w:p>
+      <w:pPr>
+        <w:pStyle w:val="935"/>
+        <w:numPr>
+          <w:ilvl w:val="1"/>
+          <w:numId w:val="10"/>
+        </w:numPr>
+        <w:pBdr/>
+        <w:spacing w:line="360" w:lineRule="auto"/>
+        <w:ind w:left="851"/>
+        <w:jc w:val="both"/>
         <w:rPr>
           <w:rFonts w:ascii="Garamond" w:hAnsi="Garamond" w:cs="Garamond"/>
           <w:b/>
@@ -127,137 +257,6 @@
           <w:sz w:val="28"/>
           <w:szCs w:val="28"/>
         </w:rPr>
-      </w:r>
-    </w:p>
-    <w:p>
-      <w:pPr>
-        <w:pBdr/>
-        <w:spacing w:line="360" w:lineRule="auto"/>
-        <w:ind/>
-        <w:jc w:val="both"/>
-        <w:rPr>
-          <w:rFonts w:ascii="Garamond" w:hAnsi="Garamond" w:cs="Garamond"/>
-        </w:rPr>
-      </w:pPr>
-      <w:r>
-        <w:rPr>
-          <w:rFonts w:ascii="Garamond" w:hAnsi="Garamond" w:eastAsia="Garamond" w:cs="Garamond"/>
-        </w:rPr>
-        <w:t xml:space="preserve">Ce chapitre présente le cadre général du stage à travers deux axes.Le premier concerne les structures impliquées : L’École Supérieure d’Informatique (ESI) qui es notre structure de formation et </w:t>
-      </w:r>
-      <w:r>
-        <w:rPr>
-          <w:rFonts w:ascii="Garamond" w:hAnsi="Garamond" w:eastAsia="Garamond" w:cs="Garamond"/>
-        </w:rPr>
-        <w:t xml:space="preserve">la </w:t>
-      </w:r>
-      <w:r>
-        <w:rPr>
-          <w:rFonts w:ascii="Garamond" w:hAnsi="Garamond" w:eastAsia="Garamond" w:cs="Garamond"/>
-        </w:rPr>
-        <w:t xml:space="preserve">D</w:t>
-      </w:r>
-      <w:r>
-        <w:rPr>
-          <w:rFonts w:ascii="Garamond" w:hAnsi="Garamond" w:eastAsia="Garamond" w:cs="Garamond"/>
-        </w:rPr>
-        <w:t xml:space="preserve">irection des </w:t>
-      </w:r>
-      <w:r>
-        <w:rPr>
-          <w:rFonts w:ascii="Garamond" w:hAnsi="Garamond" w:eastAsia="Garamond" w:cs="Garamond"/>
-        </w:rPr>
-        <w:t xml:space="preserve">S</w:t>
-      </w:r>
-      <w:r>
-        <w:rPr>
-          <w:rFonts w:ascii="Garamond" w:hAnsi="Garamond" w:eastAsia="Garamond" w:cs="Garamond"/>
-        </w:rPr>
-        <w:t xml:space="preserve">ervices </w:t>
-      </w:r>
-      <w:r>
-        <w:rPr>
-          <w:rFonts w:ascii="Garamond" w:hAnsi="Garamond" w:eastAsia="Garamond" w:cs="Garamond"/>
-        </w:rPr>
-        <w:t xml:space="preserve">Informatique (</w:t>
-      </w:r>
-      <w:r>
-        <w:rPr>
-          <w:rFonts w:ascii="Garamond" w:hAnsi="Garamond" w:eastAsia="Garamond" w:cs="Garamond"/>
-        </w:rPr>
-        <w:t xml:space="preserve">DSI)</w:t>
-      </w:r>
-      <w:r>
-        <w:rPr>
-          <w:rFonts w:ascii="Garamond" w:hAnsi="Garamond" w:eastAsia="Garamond" w:cs="Garamond"/>
-        </w:rPr>
-        <w:t xml:space="preserve"> de l’</w:t>
-      </w:r>
-      <w:r>
-        <w:rPr>
-          <w:rFonts w:ascii="Garamond" w:hAnsi="Garamond" w:eastAsia="Garamond" w:cs="Garamond"/>
-        </w:rPr>
-        <w:t xml:space="preserve">Université</w:t>
-      </w:r>
-      <w:r>
-        <w:rPr>
-          <w:rFonts w:ascii="Garamond" w:hAnsi="Garamond" w:eastAsia="Garamond" w:cs="Garamond"/>
-        </w:rPr>
-        <w:t xml:space="preserve"> </w:t>
-      </w:r>
-      <w:r>
-        <w:rPr>
-          <w:rFonts w:ascii="Garamond" w:hAnsi="Garamond" w:eastAsia="Garamond" w:cs="Garamond"/>
-        </w:rPr>
-        <w:t xml:space="preserve">Joseph</w:t>
-      </w:r>
-      <w:r>
-        <w:rPr>
-          <w:rFonts w:ascii="Garamond" w:hAnsi="Garamond" w:eastAsia="Garamond" w:cs="Garamond"/>
-        </w:rPr>
-        <w:t xml:space="preserve"> </w:t>
-      </w:r>
-      <w:r>
-        <w:rPr>
-          <w:rFonts w:ascii="Garamond" w:hAnsi="Garamond" w:eastAsia="Garamond" w:cs="Garamond"/>
-        </w:rPr>
-        <w:t xml:space="preserve">KI-ZERBO qui nous a accueillit</w:t>
-      </w:r>
-      <w:r>
-        <w:rPr>
-          <w:rFonts w:ascii="Garamond" w:hAnsi="Garamond" w:eastAsia="Garamond" w:cs="Garamond"/>
-        </w:rPr>
-        <w:t xml:space="preserve">. Le second porte sur le projet lui même : son contexte,la problématique qui le justifie, les résultats attendus et les acteurs retenu pour sa conduite.</w:t>
-      </w:r>
-      <w:r>
-        <w:rPr>
-          <w:rFonts w:ascii="Garamond" w:hAnsi="Garamond" w:cs="Garamond"/>
-        </w:rPr>
-      </w:r>
-      <w:r>
-        <w:rPr>
-          <w:rFonts w:ascii="Garamond" w:hAnsi="Garamond" w:cs="Garamond"/>
-        </w:rPr>
-      </w:r>
-    </w:p>
-    <w:p>
-      <w:pPr>
-        <w:pStyle w:val="935"/>
-        <w:numPr>
-          <w:ilvl w:val="0"/>
-          <w:numId w:val="10"/>
-        </w:numPr>
-        <w:pBdr/>
-        <w:spacing w:line="360" w:lineRule="auto"/>
-        <w:ind/>
-        <w:jc w:val="both"/>
-        <w:rPr>
-          <w:rFonts w:ascii="Garamond" w:hAnsi="Garamond" w:cs="Garamond"/>
-          <w:b/>
-          <w:bCs/>
-          <w:sz w:val="32"/>
-          <w:szCs w:val="32"/>
-        </w:rPr>
       </w:pPr>
       <w:r>
         <w:rPr>
@@ -267,7 +266,7 @@
           <w:sz w:val="28"/>
           <w:szCs w:val="28"/>
         </w:rPr>
-        <w:t xml:space="preserve">Présentation</w:t>
+        <w:t xml:space="preserve">Généralités</w:t>
       </w:r>
       <w:r>
         <w:rPr>
@@ -277,24 +276,100 @@
           <w:sz w:val="28"/>
           <w:szCs w:val="28"/>
         </w:rPr>
-        <w:t xml:space="preserve"> de la structure de formation</w:t>
       </w:r>
       <w:r>
         <w:rPr>
           <w:rFonts w:ascii="Garamond" w:hAnsi="Garamond" w:cs="Garamond"/>
           <w:b/>
           <w:bCs/>
-          <w:sz w:val="32"/>
-          <w:szCs w:val="32"/>
-        </w:rPr>
-      </w:r>
-      <w:r>
+          <w:sz w:val="28"/>
+          <w:szCs w:val="28"/>
+        </w:rPr>
+      </w:r>
+    </w:p>
+    <w:p>
+      <w:pPr>
+        <w:pBdr/>
+        <w:spacing w:line="360" w:lineRule="auto"/>
+        <w:ind/>
+        <w:jc w:val="both"/>
         <w:rPr>
           <w:rFonts w:ascii="Garamond" w:hAnsi="Garamond" w:cs="Garamond"/>
-          <w:b/>
-          <w:bCs/>
-          <w:sz w:val="32"/>
-          <w:szCs w:val="32"/>
+        </w:rPr>
+      </w:pPr>
+      <w:r>
+        <w:rPr>
+          <w:rFonts w:ascii="Garamond" w:hAnsi="Garamond" w:eastAsia="Garamond" w:cs="Garamond"/>
+        </w:rPr>
+      </w:r>
+      <w:r>
+        <w:rPr>
+          <w:rFonts w:ascii="Garamond" w:hAnsi="Garamond" w:eastAsia="Garamond" w:cs="Garamond"/>
+        </w:rPr>
+        <w:t xml:space="preserve">L</w:t>
+      </w:r>
+      <w:r>
+        <w:rPr>
+          <w:rFonts w:ascii="Garamond" w:hAnsi="Garamond" w:eastAsia="Garamond" w:cs="Garamond"/>
+        </w:rPr>
+        <w:t xml:space="preserve">'École Supérieure d'Informatique (ESI) est un établissement public d'enseignement supérieur burkinabè, entièrement consacré aux sciences et technologies de l'information. Elle a été créée en 1991 à Ouagadougou, dans le cadre du Premier Plan Directeur Infor</w:t>
+      </w:r>
+      <w:r>
+        <w:rPr>
+          <w:rFonts w:ascii="Garamond" w:hAnsi="Garamond" w:eastAsia="Garamond" w:cs="Garamond"/>
+        </w:rPr>
+        <w:t xml:space="preserve">m</w:t>
+      </w:r>
+      <w:r>
+        <w:rPr>
+          <w:rFonts w:ascii="Garamond" w:hAnsi="Garamond" w:eastAsia="Garamond" w:cs="Garamond"/>
+        </w:rPr>
+        <w:t xml:space="preserve">atique (1991-1995), </w:t>
+      </w:r>
+      <w:r>
+        <w:rPr>
+          <w:rFonts w:ascii="Garamond" w:hAnsi="Garamond" w:eastAsia="Garamond" w:cs="Garamond"/>
+        </w:rPr>
+        <w:t xml:space="preserve">une initiative gouvernementale visant à former des spécialistes nationaux capables de répondre aux besoins croissants du pays en technologies de l’information.</w:t>
+      </w:r>
+      <w:r>
+        <w:rPr>
+          <w:rFonts w:ascii="Garamond" w:hAnsi="Garamond" w:eastAsia="Garamond" w:cs="Garamond"/>
+        </w:rPr>
+        <w:t xml:space="preserve">.Quatre années plus tard, en 1995, dans le cadre de la politique de déc</w:t>
+      </w:r>
+      <w:r>
+        <w:rPr>
+          <w:rFonts w:ascii="Garamond" w:hAnsi="Garamond" w:eastAsia="Garamond" w:cs="Garamond"/>
+        </w:rPr>
+        <w:t xml:space="preserve">e</w:t>
+      </w:r>
+      <w:r>
+        <w:rPr>
+          <w:rFonts w:ascii="Garamond" w:hAnsi="Garamond" w:eastAsia="Garamond" w:cs="Garamond"/>
+        </w:rPr>
+        <w:t xml:space="preserve">ntralisation et de développement de l'enseignement supérieur à l'intérieur du pays, l'école a été transférée à Bobo-Dioulasso pour intégrer le Centre Universitaire Polytechnique de Bobo-Dioulasso (CUPB). Cette structure deviendra par la suite l'Université </w:t>
+      </w:r>
+      <w:r>
+        <w:rPr>
+          <w:rFonts w:ascii="Garamond" w:hAnsi="Garamond" w:eastAsia="Garamond" w:cs="Garamond"/>
+        </w:rPr>
+        <w:t xml:space="preserve">Polytechnique de Bobo-Dioulasso (UPB) puis, aujourd'hui, l'Université Nazi BONI (UNB). </w:t>
+      </w:r>
+      <w:r>
+        <w:rPr>
+          <w:rFonts w:ascii="Garamond" w:hAnsi="Garamond" w:eastAsia="Garamond" w:cs="Garamond"/>
+        </w:rPr>
+        <w:t xml:space="preserve">Depuis sa création, l’ESI s’est progressivement imposée comme l’un des principaux établissements de référence en informatique au Burkina Faso.</w:t>
+      </w:r>
+      <w:r>
+        <w:rPr>
+          <w:rFonts w:ascii="Garamond" w:hAnsi="Garamond" w:eastAsia="Garamond" w:cs="Garamond"/>
+        </w:rPr>
+      </w:r>
+      <w:r>
+        <w:rPr>
+          <w:rFonts w:ascii="Garamond" w:hAnsi="Garamond" w:cs="Garamond"/>
         </w:rPr>
       </w:r>
     </w:p>
@@ -307,7 +382,7 @@
         </w:numPr>
         <w:pBdr/>
         <w:spacing w:line="360" w:lineRule="auto"/>
-        <w:ind w:left="851"/>
+        <w:ind/>
         <w:jc w:val="both"/>
         <w:rPr>
           <w:rFonts w:ascii="Garamond" w:hAnsi="Garamond" w:cs="Garamond"/>
@@ -325,7 +400,16 @@
           <w:sz w:val="28"/>
           <w:szCs w:val="28"/>
         </w:rPr>
-        <w:t xml:space="preserve">Généralités</w:t>
+        <w:t xml:space="preserve">Organisation administrative</w:t>
+      </w:r>
+      <w:r>
+        <w:rPr>
+          <w:rFonts w:ascii="Garamond" w:hAnsi="Garamond" w:eastAsia="Garamond" w:cs="Garamond"/>
+          <w:b/>
+          <w:bCs/>
+          <w:sz w:val="28"/>
+          <w:szCs w:val="28"/>
+        </w:rPr>
       </w:r>
       <w:r>
         <w:rPr>
@@ -336,15 +420,6 @@
           <w:szCs w:val="28"/>
         </w:rPr>
       </w:r>
-      <w:r>
-        <w:rPr>
-          <w:rFonts w:ascii="Garamond" w:hAnsi="Garamond" w:cs="Garamond"/>
-          <w:b/>
-          <w:bCs/>
-          <w:sz w:val="28"/>
-          <w:szCs w:val="28"/>
-        </w:rPr>
-      </w:r>
     </w:p>
     <w:p>
       <w:pPr>
@@ -354,202 +429,105 @@
         <w:jc w:val="both"/>
         <w:rPr>
           <w:rFonts w:ascii="Garamond" w:hAnsi="Garamond" w:cs="Garamond"/>
+          <w:color w:val="auto"/>
+          <w:highlight w:val="none"/>
         </w:rPr>
       </w:pPr>
       <w:r>
         <w:rPr>
           <w:rFonts w:ascii="Garamond" w:hAnsi="Garamond" w:eastAsia="Garamond" w:cs="Garamond"/>
         </w:rPr>
+        <w:t xml:space="preserve">Sur le plan ad</w:t>
       </w:r>
       <w:r>
         <w:rPr>
           <w:rFonts w:ascii="Garamond" w:hAnsi="Garamond" w:eastAsia="Garamond" w:cs="Garamond"/>
         </w:rPr>
-        <w:t xml:space="preserve">L</w:t>
+        <w:t xml:space="preserve">m</w:t>
       </w:r>
       <w:r>
         <w:rPr>
           <w:rFonts w:ascii="Garamond" w:hAnsi="Garamond" w:eastAsia="Garamond" w:cs="Garamond"/>
         </w:rPr>
-        <w:t xml:space="preserve">'École Supérieure d'Informatique (ESI) est un établissement public d'enseignement supérieur burkinabè, entièrement consacré aux sciences et technologies de l'information. Elle a été créée en 1991 à Ouagadougou, dans le cadre du Premier Plan Directeur Infor</w:t>
+        <w:t xml:space="preserve">inistratif, l'ESI est actuellement dirigée par une Directrice (Dr COMPAORE Anastasie Joelle) et assistée par un Directeur Adjoint (Dr ZOUGMORE Tégéwende Gildas). Ils sont entourés d'une équipe de gestion qui comprend notamment un Chef des Services Administ</w:t>
       </w:r>
       <w:r>
         <w:rPr>
           <w:rFonts w:ascii="Garamond" w:hAnsi="Garamond" w:eastAsia="Garamond" w:cs="Garamond"/>
         </w:rPr>
-        <w:t xml:space="preserve">m</w:t>
+        <w:t xml:space="preserve">r</w:t>
       </w:r>
       <w:r>
         <w:rPr>
           <w:rFonts w:ascii="Garamond" w:hAnsi="Garamond" w:eastAsia="Garamond" w:cs="Garamond"/>
         </w:rPr>
-        <w:t xml:space="preserve">atique (1991-1995), une initiative gouvernementale visant à former des spécialistes nationaux en informatique capable de répondre aux besoins croissants en technologies de l'information.Quatre années plus tard, en 1995, dans le cadre de la politique de déc</w:t>
+        <w:t xml:space="preserve">atifs et Financiers (CSAF) et un Secrétaire Principal (SP)</w:t>
       </w:r>
       <w:r>
         <w:rPr>
           <w:rFonts w:ascii="Garamond" w:hAnsi="Garamond" w:eastAsia="Garamond" w:cs="Garamond"/>
-        </w:rPr>
-        <w:t xml:space="preserve">e</w:t>
+          <w:color w:val="auto"/>
+        </w:rPr>
+        <w:t xml:space="preserve">. </w:t>
       </w:r>
       <w:r>
         <w:rPr>
           <w:rFonts w:ascii="Garamond" w:hAnsi="Garamond" w:eastAsia="Garamond" w:cs="Garamond"/>
         </w:rPr>
-        <w:t xml:space="preserve">ntralisation et de développement de l'enseignement supérieur à l'intérieur du pays, l'école a été transférée à Bobo-Dioulasso pour intégrer le Centre Universitaire Polytechnique de Bobo-Dioulasso (CUPB). Cette structure deviendra par la suite l'Université </w:t>
+        <w:t xml:space="preserve">Cette équipe assure le fonctionnement quotidien de l’établissement, notamment le suivi des inscriptions, l’organisation des examens, la gestion administrative du personnel ainsi que la coordination avec les services centraux de l’université.</w:t>
       </w:r>
       <w:r>
         <w:rPr>
           <w:rFonts w:ascii="Garamond" w:hAnsi="Garamond" w:eastAsia="Garamond" w:cs="Garamond"/>
-        </w:rPr>
-        <w:t xml:space="preserve">Polytechnique de Bobo-Dioulasso (UPB) puis, aujourd'hui, l'Université Nazi BONI (UNB). Depuis sa création, l'ESI s'est progressivement imposée comme l'une des principales structures de référence de formation en informatique au Burkina Faso.</w:t>
+          <w:color w:val="auto"/>
+          <w:highlight w:val="none"/>
+        </w:rPr>
       </w:r>
       <w:r>
         <w:rPr>
           <w:rFonts w:ascii="Garamond" w:hAnsi="Garamond" w:cs="Garamond"/>
-        </w:rPr>
-      </w:r>
-      <w:r>
-        <w:rPr>
-          <w:rFonts w:ascii="Garamond" w:hAnsi="Garamond" w:cs="Garamond"/>
+          <w:color w:val="auto"/>
+          <w:highlight w:val="none"/>
         </w:rPr>
       </w:r>
     </w:p>
     <w:p>
       <w:pPr>
-        <w:pStyle w:val="935"/>
-        <w:numPr>
-          <w:ilvl w:val="1"/>
-          <w:numId w:val="10"/>
-        </w:numPr>
         <w:pBdr/>
         <w:spacing w:line="360" w:lineRule="auto"/>
         <w:ind/>
         <w:jc w:val="both"/>
         <w:rPr>
           <w:rFonts w:ascii="Garamond" w:hAnsi="Garamond" w:cs="Garamond"/>
-          <w:b/>
-          <w:bCs/>
-          <w:sz w:val="28"/>
-          <w:szCs w:val="28"/>
         </w:rPr>
       </w:pPr>
       <w:r>
         <w:rPr>
           <w:rFonts w:ascii="Garamond" w:hAnsi="Garamond" w:eastAsia="Garamond" w:cs="Garamond"/>
-          <w:b/>
-          <w:bCs/>
-          <w:sz w:val="28"/>
-          <w:szCs w:val="28"/>
-        </w:rPr>
-        <w:t xml:space="preserve">Organisation administrative</w:t>
-      </w:r>
-      <w:r>
-        <w:rPr>
-          <w:rFonts w:ascii="Garamond" w:hAnsi="Garamond" w:cs="Garamond"/>
-          <w:b/>
-          <w:bCs/>
-          <w:sz w:val="28"/>
-          <w:szCs w:val="28"/>
-        </w:rPr>
-      </w:r>
-      <w:r>
-        <w:rPr>
-          <w:rFonts w:ascii="Garamond" w:hAnsi="Garamond" w:cs="Garamond"/>
-          <w:b/>
-          <w:bCs/>
-          <w:sz w:val="28"/>
-          <w:szCs w:val="28"/>
-        </w:rPr>
-      </w:r>
-    </w:p>
-    <w:p>
-      <w:pPr>
-        <w:pBdr/>
-        <w:spacing w:line="360" w:lineRule="auto"/>
-        <w:ind/>
-        <w:jc w:val="both"/>
-        <w:rPr>
-          <w:rFonts w:ascii="Garamond" w:hAnsi="Garamond" w:cs="Garamond"/>
-        </w:rPr>
-      </w:pPr>
+        </w:rPr>
+        <w:t xml:space="preserve">S</w:t>
+      </w:r>
       <w:r>
         <w:rPr>
           <w:rFonts w:ascii="Garamond" w:hAnsi="Garamond" w:eastAsia="Garamond" w:cs="Garamond"/>
         </w:rPr>
-        <w:t xml:space="preserve">Sur le plan ad</w:t>
+        <w:t xml:space="preserve">ur le plan pédagogique,l'école s'appuie également sur un corps professoral composé d'enseignants-chercheurs permanents et de professionnels issus du monde de l'entreprise. </w:t>
       </w:r>
       <w:r>
         <w:rPr>
           <w:rFonts w:ascii="Garamond" w:hAnsi="Garamond" w:eastAsia="Garamond" w:cs="Garamond"/>
         </w:rPr>
-        <w:t xml:space="preserve">m</w:t>
+        <w:t xml:space="preserve">Cette diversité permet de proposer une formation à la fois théorique et pratique, en lien avec les réalités du monde professionnel</w:t>
       </w:r>
       <w:r>
         <w:rPr>
           <w:rFonts w:ascii="Garamond" w:hAnsi="Garamond" w:eastAsia="Garamond" w:cs="Garamond"/>
         </w:rPr>
-        <w:t xml:space="preserve">inistratif, l'ESI est actuellement dirigée par une Directrice (Dr COMPAORE Anastasie Joelle) et assistée par un Directeur Adjoint (Dr ZOUGMORE Tégéwende Gildas). Ils sont entourés d'une équipe de gestion qui comprend notamment un Chef des Services Administ</w:t>
+        <w:t xml:space="preserve">.</w:t>
       </w:r>
       <w:r>
         <w:rPr>
           <w:rFonts w:ascii="Garamond" w:hAnsi="Garamond" w:eastAsia="Garamond" w:cs="Garamond"/>
-        </w:rPr>
-        <w:t xml:space="preserve">r</w:t>
-      </w:r>
-      <w:r>
-        <w:rPr>
-          <w:rFonts w:ascii="Garamond" w:hAnsi="Garamond" w:eastAsia="Garamond" w:cs="Garamond"/>
-        </w:rPr>
-        <w:t xml:space="preserve">atifs et Financiers (CSAF) et un Secrétaire Principal (SP). Cette équipe est responsable de la gestion quotidienne de l'école : suivi des inscriptions, organisation des examens, gestion des carrières des enseignants-chercheurs et du personnel administratif</w:t>
-      </w:r>
-      <w:r>
-        <w:rPr>
-          <w:rFonts w:ascii="Garamond" w:hAnsi="Garamond" w:eastAsia="Garamond" w:cs="Garamond"/>
-        </w:rPr>
-        <w:t xml:space="preserve">, et coordination avec les services centraux de l'Université Nazi BONI.</w:t>
-      </w:r>
-      <w:r>
-        <w:rPr>
-          <w:rFonts w:ascii="Garamond" w:hAnsi="Garamond" w:cs="Garamond"/>
-        </w:rPr>
-      </w:r>
-      <w:r>
-        <w:rPr>
-          <w:rFonts w:ascii="Garamond" w:hAnsi="Garamond" w:cs="Garamond"/>
-        </w:rPr>
-      </w:r>
-    </w:p>
-    <w:p>
-      <w:pPr>
-        <w:pBdr/>
-        <w:spacing w:line="360" w:lineRule="auto"/>
-        <w:ind/>
-        <w:jc w:val="both"/>
-        <w:rPr>
-          <w:rFonts w:ascii="Garamond" w:hAnsi="Garamond" w:cs="Garamond"/>
-        </w:rPr>
-      </w:pPr>
-      <w:r>
-        <w:rPr>
-          <w:rFonts w:ascii="Garamond" w:hAnsi="Garamond" w:eastAsia="Garamond" w:cs="Garamond"/>
-        </w:rPr>
-        <w:t xml:space="preserve">S</w:t>
-      </w:r>
-      <w:r>
-        <w:rPr>
-          <w:rFonts w:ascii="Garamond" w:hAnsi="Garamond" w:eastAsia="Garamond" w:cs="Garamond"/>
-        </w:rPr>
-        <w:t xml:space="preserve">ur le plan pédagogique,l'école s'appuie également sur un corps professoral composé d'enseignants-chercheurs permanents et de professionnels issus du monde de l'entreprise. Cette composition garantit un enseignement à la fois théorique, pratique et suivant </w:t>
-      </w:r>
-      <w:r>
-        <w:rPr>
-          <w:rFonts w:ascii="Garamond" w:hAnsi="Garamond" w:eastAsia="Garamond" w:cs="Garamond"/>
-        </w:rPr>
-        <w:t xml:space="preserve">les réalités du marché du travail.</w:t>
-      </w:r>
-      <w:r>
-        <w:rPr>
-          <w:rFonts w:ascii="Garamond" w:hAnsi="Garamond" w:cs="Garamond"/>
         </w:rPr>
       </w:r>
       <w:r>
@@ -600,6 +578,15 @@
       </w:r>
       <w:r>
         <w:rPr>
+          <w:rFonts w:ascii="Garamond" w:hAnsi="Garamond" w:eastAsia="Garamond" w:cs="Garamond"/>
+          <w:b/>
+          <w:bCs/>
+          <w:sz w:val="28"/>
+          <w:szCs w:val="28"/>
+        </w:rPr>
+      </w:r>
+      <w:r>
+        <w:rPr>
           <w:rFonts w:ascii="Garamond" w:hAnsi="Garamond" w:cs="Garamond"/>
           <w:b/>
           <w:bCs/>
@@ -607,15 +594,6 @@
           <w:szCs w:val="28"/>
         </w:rPr>
       </w:r>
-      <w:r>
-        <w:rPr>
-          <w:rFonts w:ascii="Garamond" w:hAnsi="Garamond" w:cs="Garamond"/>
-          <w:b/>
-          <w:bCs/>
-          <w:sz w:val="28"/>
-          <w:szCs w:val="28"/>
-        </w:rPr>
-      </w:r>
     </w:p>
     <w:p>
       <w:pPr>
@@ -652,7 +630,7 @@
       </w:r>
       <w:r>
         <w:rPr>
-          <w:rFonts w:ascii="Garamond" w:hAnsi="Garamond" w:cs="Garamond"/>
+          <w:rFonts w:ascii="Garamond" w:hAnsi="Garamond" w:eastAsia="Garamond" w:cs="Garamond"/>
         </w:rPr>
       </w:r>
       <w:r>
@@ -679,7 +657,7 @@
       </w:r>
       <w:r>
         <w:rPr>
-          <w:rFonts w:ascii="Garamond" w:hAnsi="Garamond" w:cs="Garamond"/>
+          <w:rFonts w:ascii="Garamond" w:hAnsi="Garamond" w:eastAsia="Garamond" w:cs="Garamond"/>
         </w:rPr>
       </w:r>
       <w:r>
@@ -714,25 +692,23 @@
         <w:rPr>
           <w:rFonts w:ascii="Garamond" w:hAnsi="Garamond" w:eastAsia="Garamond" w:cs="Garamond"/>
         </w:rPr>
-        <w:t xml:space="preserve">: D'une durée de trois ans, ce cycle vise à offrir aux étudiants des bases solides en informatique ainsi qu'une première spécialisation. Les deux premières années sont consacrées à un </w:t>
+        <w:t xml:space="preserve">: D'une durée de trois ans, ce cycle vise à offrir aux étudiants des bases solides en informatique ainsi qu'une première spécialisation. </w:t>
       </w:r>
       <w:r>
         <w:rPr>
           <w:rFonts w:ascii="Garamond" w:hAnsi="Garamond" w:eastAsia="Garamond" w:cs="Garamond"/>
-          <w:b/>
-          <w:bCs/>
-        </w:rPr>
-        <w:t xml:space="preserve">tronc commun</w:t>
+        </w:rPr>
+        <w:t xml:space="preserve">Les deux premières années reposent sur un tronc commun permettant aux étudiants d’acquérir les bases essentielles en informatique. La troisième année est ensuite consacrée à une spécialisation</w:t>
       </w:r>
       <w:r>
         <w:rPr>
           <w:rFonts w:ascii="Garamond" w:hAnsi="Garamond" w:eastAsia="Garamond" w:cs="Garamond"/>
         </w:rPr>
-        <w:t xml:space="preserve">, durant lequel tous les étudiants suivent les mêmes enseignements. La troisième année est dédiée à la spécialisation dans l'une des deux options suivantes :</w:t>
-      </w:r>
-      <w:r>
-        <w:rPr>
-          <w:rFonts w:ascii="Garamond" w:hAnsi="Garamond" w:cs="Garamond"/>
+        <w:t xml:space="preserve"> dans l'une des deux options suivantes :</w:t>
+      </w:r>
+      <w:r>
+        <w:rPr>
+          <w:rFonts w:ascii="Garamond" w:hAnsi="Garamond" w:eastAsia="Garamond" w:cs="Garamond"/>
         </w:rPr>
       </w:r>
       <w:r>
@@ -771,7 +747,7 @@
       </w:r>
       <w:r>
         <w:rPr>
-          <w:rFonts w:ascii="Garamond" w:hAnsi="Garamond" w:cs="Garamond"/>
+          <w:rFonts w:ascii="Garamond" w:hAnsi="Garamond" w:eastAsia="Garamond" w:cs="Garamond"/>
         </w:rPr>
       </w:r>
       <w:r>
@@ -838,7 +814,7 @@
       </w:r>
       <w:r>
         <w:rPr>
-          <w:rFonts w:ascii="Garamond" w:hAnsi="Garamond" w:cs="Garamond"/>
+          <w:rFonts w:ascii="Garamond" w:hAnsi="Garamond" w:eastAsia="Garamond" w:cs="Garamond"/>
         </w:rPr>
       </w:r>
       <w:r>
@@ -892,7 +868,7 @@
       </w:r>
       <w:r>
         <w:rPr>
-          <w:rFonts w:ascii="Garamond" w:hAnsi="Garamond" w:cs="Garamond"/>
+          <w:rFonts w:ascii="Garamond" w:hAnsi="Garamond" w:eastAsia="Garamond" w:cs="Garamond"/>
         </w:rPr>
       </w:r>
       <w:r>
@@ -945,7 +921,7 @@
       </w:r>
       <w:r>
         <w:rPr>
-          <w:rFonts w:ascii="Garamond" w:hAnsi="Garamond" w:cs="Garamond"/>
+          <w:rFonts w:ascii="Garamond" w:hAnsi="Garamond" w:eastAsia="Garamond" w:cs="Garamond"/>
         </w:rPr>
       </w:r>
       <w:r>
@@ -984,7 +960,7 @@
       </w:r>
       <w:r>
         <w:rPr>
-          <w:rFonts w:ascii="Garamond" w:hAnsi="Garamond" w:cs="Garamond"/>
+          <w:rFonts w:ascii="Garamond" w:hAnsi="Garamond" w:eastAsia="Garamond" w:cs="Garamond"/>
         </w:rPr>
       </w:r>
       <w:r>
@@ -1023,7 +999,7 @@
       </w:r>
       <w:r>
         <w:rPr>
-          <w:rFonts w:ascii="Garamond" w:hAnsi="Garamond" w:cs="Garamond"/>
+          <w:rFonts w:ascii="Garamond" w:hAnsi="Garamond" w:eastAsia="Garamond" w:cs="Garamond"/>
         </w:rPr>
       </w:r>
       <w:r>
@@ -1062,7 +1038,7 @@
       </w:r>
       <w:r>
         <w:rPr>
-          <w:rFonts w:ascii="Garamond" w:hAnsi="Garamond" w:cs="Garamond"/>
+          <w:rFonts w:ascii="Garamond" w:hAnsi="Garamond" w:eastAsia="Garamond" w:cs="Garamond"/>
         </w:rPr>
       </w:r>
       <w:r>
@@ -1120,7 +1096,7 @@
       </w:r>
       <w:r>
         <w:rPr>
-          <w:rFonts w:ascii="Garamond" w:hAnsi="Garamond" w:cs="Garamond"/>
+          <w:rFonts w:ascii="Garamond" w:hAnsi="Garamond" w:eastAsia="Garamond" w:cs="Garamond"/>
         </w:rPr>
       </w:r>
       <w:r>
@@ -1131,7 +1107,14 @@
     </w:p>
     <w:p>
       <w:pPr>
-        <w:pBdr/>
+        <w:suppressLineNumbers w:val="false"/>
+        <w:pBdr>
+          <w:top w:val="single" w:color="000000" w:sz="4" w:space="0"/>
+          <w:left w:val="single" w:color="000000" w:sz="4" w:space="0"/>
+          <w:bottom w:val="single" w:color="000000" w:sz="4" w:space="0"/>
+          <w:right w:val="single" w:color="000000" w:sz="4" w:space="0"/>
+          <w:between w:val="none" w:color="000000" w:sz="4" w:space="0"/>
+        </w:pBdr>
         <w:spacing w:line="360" w:lineRule="auto"/>
         <w:ind/>
         <w:jc w:val="both"/>
@@ -1164,7 +1147,7 @@
       </w:r>
       <w:r>
         <w:rPr>
-          <w:rFonts w:ascii="Garamond" w:hAnsi="Garamond" w:cs="Garamond"/>
+          <w:rFonts w:ascii="Garamond" w:hAnsi="Garamond" w:eastAsia="Garamond" w:cs="Garamond"/>
         </w:rPr>
       </w:r>
       <w:r>
@@ -1224,6 +1207,15 @@
       </w:r>
       <w:r>
         <w:rPr>
+          <w:rFonts w:ascii="Garamond" w:hAnsi="Garamond" w:eastAsia="Garamond" w:cs="Garamond"/>
+          <w:b/>
+          <w:bCs/>
+          <w:sz w:val="28"/>
+          <w:szCs w:val="28"/>
+        </w:rPr>
+      </w:r>
+      <w:r>
+        <w:rPr>
           <w:rFonts w:ascii="Garamond" w:hAnsi="Garamond" w:cs="Garamond"/>
           <w:b/>
           <w:bCs/>
@@ -1231,7 +1223,484 @@
           <w:szCs w:val="28"/>
         </w:rPr>
       </w:r>
-      <w:r>
+    </w:p>
+    <w:p>
+      <w:pPr>
+        <w:pStyle w:val="935"/>
+        <w:numPr>
+          <w:ilvl w:val="1"/>
+          <w:numId w:val="10"/>
+        </w:numPr>
+        <w:pBdr/>
+        <w:spacing w:line="360" w:lineRule="auto"/>
+        <w:ind/>
+        <w:jc w:val="both"/>
+        <w:rPr>
+          <w:rFonts w:ascii="Garamond" w:hAnsi="Garamond" w:cs="Garamond"/>
+        </w:rPr>
+      </w:pPr>
+      <w:r>
+        <w:rPr>
+          <w:rFonts w:ascii="Garamond" w:hAnsi="Garamond" w:eastAsia="Garamond" w:cs="Garamond"/>
+          <w:b/>
+          <w:bCs/>
+          <w:sz w:val="28"/>
+          <w:szCs w:val="28"/>
+        </w:rPr>
+        <w:t xml:space="preserve">Généralité</w:t>
+      </w:r>
+      <w:r>
+        <w:rPr>
+          <w:rFonts w:ascii="Garamond" w:hAnsi="Garamond" w:eastAsia="Garamond" w:cs="Garamond"/>
+        </w:rPr>
+      </w:r>
+      <w:r>
+        <w:rPr>
+          <w:rFonts w:ascii="Garamond" w:hAnsi="Garamond" w:cs="Garamond"/>
+        </w:rPr>
+      </w:r>
+    </w:p>
+    <w:p>
+      <w:pPr>
+        <w:pBdr/>
+        <w:spacing w:line="360" w:lineRule="auto"/>
+        <w:ind/>
+        <w:jc w:val="both"/>
+        <w:rPr>
+          <w:rFonts w:ascii="Garamond" w:hAnsi="Garamond" w:cs="Garamond"/>
+        </w:rPr>
+      </w:pPr>
+      <w:r>
+        <w:rPr>
+          <w:rFonts w:ascii="Garamond" w:hAnsi="Garamond" w:eastAsia="Garamond" w:cs="Garamond"/>
+        </w:rPr>
+        <w:t xml:space="preserve">L’Université Joseph KI-ZERBO (UJKZ) est</w:t>
+      </w:r>
+      <w:r>
+        <w:rPr>
+          <w:rFonts w:ascii="Garamond" w:hAnsi="Garamond" w:eastAsia="Garamond" w:cs="Garamond"/>
+        </w:rPr>
+        <w:t xml:space="preserve"> un établissement public d’enseignement supérieur du Burkina Faso, dédié à la formation, à la recherche et à l’innovation.</w:t>
+      </w:r>
+      <w:r>
+        <w:rPr>
+          <w:rFonts w:ascii="Garamond" w:hAnsi="Garamond" w:eastAsia="Garamond" w:cs="Garamond"/>
+        </w:rPr>
+      </w:r>
+      <w:r>
+        <w:rPr>
+          <w:rFonts w:ascii="Garamond" w:hAnsi="Garamond" w:cs="Garamond"/>
+        </w:rPr>
+      </w:r>
+    </w:p>
+    <w:p>
+      <w:pPr>
+        <w:pBdr/>
+        <w:spacing w:line="360" w:lineRule="auto"/>
+        <w:ind/>
+        <w:jc w:val="both"/>
+        <w:rPr>
+          <w:rFonts w:ascii="Garamond" w:hAnsi="Garamond" w:cs="Garamond"/>
+        </w:rPr>
+      </w:pPr>
+      <w:r>
+        <w:rPr>
+          <w:rFonts w:ascii="Garamond" w:hAnsi="Garamond" w:eastAsia="Garamond" w:cs="Garamond"/>
+        </w:rPr>
+      </w:r>
+      <w:r>
+        <w:rPr>
+          <w:rFonts w:ascii="Garamond" w:hAnsi="Garamond" w:eastAsia="Garamond" w:cs="Garamond"/>
+        </w:rPr>
+        <w:t xml:space="preserve">Placée sous la tutelle du ministère en charge de l’enseignement supérieur, l’université a pour principale mission de former des cadres qualifiés, de promouvoir la recherche scientifique et de contribuer au développement national.</w:t>
+      </w:r>
+      <w:r>
+        <w:rPr>
+          <w:rFonts w:ascii="Garamond" w:hAnsi="Garamond" w:eastAsia="Garamond" w:cs="Garamond"/>
+        </w:rPr>
+      </w:r>
+      <w:r>
+        <w:rPr>
+          <w:rFonts w:ascii="Garamond" w:hAnsi="Garamond" w:cs="Garamond"/>
+        </w:rPr>
+      </w:r>
+    </w:p>
+    <w:p>
+      <w:pPr>
+        <w:pBdr/>
+        <w:spacing w:line="360" w:lineRule="auto"/>
+        <w:ind/>
+        <w:jc w:val="both"/>
+        <w:rPr>
+          <w:rFonts w:ascii="Garamond" w:hAnsi="Garamond" w:cs="Garamond"/>
+          <w:highlight w:val="none"/>
+        </w:rPr>
+      </w:pPr>
+      <w:r>
+        <w:rPr>
+          <w:rFonts w:ascii="Garamond" w:hAnsi="Garamond" w:eastAsia="Garamond" w:cs="Garamond"/>
+        </w:rPr>
+        <w:t xml:space="preserve">La Direction des Services Informatiques (DSI) est la</w:t>
+      </w:r>
+      <w:r>
+        <w:rPr>
+          <w:rFonts w:ascii="Garamond" w:hAnsi="Garamond" w:eastAsia="Garamond" w:cs="Garamond"/>
+        </w:rPr>
+        <w:t xml:space="preserve"> structure chargée de la gestion e</w:t>
+      </w:r>
+      <w:r>
+        <w:rPr>
+          <w:rFonts w:ascii="Garamond" w:hAnsi="Garamond" w:eastAsia="Garamond" w:cs="Garamond"/>
+        </w:rPr>
+        <w:t xml:space="preserve">t du développement des ressources numériques de l’UJKZ. Elle est rattachée à la vice-présidence en charge des enseignements et des innovations pédagogiques, et intervient au quotidien au service des étudiants, des enseignants et du personnel administratif.</w:t>
+      </w:r>
+      <w:r>
+        <w:rPr>
+          <w:rFonts w:ascii="Garamond" w:hAnsi="Garamond" w:eastAsia="Garamond" w:cs="Garamond"/>
+          <w:highlight w:val="none"/>
+        </w:rPr>
+      </w:r>
+      <w:r>
+        <w:rPr>
+          <w:rFonts w:ascii="Garamond" w:hAnsi="Garamond" w:cs="Garamond"/>
+          <w:highlight w:val="none"/>
+        </w:rPr>
+      </w:r>
+    </w:p>
+    <w:p>
+      <w:pPr>
+        <w:pBdr/>
+        <w:spacing w:line="360" w:lineRule="auto"/>
+        <w:ind/>
+        <w:jc w:val="both"/>
+        <w:rPr>
+          <w:rFonts w:ascii="Garamond" w:hAnsi="Garamond" w:cs="Garamond"/>
+          <w:highlight w:val="none"/>
+        </w:rPr>
+      </w:pPr>
+      <w:r>
+        <w:rPr>
+          <w:rFonts w:ascii="Garamond" w:hAnsi="Garamond" w:eastAsia="Garamond" w:cs="Garamond"/>
+          <w:highlight w:val="none"/>
+        </w:rPr>
+      </w:r>
+      <w:r>
+        <w:rPr>
+          <w:rFonts w:ascii="Garamond" w:hAnsi="Garamond" w:eastAsia="Garamond" w:cs="Garamond"/>
+          <w:highlight w:val="none"/>
+        </w:rPr>
+      </w:r>
+      <w:r>
+        <w:rPr>
+          <w:rFonts w:ascii="Garamond" w:hAnsi="Garamond" w:cs="Garamond"/>
+          <w:highlight w:val="none"/>
+        </w:rPr>
+      </w:r>
+    </w:p>
+    <w:p>
+      <w:pPr>
+        <w:pStyle w:val="935"/>
+        <w:numPr>
+          <w:ilvl w:val="1"/>
+          <w:numId w:val="10"/>
+        </w:numPr>
+        <w:pBdr/>
+        <w:spacing w:line="360" w:lineRule="auto"/>
+        <w:ind/>
+        <w:jc w:val="both"/>
+        <w:rPr>
+          <w:rFonts w:ascii="Garamond" w:hAnsi="Garamond" w:cs="Garamond"/>
+          <w:b/>
+          <w:bCs/>
+        </w:rPr>
+      </w:pPr>
+      <w:r>
+        <w:rPr>
+          <w:rFonts w:ascii="Garamond" w:hAnsi="Garamond" w:eastAsia="Garamond" w:cs="Garamond"/>
+          <w:b/>
+          <w:bCs/>
+          <w:sz w:val="28"/>
+          <w:szCs w:val="28"/>
+        </w:rPr>
+        <w:t xml:space="preserve">Missions</w:t>
+      </w:r>
+      <w:r>
+        <w:rPr>
+          <w:rFonts w:ascii="Garamond" w:hAnsi="Garamond" w:eastAsia="Garamond" w:cs="Garamond"/>
+          <w:b/>
+          <w:bCs/>
+        </w:rPr>
+        <w:t xml:space="preserve"> de la DSI</w:t>
+      </w:r>
+      <w:r>
+        <w:rPr>
+          <w:rFonts w:ascii="Garamond" w:hAnsi="Garamond" w:eastAsia="Garamond" w:cs="Garamond"/>
+          <w:b/>
+          <w:bCs/>
+        </w:rPr>
+      </w:r>
+      <w:r>
+        <w:rPr>
+          <w:rFonts w:ascii="Garamond" w:hAnsi="Garamond" w:cs="Garamond"/>
+          <w:b/>
+          <w:bCs/>
+        </w:rPr>
+      </w:r>
+    </w:p>
+    <w:p>
+      <w:pPr>
+        <w:pBdr/>
+        <w:spacing w:line="360" w:lineRule="auto"/>
+        <w:ind/>
+        <w:jc w:val="both"/>
+        <w:rPr>
+          <w:rFonts w:ascii="Garamond" w:hAnsi="Garamond" w:cs="Garamond"/>
+        </w:rPr>
+      </w:pPr>
+      <w:r>
+        <w:rPr>
+          <w:rFonts w:ascii="Garamond" w:hAnsi="Garamond" w:eastAsia="Garamond" w:cs="Garamond"/>
+        </w:rPr>
+        <w:t xml:space="preserve">La DSI a pour mission principale d’assurer la mise en œuvre et la gestion du système d’information de l’université. À ce titre, elle est chargée de :</w:t>
+      </w:r>
+      <w:r>
+        <w:rPr>
+          <w:rFonts w:ascii="Garamond" w:hAnsi="Garamond" w:eastAsia="Garamond" w:cs="Garamond"/>
+        </w:rPr>
+      </w:r>
+      <w:r>
+        <w:rPr>
+          <w:rFonts w:ascii="Garamond" w:hAnsi="Garamond" w:cs="Garamond"/>
+        </w:rPr>
+      </w:r>
+    </w:p>
+    <w:p>
+      <w:pPr>
+        <w:pStyle w:val="935"/>
+        <w:numPr>
+          <w:ilvl w:val="0"/>
+          <w:numId w:val="8"/>
+        </w:numPr>
+        <w:pBdr/>
+        <w:spacing w:line="360" w:lineRule="auto"/>
+        <w:ind/>
+        <w:jc w:val="both"/>
+        <w:rPr>
+          <w:rFonts w:ascii="Garamond" w:hAnsi="Garamond" w:cs="Garamond"/>
+        </w:rPr>
+      </w:pPr>
+      <w:r>
+        <w:rPr>
+          <w:rFonts w:ascii="Garamond" w:hAnsi="Garamond" w:eastAsia="Garamond" w:cs="Garamond"/>
+        </w:rPr>
+        <w:t xml:space="preserve">Développer</w:t>
+      </w:r>
+      <w:r>
+        <w:rPr>
+          <w:rFonts w:ascii="Garamond" w:hAnsi="Garamond" w:eastAsia="Garamond" w:cs="Garamond"/>
+        </w:rPr>
+        <w:t xml:space="preserve"> et maintenir les applications informatiques ;</w:t>
+      </w:r>
+      <w:r>
+        <w:rPr>
+          <w:rFonts w:ascii="Garamond" w:hAnsi="Garamond" w:eastAsia="Garamond" w:cs="Garamond"/>
+        </w:rPr>
+      </w:r>
+      <w:r>
+        <w:rPr>
+          <w:rFonts w:ascii="Garamond" w:hAnsi="Garamond" w:cs="Garamond"/>
+        </w:rPr>
+      </w:r>
+    </w:p>
+    <w:p>
+      <w:pPr>
+        <w:pStyle w:val="935"/>
+        <w:numPr>
+          <w:ilvl w:val="0"/>
+          <w:numId w:val="8"/>
+        </w:numPr>
+        <w:pBdr/>
+        <w:spacing w:line="360" w:lineRule="auto"/>
+        <w:ind/>
+        <w:jc w:val="both"/>
+        <w:rPr>
+          <w:rFonts w:ascii="Garamond" w:hAnsi="Garamond" w:cs="Garamond"/>
+        </w:rPr>
+      </w:pPr>
+      <w:r>
+        <w:rPr>
+          <w:rFonts w:ascii="Garamond" w:hAnsi="Garamond" w:eastAsia="Garamond" w:cs="Garamond"/>
+        </w:rPr>
+        <w:t xml:space="preserve">Administrer</w:t>
+      </w:r>
+      <w:r>
+        <w:rPr>
+          <w:rFonts w:ascii="Garamond" w:hAnsi="Garamond" w:eastAsia="Garamond" w:cs="Garamond"/>
+        </w:rPr>
+        <w:t xml:space="preserve"> les systèmes et les réseaux ;</w:t>
+      </w:r>
+      <w:r>
+        <w:rPr>
+          <w:rFonts w:ascii="Garamond" w:hAnsi="Garamond" w:eastAsia="Garamond" w:cs="Garamond"/>
+        </w:rPr>
+      </w:r>
+      <w:r>
+        <w:rPr>
+          <w:rFonts w:ascii="Garamond" w:hAnsi="Garamond" w:cs="Garamond"/>
+        </w:rPr>
+      </w:r>
+    </w:p>
+    <w:p>
+      <w:pPr>
+        <w:pStyle w:val="935"/>
+        <w:numPr>
+          <w:ilvl w:val="0"/>
+          <w:numId w:val="8"/>
+        </w:numPr>
+        <w:pBdr/>
+        <w:spacing w:line="360" w:lineRule="auto"/>
+        <w:ind/>
+        <w:jc w:val="both"/>
+        <w:rPr>
+          <w:rFonts w:ascii="Garamond" w:hAnsi="Garamond" w:cs="Garamond"/>
+        </w:rPr>
+      </w:pPr>
+      <w:r>
+        <w:rPr>
+          <w:rFonts w:ascii="Garamond" w:hAnsi="Garamond" w:eastAsia="Garamond" w:cs="Garamond"/>
+        </w:rPr>
+        <w:t xml:space="preserve">Assurer</w:t>
+      </w:r>
+      <w:r>
+        <w:rPr>
+          <w:rFonts w:ascii="Garamond" w:hAnsi="Garamond" w:eastAsia="Garamond" w:cs="Garamond"/>
+        </w:rPr>
+        <w:t xml:space="preserve"> la disponibilité et la sécurité des données ;</w:t>
+      </w:r>
+      <w:r>
+        <w:rPr>
+          <w:rFonts w:ascii="Garamond" w:hAnsi="Garamond" w:eastAsia="Garamond" w:cs="Garamond"/>
+        </w:rPr>
+      </w:r>
+      <w:r>
+        <w:rPr>
+          <w:rFonts w:ascii="Garamond" w:hAnsi="Garamond" w:cs="Garamond"/>
+        </w:rPr>
+      </w:r>
+    </w:p>
+    <w:p>
+      <w:pPr>
+        <w:pStyle w:val="935"/>
+        <w:numPr>
+          <w:ilvl w:val="0"/>
+          <w:numId w:val="8"/>
+        </w:numPr>
+        <w:pBdr/>
+        <w:spacing w:line="360" w:lineRule="auto"/>
+        <w:ind/>
+        <w:jc w:val="both"/>
+        <w:rPr>
+          <w:rFonts w:ascii="Garamond" w:hAnsi="Garamond" w:cs="Garamond"/>
+        </w:rPr>
+      </w:pPr>
+      <w:r>
+        <w:rPr>
+          <w:rFonts w:ascii="Garamond" w:hAnsi="Garamond" w:eastAsia="Garamond" w:cs="Garamond"/>
+        </w:rPr>
+        <w:t xml:space="preserve">Gérer</w:t>
+      </w:r>
+      <w:r>
+        <w:rPr>
+          <w:rFonts w:ascii="Garamond" w:hAnsi="Garamond" w:eastAsia="Garamond" w:cs="Garamond"/>
+        </w:rPr>
+        <w:t xml:space="preserve"> les services Internet et les infrastructures numériques ;</w:t>
+      </w:r>
+      <w:r>
+        <w:rPr>
+          <w:rFonts w:ascii="Garamond" w:hAnsi="Garamond" w:eastAsia="Garamond" w:cs="Garamond"/>
+        </w:rPr>
+      </w:r>
+      <w:r>
+        <w:rPr>
+          <w:rFonts w:ascii="Garamond" w:hAnsi="Garamond" w:cs="Garamond"/>
+        </w:rPr>
+      </w:r>
+    </w:p>
+    <w:p>
+      <w:pPr>
+        <w:pStyle w:val="935"/>
+        <w:numPr>
+          <w:ilvl w:val="0"/>
+          <w:numId w:val="8"/>
+        </w:numPr>
+        <w:pBdr/>
+        <w:spacing w:line="360" w:lineRule="auto"/>
+        <w:ind/>
+        <w:jc w:val="both"/>
+        <w:rPr>
+          <w:rFonts w:ascii="Garamond" w:hAnsi="Garamond" w:cs="Garamond"/>
+        </w:rPr>
+      </w:pPr>
+      <w:r>
+        <w:rPr>
+          <w:rFonts w:ascii="Garamond" w:hAnsi="Garamond" w:eastAsia="Garamond" w:cs="Garamond"/>
+        </w:rPr>
+        <w:t xml:space="preserve">Fournir</w:t>
+      </w:r>
+      <w:r>
+        <w:rPr>
+          <w:rFonts w:ascii="Garamond" w:hAnsi="Garamond" w:eastAsia="Garamond" w:cs="Garamond"/>
+        </w:rPr>
+        <w:t xml:space="preserve"> une assistance technique aux utilisateurs.</w:t>
+      </w:r>
+      <w:r>
+        <w:rPr>
+          <w:rFonts w:ascii="Garamond" w:hAnsi="Garamond" w:eastAsia="Garamond" w:cs="Garamond"/>
+        </w:rPr>
+      </w:r>
+      <w:r>
+        <w:rPr>
+          <w:rFonts w:ascii="Garamond" w:hAnsi="Garamond" w:cs="Garamond"/>
+        </w:rPr>
+      </w:r>
+    </w:p>
+    <w:p>
+      <w:pPr>
+        <w:pBdr/>
+        <w:spacing w:line="360" w:lineRule="auto"/>
+        <w:ind/>
+        <w:jc w:val="both"/>
+        <w:rPr>
+          <w:rFonts w:ascii="Garamond" w:hAnsi="Garamond" w:cs="Garamond"/>
+        </w:rPr>
+      </w:pPr>
+      <w:r>
+        <w:rPr>
+          <w:rFonts w:ascii="Garamond" w:hAnsi="Garamond" w:eastAsia="Garamond" w:cs="Garamond"/>
+        </w:rPr>
+      </w:r>
+      <w:r>
+        <w:rPr>
+          <w:rFonts w:ascii="Garamond" w:hAnsi="Garamond" w:eastAsia="Garamond" w:cs="Garamond"/>
+        </w:rPr>
+      </w:r>
+      <w:r>
+        <w:rPr>
+          <w:rFonts w:ascii="Garamond" w:hAnsi="Garamond" w:cs="Garamond"/>
+        </w:rPr>
+      </w:r>
+    </w:p>
+    <w:p>
+      <w:pPr>
+        <w:pStyle w:val="935"/>
+        <w:numPr>
+          <w:ilvl w:val="1"/>
+          <w:numId w:val="10"/>
+        </w:numPr>
+        <w:pBdr/>
+        <w:spacing w:line="360" w:lineRule="auto"/>
+        <w:ind/>
+        <w:jc w:val="both"/>
         <w:rPr>
           <w:rFonts w:ascii="Garamond" w:hAnsi="Garamond" w:cs="Garamond"/>
           <w:b/>
@@ -1239,6 +1708,392 @@
           <w:sz w:val="28"/>
           <w:szCs w:val="28"/>
         </w:rPr>
+      </w:pPr>
+      <w:r>
+        <w:rPr>
+          <w:rFonts w:ascii="Garamond" w:hAnsi="Garamond" w:eastAsia="Garamond" w:cs="Garamond"/>
+          <w:b/>
+          <w:bCs/>
+          <w:sz w:val="28"/>
+          <w:szCs w:val="28"/>
+        </w:rPr>
+        <w:t xml:space="preserve">Organisation de la DSI</w:t>
+      </w:r>
+      <w:r>
+        <w:rPr>
+          <w:rFonts w:ascii="Garamond" w:hAnsi="Garamond" w:eastAsia="Garamond" w:cs="Garamond"/>
+          <w:b/>
+          <w:bCs/>
+          <w:sz w:val="28"/>
+          <w:szCs w:val="28"/>
+        </w:rPr>
+      </w:r>
+      <w:r>
+        <w:rPr>
+          <w:rFonts w:ascii="Garamond" w:hAnsi="Garamond" w:cs="Garamond"/>
+          <w:b/>
+          <w:bCs/>
+          <w:sz w:val="28"/>
+          <w:szCs w:val="28"/>
+        </w:rPr>
+      </w:r>
+    </w:p>
+    <w:p>
+      <w:pPr>
+        <w:pBdr/>
+        <w:spacing w:line="360" w:lineRule="auto"/>
+        <w:ind/>
+        <w:jc w:val="both"/>
+        <w:rPr>
+          <w:rFonts w:ascii="Garamond" w:hAnsi="Garamond" w:cs="Garamond"/>
+        </w:rPr>
+      </w:pPr>
+      <w:r>
+        <w:rPr>
+          <w:rFonts w:ascii="Garamond" w:hAnsi="Garamond" w:eastAsia="Garamond" w:cs="Garamond"/>
+        </w:rPr>
+        <w:t xml:space="preserve">Pour accomplir ses missions, la DSI est organisée en trois services :</w:t>
+      </w:r>
+      <w:r>
+        <w:rPr>
+          <w:rFonts w:ascii="Garamond" w:hAnsi="Garamond" w:eastAsia="Garamond" w:cs="Garamond"/>
+        </w:rPr>
+      </w:r>
+      <w:r>
+        <w:rPr>
+          <w:rFonts w:ascii="Garamond" w:hAnsi="Garamond" w:cs="Garamond"/>
+        </w:rPr>
+      </w:r>
+    </w:p>
+    <w:p>
+      <w:pPr>
+        <w:pStyle w:val="935"/>
+        <w:numPr>
+          <w:ilvl w:val="0"/>
+          <w:numId w:val="8"/>
+        </w:numPr>
+        <w:pBdr/>
+        <w:spacing w:line="360" w:lineRule="auto"/>
+        <w:ind/>
+        <w:jc w:val="both"/>
+        <w:rPr>
+          <w:rFonts w:ascii="Garamond" w:hAnsi="Garamond" w:cs="Garamond"/>
+        </w:rPr>
+      </w:pPr>
+      <w:r>
+        <w:rPr>
+          <w:rFonts w:ascii="Garamond" w:hAnsi="Garamond" w:eastAsia="Garamond" w:cs="Garamond"/>
+          <w:b/>
+          <w:bCs/>
+        </w:rPr>
+        <w:t xml:space="preserve">Le</w:t>
+      </w:r>
+      <w:r>
+        <w:rPr>
+          <w:rFonts w:ascii="Garamond" w:hAnsi="Garamond" w:eastAsia="Garamond" w:cs="Garamond"/>
+          <w:b/>
+          <w:bCs/>
+        </w:rPr>
+        <w:t xml:space="preserve"> Service Applications et Bases de données </w:t>
+      </w:r>
+      <w:r>
+        <w:rPr>
+          <w:rFonts w:ascii="Garamond" w:hAnsi="Garamond" w:eastAsia="Garamond" w:cs="Garamond"/>
+        </w:rPr>
+        <w:t xml:space="preserve">: Elle est respons</w:t>
+      </w:r>
+      <w:r>
+        <w:rPr>
+          <w:rFonts w:ascii="Garamond" w:hAnsi="Garamond" w:eastAsia="Garamond" w:cs="Garamond"/>
+        </w:rPr>
+        <w:t xml:space="preserve">able du développement et de la gestion des logiciels de l’université. </w:t>
+      </w:r>
+      <w:r>
+        <w:rPr>
+          <w:rFonts w:ascii="Garamond" w:hAnsi="Garamond" w:eastAsia="Garamond" w:cs="Garamond"/>
+        </w:rPr>
+        <w:t xml:space="preserve">Ce service intervient dans la maintenance des applications, la gestion des bases de données ainsi que la mise en place des solutions numériques.</w:t>
+      </w:r>
+      <w:r>
+        <w:rPr>
+          <w:rFonts w:ascii="Garamond" w:hAnsi="Garamond" w:eastAsia="Garamond" w:cs="Garamond"/>
+        </w:rPr>
+      </w:r>
+      <w:r>
+        <w:rPr>
+          <w:rFonts w:ascii="Garamond" w:hAnsi="Garamond" w:cs="Garamond"/>
+        </w:rPr>
+      </w:r>
+    </w:p>
+    <w:p>
+      <w:pPr>
+        <w:pStyle w:val="935"/>
+        <w:numPr>
+          <w:ilvl w:val="0"/>
+          <w:numId w:val="8"/>
+        </w:numPr>
+        <w:pBdr/>
+        <w:spacing w:line="360" w:lineRule="auto"/>
+        <w:ind/>
+        <w:jc w:val="both"/>
+        <w:rPr>
+          <w:rFonts w:ascii="Garamond" w:hAnsi="Garamond" w:cs="Garamond"/>
+          <w:b/>
+          <w:bCs/>
+        </w:rPr>
+      </w:pPr>
+      <w:r>
+        <w:rPr>
+          <w:rFonts w:ascii="Garamond" w:hAnsi="Garamond" w:eastAsia="Garamond" w:cs="Garamond"/>
+          <w:b/>
+          <w:bCs/>
+        </w:rPr>
+        <w:t xml:space="preserve">Le</w:t>
+      </w:r>
+      <w:r>
+        <w:rPr>
+          <w:rFonts w:ascii="Garamond" w:hAnsi="Garamond" w:eastAsia="Garamond" w:cs="Garamond"/>
+          <w:b/>
+          <w:bCs/>
+        </w:rPr>
+        <w:t xml:space="preserve"> Service Réseau et Systèmes</w:t>
+      </w:r>
+      <w:r>
+        <w:rPr>
+          <w:rFonts w:ascii="Garamond" w:hAnsi="Garamond" w:eastAsia="Garamond" w:cs="Garamond"/>
+          <w:b w:val="0"/>
+          <w:bCs w:val="0"/>
+        </w:rPr>
+        <w:t xml:space="preserve"> : </w:t>
+      </w:r>
+      <w:r>
+        <w:rPr>
+          <w:rFonts w:ascii="Garamond" w:hAnsi="Garamond" w:eastAsia="Garamond" w:cs="Garamond"/>
+          <w:b w:val="0"/>
+          <w:bCs w:val="0"/>
+        </w:rPr>
+        <w:t xml:space="preserve">Elle assure le bon fonctionnement de l’infrastructure informatique</w:t>
+      </w:r>
+      <w:r>
+        <w:rPr>
+          <w:rFonts w:ascii="Garamond" w:hAnsi="Garamond" w:eastAsia="Garamond" w:cs="Garamond"/>
+          <w:b/>
+          <w:bCs/>
+        </w:rPr>
+        <w:t xml:space="preserve"> : </w:t>
+      </w:r>
+      <w:r>
+        <w:rPr>
+          <w:rFonts w:ascii="Garamond" w:hAnsi="Garamond" w:eastAsia="Garamond" w:cs="Garamond"/>
+          <w:b w:val="0"/>
+          <w:bCs w:val="0"/>
+        </w:rPr>
+        <w:t xml:space="preserve">administration des réseaux et des serveurs,maintenance des équipements et sécurité des systèmes</w:t>
+      </w:r>
+      <w:r>
+        <w:rPr>
+          <w:rFonts w:ascii="Garamond" w:hAnsi="Garamond" w:eastAsia="Garamond" w:cs="Garamond"/>
+          <w:b w:val="0"/>
+          <w:bCs w:val="0"/>
+        </w:rPr>
+        <w:t xml:space="preserve">.</w:t>
+      </w:r>
+      <w:r>
+        <w:rPr>
+          <w:rFonts w:ascii="Garamond" w:hAnsi="Garamond" w:eastAsia="Garamond" w:cs="Garamond"/>
+          <w:b/>
+          <w:bCs/>
+        </w:rPr>
+      </w:r>
+      <w:r>
+        <w:rPr>
+          <w:rFonts w:ascii="Garamond" w:hAnsi="Garamond" w:cs="Garamond"/>
+          <w:b/>
+          <w:bCs/>
+        </w:rPr>
+      </w:r>
+    </w:p>
+    <w:p>
+      <w:pPr>
+        <w:pStyle w:val="935"/>
+        <w:numPr>
+          <w:ilvl w:val="0"/>
+          <w:numId w:val="8"/>
+        </w:numPr>
+        <w:pBdr/>
+        <w:spacing w:line="360" w:lineRule="auto"/>
+        <w:ind/>
+        <w:jc w:val="both"/>
+        <w:rPr>
+          <w:rFonts w:ascii="Garamond" w:hAnsi="Garamond" w:cs="Garamond"/>
+          <w:b/>
+          <w:bCs/>
+        </w:rPr>
+      </w:pPr>
+      <w:r>
+        <w:rPr>
+          <w:rFonts w:ascii="Garamond" w:hAnsi="Garamond" w:eastAsia="Garamond" w:cs="Garamond"/>
+          <w:b/>
+          <w:bCs/>
+        </w:rPr>
+      </w:r>
+      <w:r>
+        <w:rPr>
+          <w:rFonts w:ascii="Garamond" w:hAnsi="Garamond" w:eastAsia="Garamond" w:cs="Garamond"/>
+          <w:b/>
+          <w:bCs/>
+          <w:color w:val="000000"/>
+          <w:sz w:val="24"/>
+        </w:rPr>
+        <w:t xml:space="preserve">Le Service Secrétariat</w:t>
+      </w:r>
+      <w:r>
+        <w:rPr>
+          <w:rFonts w:ascii="Garamond" w:hAnsi="Garamond" w:eastAsia="Garamond" w:cs="Garamond"/>
+          <w:color w:val="000000"/>
+          <w:sz w:val="24"/>
+        </w:rPr>
+        <w:t xml:space="preserve"> : </w:t>
+      </w:r>
+      <w:r>
+        <w:rPr>
+          <w:rFonts w:ascii="Garamond" w:hAnsi="Garamond" w:eastAsia="Garamond" w:cs="Garamond"/>
+        </w:rPr>
+        <w:t xml:space="preserve">Elle assure le fonctionnement administratif de la DSI. Il gère le courrier, l'accueil des usagers et le suivi des correspondances officielles, garantissant la fluidité des échanges entre la direction et les autres services de l'université.</w:t>
+      </w:r>
+      <w:r>
+        <w:rPr>
+          <w:rFonts w:ascii="Garamond" w:hAnsi="Garamond" w:eastAsia="Garamond" w:cs="Garamond"/>
+          <w:b/>
+          <w:bCs/>
+        </w:rPr>
+      </w:r>
+      <w:r>
+        <w:rPr>
+          <w:rFonts w:ascii="Garamond" w:hAnsi="Garamond" w:cs="Garamond"/>
+          <w:b/>
+          <w:bCs/>
+        </w:rPr>
+      </w:r>
+    </w:p>
+    <w:p>
+      <w:pPr>
+        <w:pBdr/>
+        <w:spacing w:line="360" w:lineRule="auto"/>
+        <w:ind w:firstLine="0" w:left="0"/>
+        <w:jc w:val="both"/>
+        <w:rPr>
+          <w:rFonts w:ascii="Garamond" w:hAnsi="Garamond" w:cs="Garamond"/>
+          <w:b/>
+          <w:bCs/>
+        </w:rPr>
+      </w:pPr>
+      <w:r>
+        <w:rPr>
+          <w:rFonts w:ascii="Garamond" w:hAnsi="Garamond" w:eastAsia="Garamond" w:cs="Garamond"/>
+          <w:b/>
+          <w:bCs/>
+          <w:highlight w:val="none"/>
+        </w:rPr>
+      </w:r>
+      <w:r>
+        <w:rPr>
+          <w:rFonts w:ascii="Garamond" w:hAnsi="Garamond" w:eastAsia="Garamond" w:cs="Garamond"/>
+          <w:b/>
+          <w:bCs/>
+        </w:rPr>
+      </w:r>
+      <w:r>
+        <w:rPr>
+          <w:rFonts w:ascii="Garamond" w:hAnsi="Garamond" w:cs="Garamond"/>
+          <w:b/>
+          <w:bCs/>
+        </w:rPr>
+      </w:r>
+    </w:p>
+    <w:p>
+      <w:pPr>
+        <w:pBdr/>
+        <w:spacing w:line="360" w:lineRule="auto"/>
+        <w:ind/>
+        <w:jc w:val="both"/>
+        <w:rPr>
+          <w:rFonts w:ascii="Garamond" w:hAnsi="Garamond" w:cs="Garamond"/>
+        </w:rPr>
+      </w:pPr>
+      <w:r>
+        <w:rPr>
+          <w:rFonts w:ascii="Garamond" w:hAnsi="Garamond" w:eastAsia="Garamond" w:cs="Garamond"/>
+        </w:rPr>
+        <w:t xml:space="preserve">Ces trois services forment un ensemble cohérent qui garantit le bon fonctionnement du système informatique de l’université.</w:t>
+      </w:r>
+      <w:r>
+        <w:rPr>
+          <w:rFonts w:ascii="Garamond" w:hAnsi="Garamond" w:eastAsia="Garamond" w:cs="Garamond"/>
+        </w:rPr>
+      </w:r>
+      <w:r>
+        <w:rPr>
+          <w:rFonts w:ascii="Garamond" w:hAnsi="Garamond" w:cs="Garamond"/>
+        </w:rPr>
+      </w:r>
+    </w:p>
+    <w:p>
+      <w:pPr>
+        <w:pStyle w:val="935"/>
+        <w:numPr>
+          <w:ilvl w:val="0"/>
+          <w:numId w:val="10"/>
+        </w:numPr>
+        <w:pBdr/>
+        <w:spacing w:line="360" w:lineRule="auto"/>
+        <w:ind/>
+        <w:jc w:val="both"/>
+        <w:rPr>
+          <w:rFonts w:ascii="Garamond" w:hAnsi="Garamond" w:cs="Garamond"/>
+          <w:b/>
+          <w:bCs/>
+          <w:sz w:val="28"/>
+          <w:szCs w:val="28"/>
+        </w:rPr>
+      </w:pPr>
+      <w:r>
+        <w:rPr>
+          <w:rFonts w:ascii="Garamond" w:hAnsi="Garamond" w:eastAsia="Garamond" w:cs="Garamond"/>
+          <w:b/>
+          <w:bCs/>
+          <w:sz w:val="28"/>
+          <w:szCs w:val="28"/>
+        </w:rPr>
+        <w:t xml:space="preserve">Présentation</w:t>
+      </w:r>
+      <w:r>
+        <w:rPr>
+          <w:rFonts w:ascii="Garamond" w:hAnsi="Garamond" w:eastAsia="Garamond" w:cs="Garamond"/>
+          <w:b/>
+          <w:bCs/>
+          <w:sz w:val="28"/>
+          <w:szCs w:val="28"/>
+        </w:rPr>
+        <w:t xml:space="preserve"> du projet</w:t>
+      </w:r>
+      <w:r>
+        <w:rPr>
+          <w:rFonts w:ascii="Garamond" w:hAnsi="Garamond" w:eastAsia="Garamond" w:cs="Garamond"/>
+          <w:b/>
+          <w:bCs/>
+          <w:sz w:val="28"/>
+          <w:szCs w:val="28"/>
+        </w:rPr>
+      </w:r>
+      <w:r>
+        <w:rPr>
+          <w:rFonts w:ascii="Garamond" w:hAnsi="Garamond" w:cs="Garamond"/>
+          <w:b/>
+          <w:bCs/>
+          <w:sz w:val="28"/>
+          <w:szCs w:val="28"/>
+        </w:rPr>
       </w:r>
     </w:p>
     <w:p>
@@ -1254,6 +2109,10 @@
         <w:jc w:val="both"/>
         <w:rPr>
           <w:rFonts w:ascii="Garamond" w:hAnsi="Garamond" w:cs="Garamond"/>
+          <w:b/>
+          <w:bCs/>
+          <w:sz w:val="28"/>
+          <w:szCs w:val="28"/>
         </w:rPr>
       </w:pPr>
       <w:r>
@@ -1264,16 +2123,24 @@
           <w:sz w:val="28"/>
           <w:szCs w:val="28"/>
         </w:rPr>
-        <w:t xml:space="preserve">Généralité</w:t>
+        <w:t xml:space="preserve">Contexte</w:t>
+      </w:r>
+      <w:r>
+        <w:rPr>
+          <w:rFonts w:ascii="Garamond" w:hAnsi="Garamond" w:eastAsia="Garamond" w:cs="Garamond"/>
+          <w:b/>
+          <w:bCs/>
+          <w:sz w:val="28"/>
+          <w:szCs w:val="28"/>
+        </w:rPr>
       </w:r>
       <w:r>
         <w:rPr>
           <w:rFonts w:ascii="Garamond" w:hAnsi="Garamond" w:cs="Garamond"/>
-        </w:rPr>
-      </w:r>
-      <w:r>
-        <w:rPr>
-          <w:rFonts w:ascii="Garamond" w:hAnsi="Garamond" w:cs="Garamond"/>
+          <w:b/>
+          <w:bCs/>
+          <w:sz w:val="28"/>
+          <w:szCs w:val="28"/>
         </w:rPr>
       </w:r>
     </w:p>
@@ -1291,17 +2158,56 @@
         <w:rPr>
           <w:rFonts w:ascii="Garamond" w:hAnsi="Garamond" w:eastAsia="Garamond" w:cs="Garamond"/>
         </w:rPr>
-        <w:t xml:space="preserve">L’Université Joseph KI-ZERBO (UJKZ) est</w:t>
+        <w:t xml:space="preserve">Dans le cadre de ses activités de recherche, l’</w:t>
+      </w:r>
+      <w:r>
+        <w:rPr>
+          <w:rStyle w:val="941"/>
+          <w:rFonts w:ascii="Garamond" w:hAnsi="Garamond" w:eastAsia="Garamond" w:cs="Garamond" w:eastAsiaTheme="majorEastAsia"/>
+        </w:rPr>
+        <w:t xml:space="preserve">Université Joseph KI-ZERBO</w:t>
       </w:r>
       <w:r>
         <w:rPr>
           <w:rFonts w:ascii="Garamond" w:hAnsi="Garamond" w:eastAsia="Garamond" w:cs="Garamond"/>
         </w:rPr>
-        <w:t xml:space="preserve"> un établissement public d’enseignement supérieur du Burkina Faso, dédié à la formation, à la recherche et à l’innovation.</w:t>
-      </w:r>
-      <w:r>
-        <w:rPr>
-          <w:rFonts w:ascii="Garamond" w:hAnsi="Garamond" w:cs="Garamond"/>
+        <w:t xml:space="preserve"> collabore avec divers partena</w:t>
+      </w:r>
+      <w:r>
+        <w:rPr>
+          <w:rFonts w:ascii="Garamond" w:hAnsi="Garamond" w:eastAsia="Garamond" w:cs="Garamond"/>
+        </w:rPr>
+        <w:t xml:space="preserve">ires techniques et financiers afin de soutenir ces projets. Ces projets nécessitent des ressources financières importantes, généralement obtenues auprès de ces partenaires sous forme de financements </w:t>
+      </w:r>
+      <w:r>
+        <w:rPr>
+          <w:rFonts w:ascii="Garamond" w:hAnsi="Garamond" w:eastAsia="Garamond" w:cs="Garamond"/>
+        </w:rPr>
+        <w:t xml:space="preserve">formalisé </w:t>
+      </w:r>
+      <w:r>
+        <w:rPr>
+          <w:rFonts w:ascii="Garamond" w:hAnsi="Garamond" w:eastAsia="Garamond" w:cs="Garamond"/>
+        </w:rPr>
+        <w:t xml:space="preserve">par des </w:t>
+      </w:r>
+      <w:r>
+        <w:rPr>
+          <w:rFonts w:ascii="Garamond" w:hAnsi="Garamond" w:eastAsia="Garamond" w:cs="Garamond"/>
+          <w:b/>
+          <w:bCs/>
+        </w:rPr>
+        <w:t xml:space="preserve">conventions</w:t>
+      </w:r>
+      <w:r>
+        <w:rPr>
+          <w:rFonts w:ascii="Garamond" w:hAnsi="Garamond" w:eastAsia="Garamond" w:cs="Garamond"/>
+        </w:rPr>
+        <w:t xml:space="preserve">.</w:t>
+      </w:r>
+      <w:r>
+        <w:rPr>
+          <w:rFonts w:ascii="Garamond" w:hAnsi="Garamond" w:eastAsia="Garamond" w:cs="Garamond"/>
         </w:rPr>
       </w:r>
       <w:r>
@@ -1324,11 +2230,74 @@
         <w:rPr>
           <w:rFonts w:ascii="Garamond" w:hAnsi="Garamond" w:eastAsia="Garamond" w:cs="Garamond"/>
         </w:rPr>
-        <w:t xml:space="preserve">Placée sous la tutelle du ministère en charge de l’enseignement supérieur, elle a pour mission principale de former des cadres qualifiés, de promouvoir la recherche scientifique et de contribuer au développement du pays.</w:t>
-      </w:r>
-      <w:r>
-        <w:rPr>
-          <w:rFonts w:ascii="Garamond" w:hAnsi="Garamond" w:cs="Garamond"/>
+      </w:r>
+      <w:r>
+        <w:rPr>
+          <w:rFonts w:ascii="Garamond" w:hAnsi="Garamond" w:eastAsia="Garamond" w:cs="Garamond"/>
+          <w14:ligatures w14:val="none"/>
+        </w:rPr>
+        <w:t xml:space="preserve">Une fois ces conventions signées, plusieurs opérations doivent être assurées, notamment la </w:t>
+      </w:r>
+      <w:r>
+        <w:rPr>
+          <w:rFonts w:ascii="Garamond" w:hAnsi="Garamond" w:eastAsia="Garamond" w:cs="Garamond"/>
+          <w:b/>
+          <w:bCs/>
+          <w14:ligatures w14:val="none"/>
+        </w:rPr>
+        <w:t xml:space="preserve">réception des fonds</w:t>
+      </w:r>
+      <w:r>
+        <w:rPr>
+          <w:rFonts w:ascii="Garamond" w:hAnsi="Garamond" w:eastAsia="Garamond" w:cs="Garamond"/>
+          <w14:ligatures w14:val="none"/>
+        </w:rPr>
+        <w:t xml:space="preserve">, leur </w:t>
+      </w:r>
+      <w:r>
+        <w:rPr>
+          <w:rFonts w:ascii="Garamond" w:hAnsi="Garamond" w:eastAsia="Garamond" w:cs="Garamond"/>
+          <w:b/>
+          <w:bCs/>
+          <w14:ligatures w14:val="none"/>
+        </w:rPr>
+        <w:t xml:space="preserve">répartition en rubriques budgétaires</w:t>
+      </w:r>
+      <w:r>
+        <w:rPr>
+          <w:rFonts w:ascii="Garamond" w:hAnsi="Garamond" w:eastAsia="Garamond" w:cs="Garamond"/>
+          <w14:ligatures w14:val="none"/>
+        </w:rPr>
+        <w:t xml:space="preserve"> et </w:t>
+      </w:r>
+      <w:r>
+        <w:rPr>
+          <w:rFonts w:ascii="Garamond" w:hAnsi="Garamond" w:eastAsia="Garamond" w:cs="Garamond"/>
+          <w:b/>
+          <w:bCs/>
+          <w14:ligatures w14:val="none"/>
+        </w:rPr>
+        <w:t xml:space="preserve">le suivi d</w:t>
+      </w:r>
+      <w:r>
+        <w:rPr>
+          <w:rFonts w:ascii="Garamond" w:hAnsi="Garamond" w:eastAsia="Garamond" w:cs="Garamond"/>
+          <w:b/>
+          <w:bCs/>
+          <w14:ligatures w14:val="none"/>
+        </w:rPr>
+        <w:t xml:space="preserve">e leur utilisation</w:t>
+      </w:r>
+      <w:r>
+        <w:rPr>
+          <w:rFonts w:ascii="Garamond" w:hAnsi="Garamond" w:eastAsia="Garamond" w:cs="Garamond"/>
+          <w14:ligatures w14:val="none"/>
+        </w:rPr>
+        <w:t xml:space="preserve"> dans le cadre de l’exécution des activités prévues. </w:t>
+      </w:r>
+      <w:r>
+        <w:rPr>
+          <w:rFonts w:ascii="Garamond" w:hAnsi="Garamond" w:eastAsia="Garamond" w:cs="Garamond"/>
         </w:rPr>
       </w:r>
       <w:r>
@@ -1345,67 +2314,70 @@
         <w:jc w:val="both"/>
         <w:rPr>
           <w:rFonts w:ascii="Garamond" w:hAnsi="Garamond" w:cs="Garamond"/>
-          <w:highlight w:val="none"/>
+          <w14:ligatures w14:val="none"/>
         </w:rPr>
       </w:pPr>
       <w:r>
         <w:rPr>
           <w:rFonts w:ascii="Garamond" w:hAnsi="Garamond" w:eastAsia="Garamond" w:cs="Garamond"/>
-        </w:rPr>
-        <w:t xml:space="preserve">La Direction des Services Informatiques (DSI) est la</w:t>
+          <w14:ligatures w14:val="none"/>
+        </w:rPr>
+        <w:t xml:space="preserve">C’est dans une logique de modernisation et d’amélioration de ce processus que la DSI s’est engagée dans la mise en place du </w:t>
       </w:r>
       <w:r>
         <w:rPr>
           <w:rFonts w:ascii="Garamond" w:hAnsi="Garamond" w:eastAsia="Garamond" w:cs="Garamond"/>
-        </w:rPr>
-        <w:t xml:space="preserve"> structure chargée de la gestion e</w:t>
+          <w:b/>
+          <w:bCs/>
+          <w14:ligatures w14:val="none"/>
+        </w:rPr>
+        <w:t xml:space="preserve">Circuit Intégré des Financements Extérieurs Universitaires </w:t>
       </w:r>
       <w:r>
         <w:rPr>
           <w:rFonts w:ascii="Garamond" w:hAnsi="Garamond" w:eastAsia="Garamond" w:cs="Garamond"/>
-        </w:rPr>
-        <w:t xml:space="preserve">t du développement des ressources numériques de l’UJKZ. Elle est rattachée à la vice-présidence en charge des enseignements et des innovations pédagogiques, et intervient au quotidien au service des étudiants, des enseignants et du personnel administratif.</w:t>
+          <w14:ligatures w14:val="none"/>
+        </w:rPr>
+        <w:t xml:space="preserve">(CIFEU</w:t>
+      </w:r>
+      <w:r>
+        <w:rPr>
+          <w:rFonts w:ascii="Garamond" w:hAnsi="Garamond" w:eastAsia="Garamond" w:cs="Garamond"/>
+          <w14:ligatures w14:val="none"/>
+        </w:rPr>
+        <w:t xml:space="preserve">),un système d’information destiné à digitaliser la gestion de ces financements.</w:t>
+      </w:r>
+      <w:r>
+        <w:rPr>
+          <w:rFonts w:ascii="Garamond" w:hAnsi="Garamond" w:eastAsia="Garamond" w:cs="Garamond"/>
+          <w14:ligatures w14:val="none"/>
+        </w:rPr>
+        <w:t xml:space="preserve">Le présent stage s’inscrit directement dans ce projet, c’est a dire la conception et le développement d’un module dédié </w:t>
+      </w:r>
+      <w:r>
+        <w:rPr>
+          <w:rFonts w:ascii="Garamond" w:hAnsi="Garamond" w:eastAsia="Garamond" w:cs="Garamond"/>
+          <w14:ligatures w14:val="none"/>
+        </w:rPr>
+        <w:t xml:space="preserve"> au  suivi de la mobilisation des ressources</w:t>
+      </w:r>
+      <w:r>
+        <w:rPr>
+          <w:rFonts w:ascii="Garamond" w:hAnsi="Garamond" w:eastAsia="Garamond" w:cs="Garamond"/>
+          <w14:ligatures w14:val="none"/>
+        </w:rPr>
+        <w:t xml:space="preserve">, a la gestion budgétaire et au contrôle d’exécution des dépenses qui devrait s’intégrer au système de gestion des projet et des conventions déjà présentes.</w:t>
+      </w:r>
+      <w:r>
+        <w:rPr>
+          <w:rFonts w:ascii="Garamond" w:hAnsi="Garamond" w:eastAsia="Garamond" w:cs="Garamond"/>
+          <w14:ligatures w14:val="none"/>
+        </w:rPr>
       </w:r>
       <w:r>
         <w:rPr>
           <w:rFonts w:ascii="Garamond" w:hAnsi="Garamond" w:cs="Garamond"/>
-          <w:highlight w:val="none"/>
-        </w:rPr>
-      </w:r>
-      <w:r>
-        <w:rPr>
-          <w:rFonts w:ascii="Garamond" w:hAnsi="Garamond" w:cs="Garamond"/>
-          <w:highlight w:val="none"/>
-        </w:rPr>
-      </w:r>
-    </w:p>
-    <w:p>
-      <w:pPr>
-        <w:pBdr/>
-        <w:spacing w:line="360" w:lineRule="auto"/>
-        <w:ind/>
-        <w:jc w:val="both"/>
-        <w:rPr>
-          <w:rFonts w:ascii="Garamond" w:hAnsi="Garamond" w:cs="Garamond"/>
-          <w:highlight w:val="none"/>
-        </w:rPr>
-      </w:pPr>
-      <w:r>
-        <w:rPr>
-          <w:rFonts w:ascii="Garamond" w:hAnsi="Garamond" w:eastAsia="Garamond" w:cs="Garamond"/>
-          <w:highlight w:val="none"/>
-        </w:rPr>
-      </w:r>
-      <w:r>
-        <w:rPr>
-          <w:rFonts w:ascii="Garamond" w:hAnsi="Garamond" w:cs="Garamond"/>
-          <w:highlight w:val="none"/>
-        </w:rPr>
-      </w:r>
-      <w:r>
-        <w:rPr>
-          <w:rFonts w:ascii="Garamond" w:hAnsi="Garamond" w:cs="Garamond"/>
-          <w:highlight w:val="none"/>
+          <w14:ligatures w14:val="none"/>
         </w:rPr>
       </w:r>
     </w:p>
@@ -1424,6 +2396,8 @@
           <w:rFonts w:ascii="Garamond" w:hAnsi="Garamond" w:cs="Garamond"/>
           <w:b/>
           <w:bCs/>
+          <w:sz w:val="28"/>
+          <w:szCs w:val="28"/>
         </w:rPr>
       </w:pPr>
       <w:r>
@@ -1434,28 +2408,279 @@
           <w:sz w:val="28"/>
           <w:szCs w:val="28"/>
         </w:rPr>
-        <w:t xml:space="preserve">Missions</w:t>
+        <w:t xml:space="preserve">Problématique</w:t>
       </w:r>
       <w:r>
         <w:rPr>
           <w:rFonts w:ascii="Garamond" w:hAnsi="Garamond" w:eastAsia="Garamond" w:cs="Garamond"/>
           <w:b/>
           <w:bCs/>
-        </w:rPr>
-        <w:t xml:space="preserve"> de la DSI</w:t>
+          <w:sz w:val="28"/>
+          <w:szCs w:val="28"/>
+        </w:rPr>
       </w:r>
       <w:r>
         <w:rPr>
           <w:rFonts w:ascii="Garamond" w:hAnsi="Garamond" w:cs="Garamond"/>
           <w:b/>
           <w:bCs/>
-        </w:rPr>
-      </w:r>
-      <w:r>
+          <w:sz w:val="28"/>
+          <w:szCs w:val="28"/>
+        </w:rPr>
+      </w:r>
+    </w:p>
+    <w:p>
+      <w:pPr>
+        <w:pBdr/>
+        <w:spacing w:line="360" w:lineRule="auto"/>
+        <w:ind/>
+        <w:jc w:val="both"/>
+        <w:rPr>
+          <w:rFonts w:ascii="Garamond" w:hAnsi="Garamond" w:cs="Garamond"/>
+        </w:rPr>
+      </w:pPr>
+      <w:r>
+        <w:rPr>
+          <w:rFonts w:ascii="Garamond" w:hAnsi="Garamond" w:eastAsia="Garamond" w:cs="Garamond"/>
+        </w:rPr>
+        <w:t xml:space="preserve">Malgré l’existence de mécanismes de financement des projets au sein de l’</w:t>
+      </w:r>
+      <w:r>
+        <w:rPr>
+          <w:rFonts w:ascii="Garamond" w:hAnsi="Garamond" w:eastAsia="Garamond" w:cs="Garamond"/>
+        </w:rPr>
+        <w:t xml:space="preserve">UJKZ, la gestion opérationnelle des ressources financières issues des partenaires extérieurs demeure complexe .</w:t>
+      </w:r>
+      <w:r>
+        <w:rPr>
+          <w:rFonts w:ascii="Garamond" w:hAnsi="Garamond" w:eastAsia="Garamond" w:cs="Garamond"/>
+        </w:rPr>
+        <w:t xml:space="preserve">En effet </w:t>
+      </w:r>
+      <w:r>
+        <w:rPr>
+          <w:rFonts w:ascii="Garamond" w:hAnsi="Garamond" w:eastAsia="Garamond" w:cs="Garamond"/>
+        </w:rPr>
+        <w:t xml:space="preserve">les versements des </w:t>
+      </w:r>
+      <w:r>
+        <w:rPr>
+          <w:rFonts w:ascii="Garamond" w:hAnsi="Garamond" w:eastAsia="Garamond" w:cs="Garamond"/>
+          <w:b/>
+          <w:bCs/>
+        </w:rPr>
+        <w:t xml:space="preserve">bailleurs de fonds </w:t>
+      </w:r>
+      <w:r>
+        <w:rPr>
+          <w:rFonts w:ascii="Garamond" w:hAnsi="Garamond" w:eastAsia="Garamond" w:cs="Garamond"/>
+        </w:rPr>
+        <w:t xml:space="preserve">(partenaires financiers) ne suivent pas toujours un calendrier régulier et peuvent prendre des formes variées, ce qui complique le suivi des fonds réellement disponibles à un moment donné. À cela s'ajoute la nécessité de gérer les budgets par rubr</w:t>
+      </w:r>
+      <w:r>
+        <w:rPr>
+          <w:rFonts w:ascii="Garamond" w:hAnsi="Garamond" w:eastAsia="Garamond" w:cs="Garamond"/>
+        </w:rPr>
+        <w:t xml:space="preserve">iques, telles que définies dans les conventions, avec une vigilance constante pour éviter tout dépassement.</w:t>
+      </w:r>
+      <w:r>
+        <w:rPr>
+          <w:rFonts w:ascii="Garamond" w:hAnsi="Garamond" w:eastAsia="Garamond" w:cs="Garamond"/>
+        </w:rPr>
+      </w:r>
+      <w:r>
+        <w:rPr>
+          <w:rFonts w:ascii="Garamond" w:hAnsi="Garamond" w:cs="Garamond"/>
+        </w:rPr>
+      </w:r>
+    </w:p>
+    <w:p>
+      <w:pPr>
+        <w:pStyle w:val="940"/>
+        <w:pBdr/>
+        <w:spacing w:line="360" w:lineRule="auto"/>
+        <w:ind/>
+        <w:jc w:val="both"/>
+        <w:rPr>
+          <w:rFonts w:ascii="Garamond" w:hAnsi="Garamond" w:cs="Garamond"/>
+        </w:rPr>
+      </w:pPr>
+      <w:r>
+        <w:rPr>
+          <w:rFonts w:ascii="Garamond" w:hAnsi="Garamond" w:eastAsia="Garamond" w:cs="Garamond"/>
+        </w:rPr>
+        <w:t xml:space="preserve">Le processus d'exécution des dépenses implique également plusieurs acteurs aux rôles distincts : le  </w:t>
+      </w:r>
+      <w:r>
+        <w:rPr>
+          <w:rFonts w:ascii="Garamond" w:hAnsi="Garamond" w:eastAsia="Garamond" w:cs="Garamond"/>
+          <w:b/>
+          <w:bCs/>
+        </w:rPr>
+        <w:t xml:space="preserve">porteur de projets </w:t>
+      </w:r>
+      <w:r>
+        <w:rPr>
+          <w:rFonts w:ascii="Garamond" w:hAnsi="Garamond" w:eastAsia="Garamond" w:cs="Garamond"/>
+        </w:rPr>
+        <w:t xml:space="preserve">(personne qui prend charger de l’exécution du projet), la </w:t>
+      </w:r>
+      <w:r>
+        <w:rPr>
+          <w:rFonts w:ascii="Garamond" w:hAnsi="Garamond" w:eastAsia="Garamond" w:cs="Garamond"/>
+          <w:b/>
+          <w:bCs/>
+        </w:rPr>
+        <w:t xml:space="preserve">Direction de l'Administration et des Finances </w:t>
+      </w:r>
+      <w:r>
+        <w:rPr>
+          <w:rFonts w:ascii="Garamond" w:hAnsi="Garamond" w:eastAsia="Garamond" w:cs="Garamond"/>
+        </w:rPr>
+        <w:t xml:space="preserve">(DAF) et l'</w:t>
+      </w:r>
+      <w:r>
+        <w:rPr>
+          <w:rFonts w:ascii="Garamond" w:hAnsi="Garamond" w:eastAsia="Garamond" w:cs="Garamond"/>
+          <w:b/>
+          <w:bCs/>
+        </w:rPr>
+        <w:t xml:space="preserve">Agent Comptable </w:t>
+      </w:r>
+      <w:r>
+        <w:rPr>
+          <w:rFonts w:ascii="Garamond" w:hAnsi="Garamond" w:eastAsia="Garamond" w:cs="Garamond"/>
+        </w:rPr>
+        <w:t xml:space="preserve">(AC),</w:t>
+      </w:r>
+      <w:r>
+        <w:rPr>
+          <w:rFonts w:ascii="Garamond" w:hAnsi="Garamond" w:eastAsia="Garamond" w:cs="Garamond"/>
+        </w:rPr>
+        <w:t xml:space="preserve"> chacun intervenant à un stade précis selon des procédures spécifiques. En l'absence d'un système intégré, cette multiplicité d'intervenants nuit à la traçabilité des opérations et rend le suivi en temps réel des budgets très difficile.</w:t>
+      </w:r>
+      <w:r>
+        <w:rPr>
+          <w:rFonts w:ascii="Garamond" w:hAnsi="Garamond" w:eastAsia="Garamond" w:cs="Garamond"/>
+        </w:rPr>
+      </w:r>
+      <w:r>
+        <w:rPr>
+          <w:rFonts w:ascii="Garamond" w:hAnsi="Garamond" w:cs="Garamond"/>
+        </w:rPr>
+      </w:r>
+    </w:p>
+    <w:p>
+      <w:pPr>
+        <w:pStyle w:val="940"/>
+        <w:pBdr/>
+        <w:spacing w:line="360" w:lineRule="auto"/>
+        <w:ind/>
+        <w:jc w:val="both"/>
+        <w:rPr>
+          <w:rFonts w:ascii="Garamond" w:hAnsi="Garamond" w:cs="Garamond"/>
+          <w:highlight w:val="none"/>
+        </w:rPr>
+      </w:pPr>
+      <w:r>
+        <w:rPr>
+          <w:rFonts w:ascii="Garamond" w:hAnsi="Garamond" w:eastAsia="Garamond" w:cs="Garamond"/>
+        </w:rPr>
+      </w:r>
+      <w:r>
+        <w:rPr>
+          <w:rFonts w:ascii="Garamond" w:hAnsi="Garamond" w:eastAsia="Garamond" w:cs="Garamond"/>
+        </w:rPr>
+        <w:t xml:space="preserve">La question centrale qui se pose est donc la suivante : </w:t>
+      </w:r>
+      <w:r>
+        <w:rPr>
+          <w:rFonts w:ascii="Garamond" w:hAnsi="Garamond" w:eastAsia="Garamond" w:cs="Garamond"/>
+          <w:b/>
+          <w:bCs/>
+        </w:rPr>
+        <w:t xml:space="preserve">c</w:t>
+      </w:r>
+      <w:r>
+        <w:rPr>
+          <w:rFonts w:ascii="Garamond" w:hAnsi="Garamond" w:eastAsia="Garamond" w:cs="Garamond"/>
+          <w:b/>
+          <w:bCs/>
+        </w:rPr>
+        <w:t xml:space="preserve">omment concevoir un système permettant d'assurer un suivi efficace de la mobilisation des ressources extérieures, une gestion rigoureuse des budgets par rubriques et un contrôle fiable de l'exécution </w:t>
+      </w:r>
+      <w:r>
+        <w:rPr>
+          <w:rFonts w:ascii="Garamond" w:hAnsi="Garamond" w:eastAsia="Garamond" w:cs="Garamond"/>
+          <w:b/>
+          <w:bCs/>
+        </w:rPr>
+        <w:t xml:space="preserve">des dépenses, dans le respect des procédures établies</w:t>
+      </w:r>
+      <w:r>
+        <w:rPr>
+          <w:rFonts w:ascii="Garamond" w:hAnsi="Garamond" w:eastAsia="Garamond" w:cs="Garamond"/>
+        </w:rPr>
+        <w:t xml:space="preserve"> ?</w:t>
+      </w:r>
+      <w:r>
+        <w:rPr>
+          <w:rFonts w:ascii="Garamond" w:hAnsi="Garamond" w:eastAsia="Garamond" w:cs="Garamond"/>
+          <w:highlight w:val="none"/>
+        </w:rPr>
+      </w:r>
+      <w:r>
+        <w:rPr>
+          <w:rFonts w:ascii="Garamond" w:hAnsi="Garamond" w:cs="Garamond"/>
+          <w:highlight w:val="none"/>
+        </w:rPr>
+      </w:r>
+    </w:p>
+    <w:p>
+      <w:pPr>
+        <w:pStyle w:val="935"/>
+        <w:numPr>
+          <w:ilvl w:val="1"/>
+          <w:numId w:val="10"/>
+        </w:numPr>
+        <w:pBdr/>
+        <w:spacing w:line="360" w:lineRule="auto"/>
+        <w:ind/>
+        <w:jc w:val="both"/>
         <w:rPr>
           <w:rFonts w:ascii="Garamond" w:hAnsi="Garamond" w:cs="Garamond"/>
           <w:b/>
           <w:bCs/>
+          <w:sz w:val="28"/>
+          <w:szCs w:val="28"/>
+        </w:rPr>
+      </w:pPr>
+      <w:r>
+        <w:rPr>
+          <w:rFonts w:ascii="Garamond" w:hAnsi="Garamond" w:eastAsia="Garamond" w:cs="Garamond"/>
+          <w:b/>
+          <w:bCs/>
+          <w:sz w:val="28"/>
+          <w:szCs w:val="28"/>
+        </w:rPr>
+        <w:t xml:space="preserve">Objectifs de l’étude</w:t>
+      </w:r>
+      <w:r>
+        <w:rPr>
+          <w:rFonts w:ascii="Garamond" w:hAnsi="Garamond" w:eastAsia="Garamond" w:cs="Garamond"/>
+          <w:b/>
+          <w:bCs/>
+          <w:sz w:val="28"/>
+          <w:szCs w:val="28"/>
+        </w:rPr>
+      </w:r>
+      <w:r>
+        <w:rPr>
+          <w:rFonts w:ascii="Garamond" w:hAnsi="Garamond" w:cs="Garamond"/>
+          <w:b/>
+          <w:bCs/>
+          <w:sz w:val="28"/>
+          <w:szCs w:val="28"/>
         </w:rPr>
       </w:r>
     </w:p>
@@ -1473,11 +2698,80 @@
         <w:rPr>
           <w:rFonts w:ascii="Garamond" w:hAnsi="Garamond" w:eastAsia="Garamond" w:cs="Garamond"/>
         </w:rPr>
-        <w:t xml:space="preserve">La DSI a pour mission principale d’assurer la mise en œuvre et la gestion du système d’information de l’université. À ce titre, elle est chargée de :</w:t>
+        <w:t xml:space="preserve">L’objectif de cette étude est </w:t>
+      </w:r>
+      <w:r>
+        <w:rPr>
+          <w:rFonts w:ascii="Garamond" w:hAnsi="Garamond" w:eastAsia="Garamond" w:cs="Garamond"/>
+        </w:rPr>
+        <w:t xml:space="preserve">de concevoir et de proposer une solution informatique permettant d’améliorer la gestion des financements extérieurs au sein de l’université, en assurant le suivi des ressources mobilisées, la gestion des budgets et le contrôle de l’exécution des dépenses. </w:t>
+      </w:r>
+      <w:r>
+        <w:rPr>
+          <w:rFonts w:ascii="Garamond" w:hAnsi="Garamond" w:eastAsia="Garamond" w:cs="Garamond"/>
+        </w:rPr>
       </w:r>
       <w:r>
         <w:rPr>
           <w:rFonts w:ascii="Garamond" w:hAnsi="Garamond" w:cs="Garamond"/>
+        </w:rPr>
+      </w:r>
+    </w:p>
+    <w:p>
+      <w:pPr>
+        <w:pBdr/>
+        <w:spacing w:line="360" w:lineRule="auto"/>
+        <w:ind/>
+        <w:jc w:val="both"/>
+        <w:rPr>
+          <w:rFonts w:ascii="Garamond" w:hAnsi="Garamond" w:cs="Garamond"/>
+        </w:rPr>
+      </w:pPr>
+      <w:r>
+        <w:rPr>
+          <w:rFonts w:ascii="Garamond" w:hAnsi="Garamond" w:eastAsia="Garamond" w:cs="Garamond"/>
+        </w:rPr>
+        <w:t xml:space="preserve">De </w:t>
+      </w:r>
+      <w:r>
+        <w:rPr>
+          <w:rFonts w:ascii="Garamond" w:hAnsi="Garamond" w:eastAsia="Garamond" w:cs="Garamond"/>
+        </w:rPr>
+        <w:t xml:space="preserve">façon</w:t>
+      </w:r>
+      <w:r>
+        <w:rPr>
+          <w:rFonts w:ascii="Garamond" w:hAnsi="Garamond" w:eastAsia="Garamond" w:cs="Garamond"/>
+        </w:rPr>
+        <w:t xml:space="preserve"> plus </w:t>
+      </w:r>
+      <w:r>
+        <w:rPr>
+          <w:rFonts w:ascii="Garamond" w:hAnsi="Garamond" w:eastAsia="Garamond" w:cs="Garamond"/>
+        </w:rPr>
+        <w:t xml:space="preserve">spécifique</w:t>
+      </w:r>
+      <w:r>
+        <w:rPr>
+          <w:rFonts w:ascii="Garamond" w:hAnsi="Garamond" w:eastAsia="Garamond" w:cs="Garamond"/>
+        </w:rPr>
+        <w:t xml:space="preserve">, il s’agit de </w:t>
+      </w:r>
+      <w:r>
+        <w:rPr>
+          <w:rFonts w:ascii="Garamond" w:hAnsi="Garamond" w:eastAsia="Garamond" w:cs="Garamond"/>
+        </w:rPr>
+        <w:t xml:space="preserve">:</w:t>
+      </w:r>
+      <w:r>
+        <w:rPr>
+          <w:rFonts w:ascii="Garamond" w:hAnsi="Garamond" w:eastAsia="Garamond" w:cs="Garamond"/>
+        </w:rPr>
+        <w:t xml:space="preserve"> </w:t>
+      </w:r>
+      <w:r>
+        <w:rPr>
+          <w:rFonts w:ascii="Garamond" w:hAnsi="Garamond" w:eastAsia="Garamond" w:cs="Garamond"/>
         </w:rPr>
       </w:r>
       <w:r>
@@ -1505,17 +2799,29 @@
         <w:rPr>
           <w:rFonts w:ascii="Garamond" w:hAnsi="Garamond" w:eastAsia="Garamond" w:cs="Garamond"/>
         </w:rPr>
-        <w:t xml:space="preserve">Développer</w:t>
+        <w:t xml:space="preserve">Mettre en place un mécanisme de suivi</w:t>
       </w:r>
       <w:r>
         <w:rPr>
           <w:rFonts w:ascii="Garamond" w:hAnsi="Garamond" w:eastAsia="Garamond" w:cs="Garamond"/>
         </w:rPr>
-        <w:t xml:space="preserve"> et maintenir les applications informatiques ;</w:t>
-      </w:r>
-      <w:r>
-        <w:rPr>
-          <w:rFonts w:ascii="Garamond" w:hAnsi="Garamond" w:cs="Garamond"/>
+        <w:t xml:space="preserve"> et d’enregistrement</w:t>
+      </w:r>
+      <w:r>
+        <w:rPr>
+          <w:rFonts w:ascii="Garamond" w:hAnsi="Garamond" w:eastAsia="Garamond" w:cs="Garamond"/>
+        </w:rPr>
+        <w:t xml:space="preserve"> des ressources financières mobilisées auprès des bailleurs </w:t>
+      </w:r>
+      <w:r>
+        <w:rPr>
+          <w:rFonts w:ascii="Garamond" w:hAnsi="Garamond" w:eastAsia="Garamond" w:cs="Garamond"/>
+        </w:rPr>
+        <w:t xml:space="preserve">;</w:t>
+      </w:r>
+      <w:r>
+        <w:rPr>
+          <w:rFonts w:ascii="Garamond" w:hAnsi="Garamond" w:eastAsia="Garamond" w:cs="Garamond"/>
         </w:rPr>
       </w:r>
       <w:r>
@@ -1543,17 +2849,11 @@
         <w:rPr>
           <w:rFonts w:ascii="Garamond" w:hAnsi="Garamond" w:eastAsia="Garamond" w:cs="Garamond"/>
         </w:rPr>
-        <w:t xml:space="preserve">Administrer</w:t>
+        <w:t xml:space="preserve">Assurer une gestion structurée des budgets par rubriques conformément aux conventions </w:t>
       </w:r>
       <w:r>
         <w:rPr>
           <w:rFonts w:ascii="Garamond" w:hAnsi="Garamond" w:eastAsia="Garamond" w:cs="Garamond"/>
-        </w:rPr>
-        <w:t xml:space="preserve"> les systèmes et les réseaux ;</w:t>
-      </w:r>
-      <w:r>
-        <w:rPr>
-          <w:rFonts w:ascii="Garamond" w:hAnsi="Garamond" w:cs="Garamond"/>
         </w:rPr>
       </w:r>
       <w:r>
@@ -1581,17 +2881,17 @@
         <w:rPr>
           <w:rFonts w:ascii="Garamond" w:hAnsi="Garamond" w:eastAsia="Garamond" w:cs="Garamond"/>
         </w:rPr>
-        <w:t xml:space="preserve">Assurer</w:t>
+        <w:t xml:space="preserve">Permettre le suivi des dépenses en lien avec les activités des projets </w:t>
       </w:r>
       <w:r>
         <w:rPr>
           <w:rFonts w:ascii="Garamond" w:hAnsi="Garamond" w:eastAsia="Garamond" w:cs="Garamond"/>
         </w:rPr>
-        <w:t xml:space="preserve"> la disponibilité et la sécurité des données ;</w:t>
-      </w:r>
-      <w:r>
-        <w:rPr>
-          <w:rFonts w:ascii="Garamond" w:hAnsi="Garamond" w:cs="Garamond"/>
+        <w:t xml:space="preserve">;</w:t>
+      </w:r>
+      <w:r>
+        <w:rPr>
+          <w:rFonts w:ascii="Garamond" w:hAnsi="Garamond" w:eastAsia="Garamond" w:cs="Garamond"/>
         </w:rPr>
       </w:r>
       <w:r>
@@ -1619,17 +2919,35 @@
         <w:rPr>
           <w:rFonts w:ascii="Garamond" w:hAnsi="Garamond" w:eastAsia="Garamond" w:cs="Garamond"/>
         </w:rPr>
-        <w:t xml:space="preserve">Gérer</w:t>
+        <w:t xml:space="preserve">Intégrer un système de contrôle automatique afin d</w:t>
       </w:r>
       <w:r>
         <w:rPr>
           <w:rFonts w:ascii="Garamond" w:hAnsi="Garamond" w:eastAsia="Garamond" w:cs="Garamond"/>
         </w:rPr>
-        <w:t xml:space="preserve"> les services Internet et les infrastructures numériques ;</w:t>
-      </w:r>
-      <w:r>
-        <w:rPr>
-          <w:rFonts w:ascii="Garamond" w:hAnsi="Garamond" w:cs="Garamond"/>
+        <w:t xml:space="preserve">’éviter </w:t>
+      </w:r>
+      <w:r>
+        <w:rPr>
+          <w:rFonts w:ascii="Garamond" w:hAnsi="Garamond" w:eastAsia="Garamond" w:cs="Garamond"/>
+        </w:rPr>
+        <w:t xml:space="preserve">les dépassements </w:t>
+      </w:r>
+      <w:r>
+        <w:rPr>
+          <w:rFonts w:ascii="Garamond" w:hAnsi="Garamond" w:eastAsia="Garamond" w:cs="Garamond"/>
+        </w:rPr>
+        <w:t xml:space="preserve">budgétaires</w:t>
+      </w:r>
+      <w:r>
+        <w:rPr>
+          <w:rFonts w:ascii="Garamond" w:hAnsi="Garamond" w:eastAsia="Garamond" w:cs="Garamond"/>
+        </w:rPr>
+        <w:t xml:space="preserve"> ;</w:t>
+      </w:r>
+      <w:r>
+        <w:rPr>
+          <w:rFonts w:ascii="Garamond" w:hAnsi="Garamond" w:eastAsia="Garamond" w:cs="Garamond"/>
         </w:rPr>
       </w:r>
       <w:r>
@@ -1657,17 +2975,23 @@
         <w:rPr>
           <w:rFonts w:ascii="Garamond" w:hAnsi="Garamond" w:eastAsia="Garamond" w:cs="Garamond"/>
         </w:rPr>
-        <w:t xml:space="preserve">Fournir</w:t>
+        <w:t xml:space="preserve">Modéliser et implémenter le circuit de validation des dépenses en fonction de leur </w:t>
       </w:r>
       <w:r>
         <w:rPr>
           <w:rFonts w:ascii="Garamond" w:hAnsi="Garamond" w:eastAsia="Garamond" w:cs="Garamond"/>
         </w:rPr>
-        <w:t xml:space="preserve"> une assistance technique aux utilisateurs.</w:t>
-      </w:r>
-      <w:r>
-        <w:rPr>
-          <w:rFonts w:ascii="Garamond" w:hAnsi="Garamond" w:cs="Garamond"/>
+        <w:t xml:space="preserve">nature</w:t>
+      </w:r>
+      <w:r>
+        <w:rPr>
+          <w:rFonts w:ascii="Garamond" w:hAnsi="Garamond" w:eastAsia="Garamond" w:cs="Garamond"/>
+        </w:rPr>
+        <w:t xml:space="preserve"> ;</w:t>
+      </w:r>
+      <w:r>
+        <w:rPr>
+          <w:rFonts w:ascii="Garamond" w:hAnsi="Garamond" w:eastAsia="Garamond" w:cs="Garamond"/>
         </w:rPr>
       </w:r>
       <w:r>
@@ -1678,6 +3002,11 @@
     </w:p>
     <w:p>
       <w:pPr>
+        <w:pStyle w:val="935"/>
+        <w:numPr>
+          <w:ilvl w:val="0"/>
+          <w:numId w:val="8"/>
+        </w:numPr>
         <w:pBdr/>
         <w:spacing w:line="360" w:lineRule="auto"/>
         <w:ind/>
@@ -1690,10 +3019,67 @@
         <w:rPr>
           <w:rFonts w:ascii="Garamond" w:hAnsi="Garamond" w:eastAsia="Garamond" w:cs="Garamond"/>
         </w:rPr>
+        <w:t xml:space="preserve">Garantir la traçabilité de l’ensemble des opérations financières </w:t>
+      </w:r>
+      <w:r>
+        <w:rPr>
+          <w:rFonts w:ascii="Garamond" w:hAnsi="Garamond" w:eastAsia="Garamond" w:cs="Garamond"/>
+        </w:rPr>
+        <w:t xml:space="preserve">;</w:t>
+      </w:r>
+      <w:r>
+        <w:rPr>
+          <w:rFonts w:ascii="Garamond" w:hAnsi="Garamond" w:eastAsia="Garamond" w:cs="Garamond"/>
+        </w:rPr>
       </w:r>
       <w:r>
         <w:rPr>
           <w:rFonts w:ascii="Garamond" w:hAnsi="Garamond" w:cs="Garamond"/>
+        </w:rPr>
+      </w:r>
+    </w:p>
+    <w:p>
+      <w:pPr>
+        <w:pStyle w:val="935"/>
+        <w:numPr>
+          <w:ilvl w:val="0"/>
+          <w:numId w:val="8"/>
+        </w:numPr>
+        <w:pBdr/>
+        <w:spacing w:line="360" w:lineRule="auto"/>
+        <w:ind/>
+        <w:jc w:val="both"/>
+        <w:rPr>
+          <w:rFonts w:ascii="Garamond" w:hAnsi="Garamond" w:cs="Garamond"/>
+        </w:rPr>
+      </w:pPr>
+      <w:r>
+        <w:rPr>
+          <w:rFonts w:ascii="Garamond" w:hAnsi="Garamond" w:eastAsia="Garamond" w:cs="Garamond"/>
+        </w:rPr>
+        <w:t xml:space="preserve">Fournir des outils de </w:t>
+      </w:r>
+      <w:r>
+        <w:rPr>
+          <w:rFonts w:ascii="Garamond" w:hAnsi="Garamond" w:eastAsia="Garamond" w:cs="Garamond"/>
+        </w:rPr>
+        <w:t xml:space="preserve">reportions</w:t>
+      </w:r>
+      <w:r>
+        <w:rPr>
+          <w:rFonts w:ascii="Garamond" w:hAnsi="Garamond" w:eastAsia="Garamond" w:cs="Garamond"/>
+        </w:rPr>
+        <w:t xml:space="preserve"> pour le suivi et l’aide à la décision</w:t>
+      </w:r>
+      <w:r>
+        <w:rPr>
+          <w:rFonts w:ascii="Garamond" w:hAnsi="Garamond" w:eastAsia="Garamond" w:cs="Garamond"/>
+        </w:rPr>
+        <w:t xml:space="preserve">.</w:t>
+      </w:r>
+      <w:r>
+        <w:rPr>
+          <w:rFonts w:ascii="Garamond" w:hAnsi="Garamond" w:eastAsia="Garamond" w:cs="Garamond"/>
         </w:rPr>
       </w:r>
       <w:r>
@@ -1729,7 +3115,26 @@
           <w:sz w:val="28"/>
           <w:szCs w:val="28"/>
         </w:rPr>
-        <w:t xml:space="preserve">Organisation de la DSI</w:t>
+        <w:t xml:space="preserve">Résultats</w:t>
+      </w:r>
+      <w:r>
+        <w:rPr>
+          <w:rFonts w:ascii="Garamond" w:hAnsi="Garamond" w:eastAsia="Garamond" w:cs="Garamond"/>
+          <w:b/>
+          <w:bCs/>
+          <w:sz w:val="28"/>
+          <w:szCs w:val="28"/>
+        </w:rPr>
+        <w:t xml:space="preserve"> attendus</w:t>
+      </w:r>
+      <w:r>
+        <w:rPr>
+          <w:rFonts w:ascii="Garamond" w:hAnsi="Garamond" w:eastAsia="Garamond" w:cs="Garamond"/>
+          <w:b/>
+          <w:bCs/>
+          <w:sz w:val="28"/>
+          <w:szCs w:val="28"/>
+        </w:rPr>
       </w:r>
       <w:r>
         <w:rPr>
@@ -1740,7 +3145,82 @@
           <w:szCs w:val="28"/>
         </w:rPr>
       </w:r>
-      <w:r>
+    </w:p>
+    <w:p>
+      <w:pPr>
+        <w:pBdr/>
+        <w:spacing w:line="360" w:lineRule="auto"/>
+        <w:ind w:firstLine="0" w:left="0"/>
+        <w:jc w:val="both"/>
+        <w:rPr>
+          <w:rFonts w:ascii="Garamond" w:hAnsi="Garamond" w:cs="Garamond"/>
+        </w:rPr>
+      </w:pPr>
+      <w:r>
+        <w:rPr>
+          <w:rFonts w:ascii="Garamond" w:hAnsi="Garamond" w:eastAsia="Garamond" w:cs="Garamond"/>
+        </w:rPr>
+      </w:r>
+      <w:r>
+        <w:rPr>
+          <w:rFonts w:ascii="Garamond" w:hAnsi="Garamond" w:eastAsia="Garamond" w:cs="Garamond"/>
+        </w:rPr>
+        <w:t xml:space="preserve">A l'issue du projet, le système livré devra permettre à chaque acteur de disposer d'une visibilité claire et en temps réel sur les fonds mobilisés et les budgets disponibles, d'un circuit de validation des dépenses formalisé et traçable, d'un historique co</w:t>
+      </w:r>
+      <w:r>
+        <w:rPr>
+          <w:rFonts w:ascii="Garamond" w:hAnsi="Garamond" w:eastAsia="Garamond" w:cs="Garamond"/>
+        </w:rPr>
+        <w:t xml:space="preserve">mplet et immuable de toutes les opérations financières, et de rapports fiables générés automatiquement pour les décideurs et les bailleurs de fonds.</w:t>
+      </w:r>
+      <w:r>
+        <w:rPr>
+          <w:rFonts w:ascii="Garamond" w:hAnsi="Garamond" w:eastAsia="Garamond" w:cs="Garamond"/>
+        </w:rPr>
+      </w:r>
+      <w:r>
+        <w:rPr>
+          <w:rFonts w:ascii="Garamond" w:hAnsi="Garamond" w:cs="Garamond"/>
+        </w:rPr>
+      </w:r>
+    </w:p>
+    <w:p>
+      <w:pPr>
+        <w:pBdr/>
+        <w:spacing w:line="360" w:lineRule="auto"/>
+        <w:ind/>
+        <w:jc w:val="both"/>
+        <w:rPr>
+          <w:rFonts w:ascii="Garamond" w:hAnsi="Garamond" w:cs="Garamond"/>
+        </w:rPr>
+      </w:pPr>
+      <w:r>
+        <w:rPr>
+          <w:rFonts w:ascii="Garamond" w:hAnsi="Garamond" w:eastAsia="Garamond" w:cs="Garamond"/>
+        </w:rPr>
+      </w:r>
+      <w:r>
+        <w:rPr>
+          <w:rFonts w:ascii="Garamond" w:hAnsi="Garamond" w:eastAsia="Garamond" w:cs="Garamond"/>
+        </w:rPr>
+      </w:r>
+      <w:r>
+        <w:rPr>
+          <w:rFonts w:ascii="Garamond" w:hAnsi="Garamond" w:cs="Garamond"/>
+        </w:rPr>
+      </w:r>
+    </w:p>
+    <w:p>
+      <w:pPr>
+        <w:pStyle w:val="935"/>
+        <w:numPr>
+          <w:ilvl w:val="1"/>
+          <w:numId w:val="10"/>
+        </w:numPr>
+        <w:pBdr/>
+        <w:spacing w:line="360" w:lineRule="auto"/>
+        <w:ind/>
+        <w:jc w:val="both"/>
         <w:rPr>
           <w:rFonts w:ascii="Garamond" w:hAnsi="Garamond" w:cs="Garamond"/>
           <w:b/>
@@ -1748,313 +3228,36 @@
           <w:sz w:val="28"/>
           <w:szCs w:val="28"/>
         </w:rPr>
-      </w:r>
-    </w:p>
-    <w:p>
-      <w:pPr>
-        <w:pBdr/>
-        <w:spacing w:line="360" w:lineRule="auto"/>
-        <w:ind/>
-        <w:jc w:val="both"/>
-        <w:rPr>
-          <w:rFonts w:ascii="Garamond" w:hAnsi="Garamond" w:cs="Garamond"/>
-        </w:rPr>
-      </w:pPr>
-      <w:r>
-        <w:rPr>
-          <w:rFonts w:ascii="Garamond" w:hAnsi="Garamond" w:eastAsia="Garamond" w:cs="Garamond"/>
-        </w:rPr>
-        <w:t xml:space="preserve">Pour accomplir ses missions, la DSI est organisée en trois services :</w:t>
-      </w:r>
-      <w:r>
-        <w:rPr>
-          <w:rFonts w:ascii="Garamond" w:hAnsi="Garamond" w:cs="Garamond"/>
-        </w:rPr>
-      </w:r>
-      <w:r>
-        <w:rPr>
-          <w:rFonts w:ascii="Garamond" w:hAnsi="Garamond" w:cs="Garamond"/>
-        </w:rPr>
-      </w:r>
-    </w:p>
-    <w:p>
-      <w:pPr>
-        <w:pStyle w:val="935"/>
-        <w:numPr>
-          <w:ilvl w:val="0"/>
-          <w:numId w:val="8"/>
-        </w:numPr>
-        <w:pBdr/>
-        <w:spacing w:line="360" w:lineRule="auto"/>
-        <w:ind/>
-        <w:jc w:val="both"/>
-        <w:rPr>
-          <w:rFonts w:ascii="Garamond" w:hAnsi="Garamond" w:cs="Garamond"/>
-        </w:rPr>
       </w:pPr>
       <w:r>
         <w:rPr>
           <w:rFonts w:ascii="Garamond" w:hAnsi="Garamond" w:eastAsia="Garamond" w:cs="Garamond"/>
           <w:b/>
           <w:bCs/>
-        </w:rPr>
-        <w:t xml:space="preserve">Le</w:t>
+          <w:sz w:val="28"/>
+          <w:szCs w:val="28"/>
+        </w:rPr>
       </w:r>
       <w:r>
         <w:rPr>
           <w:rFonts w:ascii="Garamond" w:hAnsi="Garamond" w:eastAsia="Garamond" w:cs="Garamond"/>
           <w:b/>
           <w:bCs/>
-        </w:rPr>
-        <w:t xml:space="preserve"> Service Applications et Bases de données </w:t>
-      </w:r>
-      <w:r>
-        <w:rPr>
-          <w:rFonts w:ascii="Garamond" w:hAnsi="Garamond" w:eastAsia="Garamond" w:cs="Garamond"/>
-        </w:rPr>
-        <w:t xml:space="preserve">: Elle est respons</w:t>
-      </w:r>
-      <w:r>
-        <w:rPr>
-          <w:rFonts w:ascii="Garamond" w:hAnsi="Garamond" w:eastAsia="Garamond" w:cs="Garamond"/>
-        </w:rPr>
-        <w:t xml:space="preserve">able du développement et de la gestion des logiciels de l’université. Elle intervient dans la maintenance des applications,la gestion des bases de données et la mise en place des solutions numériques ;c’est au sein de ce service que se déroule notre stage.</w:t>
-      </w:r>
-      <w:r>
-        <w:rPr>
-          <w:rFonts w:ascii="Garamond" w:hAnsi="Garamond" w:cs="Garamond"/>
-        </w:rPr>
-      </w:r>
-      <w:r>
-        <w:rPr>
-          <w:rFonts w:ascii="Garamond" w:hAnsi="Garamond" w:cs="Garamond"/>
-        </w:rPr>
-      </w:r>
-    </w:p>
-    <w:p>
-      <w:pPr>
-        <w:pStyle w:val="935"/>
-        <w:numPr>
-          <w:ilvl w:val="0"/>
-          <w:numId w:val="8"/>
-        </w:numPr>
-        <w:pBdr/>
-        <w:spacing w:line="360" w:lineRule="auto"/>
-        <w:ind/>
-        <w:jc w:val="both"/>
-        <w:rPr>
-          <w:rFonts w:ascii="Garamond" w:hAnsi="Garamond" w:cs="Garamond"/>
-          <w:b/>
-          <w:bCs/>
-        </w:rPr>
-      </w:pPr>
+          <w:sz w:val="28"/>
+          <w:szCs w:val="28"/>
+        </w:rPr>
+        <w:t xml:space="preserve">Acteurs et organisation du projet</w:t>
+      </w:r>
       <w:r>
         <w:rPr>
           <w:rFonts w:ascii="Garamond" w:hAnsi="Garamond" w:eastAsia="Garamond" w:cs="Garamond"/>
           <w:b/>
           <w:bCs/>
-        </w:rPr>
-        <w:t xml:space="preserve">Le</w:t>
-      </w:r>
-      <w:r>
-        <w:rPr>
-          <w:rFonts w:ascii="Garamond" w:hAnsi="Garamond" w:eastAsia="Garamond" w:cs="Garamond"/>
-          <w:b/>
-          <w:bCs/>
-        </w:rPr>
-        <w:t xml:space="preserve"> Service Réseau et Systèmes</w:t>
-      </w:r>
-      <w:r>
-        <w:rPr>
-          <w:rFonts w:ascii="Garamond" w:hAnsi="Garamond" w:eastAsia="Garamond" w:cs="Garamond"/>
-          <w:b w:val="0"/>
-          <w:bCs w:val="0"/>
-        </w:rPr>
-        <w:t xml:space="preserve"> : </w:t>
-      </w:r>
-      <w:r>
-        <w:rPr>
-          <w:rFonts w:ascii="Garamond" w:hAnsi="Garamond" w:eastAsia="Garamond" w:cs="Garamond"/>
-          <w:b w:val="0"/>
-          <w:bCs w:val="0"/>
-        </w:rPr>
-        <w:t xml:space="preserve">Elle assure le bon fonctionnement de l’infrastructure informatique</w:t>
-      </w:r>
-      <w:r>
-        <w:rPr>
-          <w:rFonts w:ascii="Garamond" w:hAnsi="Garamond" w:eastAsia="Garamond" w:cs="Garamond"/>
-          <w:b/>
-          <w:bCs/>
-        </w:rPr>
-        <w:t xml:space="preserve"> : </w:t>
-      </w:r>
-      <w:r>
-        <w:rPr>
-          <w:rFonts w:ascii="Garamond" w:hAnsi="Garamond" w:eastAsia="Garamond" w:cs="Garamond"/>
-          <w:b w:val="0"/>
-          <w:bCs w:val="0"/>
-        </w:rPr>
-        <w:t xml:space="preserve">administration des réseaux et des serveurs,maintenance des équipements et sécurité des systèmes</w:t>
-      </w:r>
-      <w:r>
-        <w:rPr>
-          <w:rFonts w:ascii="Garamond" w:hAnsi="Garamond" w:eastAsia="Garamond" w:cs="Garamond"/>
-          <w:b w:val="0"/>
-          <w:bCs w:val="0"/>
-        </w:rPr>
-        <w:t xml:space="preserve">.</w:t>
-      </w:r>
-      <w:r>
-        <w:rPr>
-          <w:rFonts w:ascii="Garamond" w:hAnsi="Garamond" w:cs="Garamond"/>
-          <w:b/>
-          <w:bCs/>
-        </w:rPr>
-      </w:r>
-      <w:r>
-        <w:rPr>
-          <w:rFonts w:ascii="Garamond" w:hAnsi="Garamond" w:cs="Garamond"/>
-          <w:b/>
-          <w:bCs/>
-        </w:rPr>
-      </w:r>
-    </w:p>
-    <w:p>
-      <w:pPr>
-        <w:pStyle w:val="935"/>
-        <w:numPr>
-          <w:ilvl w:val="0"/>
-          <w:numId w:val="8"/>
-        </w:numPr>
-        <w:pBdr/>
-        <w:spacing w:line="360" w:lineRule="auto"/>
-        <w:ind/>
-        <w:jc w:val="both"/>
-        <w:rPr>
-          <w:rFonts w:ascii="Garamond" w:hAnsi="Garamond" w:cs="Garamond"/>
-          <w:b/>
-          <w:bCs/>
-        </w:rPr>
-      </w:pPr>
-      <w:r>
-        <w:rPr>
-          <w:rFonts w:ascii="Garamond" w:hAnsi="Garamond" w:eastAsia="Garamond" w:cs="Garamond"/>
-          <w:b/>
-          <w:bCs/>
-        </w:rPr>
-      </w:r>
-      <w:r>
-        <w:rPr>
-          <w:rFonts w:ascii="Garamond" w:hAnsi="Garamond" w:eastAsia="Garamond" w:cs="Garamond"/>
-          <w:b/>
-          <w:bCs/>
-          <w:color w:val="000000"/>
-          <w:sz w:val="24"/>
-        </w:rPr>
-        <w:t xml:space="preserve">Le Service Secrétariat</w:t>
-      </w:r>
-      <w:r>
-        <w:rPr>
-          <w:rFonts w:ascii="Garamond" w:hAnsi="Garamond" w:eastAsia="Garamond" w:cs="Garamond"/>
-          <w:color w:val="000000"/>
-          <w:sz w:val="24"/>
-        </w:rPr>
-        <w:t xml:space="preserve"> : </w:t>
-      </w:r>
-      <w:r>
-        <w:rPr>
-          <w:rFonts w:ascii="Garamond" w:hAnsi="Garamond" w:eastAsia="Garamond" w:cs="Garamond"/>
-        </w:rPr>
-        <w:t xml:space="preserve">Elle assure le fonctionnement administratif de la DSI. Il gère le courrier, l'accueil des usagers et le suivi des correspondances officielles, garantissant la fluidité des échanges entre la direction et les autres services de l'université.</w:t>
-      </w:r>
-      <w:r>
-        <w:rPr>
-          <w:rFonts w:ascii="Garamond" w:hAnsi="Garamond" w:cs="Garamond"/>
-          <w:b/>
-          <w:bCs/>
-        </w:rPr>
-      </w:r>
-      <w:r>
-        <w:rPr>
-          <w:rFonts w:ascii="Garamond" w:hAnsi="Garamond" w:cs="Garamond"/>
-          <w:b/>
-          <w:bCs/>
-        </w:rPr>
-      </w:r>
-    </w:p>
-    <w:p>
-      <w:pPr>
-        <w:pBdr/>
-        <w:spacing w:line="360" w:lineRule="auto"/>
-        <w:ind w:firstLine="0" w:left="0"/>
-        <w:jc w:val="both"/>
-        <w:rPr>
-          <w:rFonts w:ascii="Garamond" w:hAnsi="Garamond" w:cs="Garamond"/>
-          <w:b/>
-          <w:bCs/>
-        </w:rPr>
-      </w:pPr>
-      <w:r>
-        <w:rPr>
-          <w:rFonts w:ascii="Garamond" w:hAnsi="Garamond" w:eastAsia="Garamond" w:cs="Garamond"/>
-          <w:b/>
-          <w:bCs/>
-          <w:highlight w:val="none"/>
-        </w:rPr>
-      </w:r>
-      <w:r>
-        <w:rPr>
-          <w:rFonts w:ascii="Garamond" w:hAnsi="Garamond" w:cs="Garamond"/>
-          <w:b/>
-          <w:bCs/>
-        </w:rPr>
-      </w:r>
-      <w:r>
-        <w:rPr>
-          <w:rFonts w:ascii="Garamond" w:hAnsi="Garamond" w:cs="Garamond"/>
-          <w:b/>
-          <w:bCs/>
-        </w:rPr>
-      </w:r>
-    </w:p>
-    <w:p>
-      <w:pPr>
-        <w:pBdr/>
-        <w:spacing w:line="360" w:lineRule="auto"/>
-        <w:ind/>
-        <w:jc w:val="both"/>
-        <w:rPr>
-          <w:rFonts w:ascii="Garamond" w:hAnsi="Garamond" w:cs="Garamond"/>
-        </w:rPr>
-      </w:pPr>
-      <w:r>
-        <w:rPr>
-          <w:rFonts w:ascii="Garamond" w:hAnsi="Garamond" w:eastAsia="Garamond" w:cs="Garamond"/>
-        </w:rPr>
-        <w:t xml:space="preserve">Ces trois services forment un ensemble cohérent qui garantit le bon fonctionnement du système informatique de l’université.</w:t>
-      </w:r>
-      <w:r>
-        <w:rPr>
-          <w:rFonts w:ascii="Garamond" w:hAnsi="Garamond" w:cs="Garamond"/>
-        </w:rPr>
-      </w:r>
-      <w:r>
-        <w:rPr>
-          <w:rFonts w:ascii="Garamond" w:hAnsi="Garamond" w:cs="Garamond"/>
-        </w:rPr>
-      </w:r>
-    </w:p>
-    <w:p>
-      <w:pPr>
-        <w:pStyle w:val="935"/>
-        <w:numPr>
-          <w:ilvl w:val="0"/>
-          <w:numId w:val="10"/>
-        </w:numPr>
-        <w:pBdr/>
-        <w:spacing w:line="360" w:lineRule="auto"/>
-        <w:ind/>
-        <w:jc w:val="both"/>
+          <w:sz w:val="28"/>
+          <w:szCs w:val="28"/>
+        </w:rPr>
+      </w:r>
+      <w:r>
         <w:rPr>
           <w:rFonts w:ascii="Garamond" w:hAnsi="Garamond" w:cs="Garamond"/>
           <w:b/>
@@ -2062,6 +3265,26 @@
           <w:sz w:val="28"/>
           <w:szCs w:val="28"/>
         </w:rPr>
+      </w:r>
+    </w:p>
+    <w:p>
+      <w:pPr>
+        <w:pStyle w:val="935"/>
+        <w:numPr>
+          <w:ilvl w:val="2"/>
+          <w:numId w:val="10"/>
+        </w:numPr>
+        <w:pBdr/>
+        <w:spacing w:line="360" w:lineRule="auto"/>
+        <w:ind/>
+        <w:jc w:val="both"/>
+        <w:rPr>
+          <w:rFonts w:ascii="Garamond" w:hAnsi="Garamond" w:cs="Garamond"/>
+          <w:b/>
+          <w:bCs/>
+          <w:sz w:val="28"/>
+          <w:szCs w:val="28"/>
+        </w:rPr>
       </w:pPr>
       <w:r>
         <w:rPr>
@@ -2071,1240 +3294,11 @@
           <w:sz w:val="28"/>
           <w:szCs w:val="28"/>
         </w:rPr>
-        <w:t xml:space="preserve">Présentation</w:t>
+        <w:t xml:space="preserve">Acteur du projet</w:t>
       </w:r>
       <w:r>
         <w:rPr>
           <w:rFonts w:ascii="Garamond" w:hAnsi="Garamond" w:eastAsia="Garamond" w:cs="Garamond"/>
-          <w:b/>
-          <w:bCs/>
-          <w:sz w:val="28"/>
-          <w:szCs w:val="28"/>
-        </w:rPr>
-        <w:t xml:space="preserve"> du projet</w:t>
-      </w:r>
-      <w:r>
-        <w:rPr>
-          <w:rFonts w:ascii="Garamond" w:hAnsi="Garamond" w:cs="Garamond"/>
-          <w:b/>
-          <w:bCs/>
-          <w:sz w:val="28"/>
-          <w:szCs w:val="28"/>
-        </w:rPr>
-      </w:r>
-      <w:r>
-        <w:rPr>
-          <w:rFonts w:ascii="Garamond" w:hAnsi="Garamond" w:cs="Garamond"/>
-          <w:b/>
-          <w:bCs/>
-          <w:sz w:val="28"/>
-          <w:szCs w:val="28"/>
-        </w:rPr>
-      </w:r>
-    </w:p>
-    <w:p>
-      <w:pPr>
-        <w:pStyle w:val="935"/>
-        <w:numPr>
-          <w:ilvl w:val="1"/>
-          <w:numId w:val="10"/>
-        </w:numPr>
-        <w:pBdr/>
-        <w:spacing w:line="360" w:lineRule="auto"/>
-        <w:ind/>
-        <w:jc w:val="both"/>
-        <w:rPr>
-          <w:rFonts w:ascii="Garamond" w:hAnsi="Garamond" w:cs="Garamond"/>
-          <w:b/>
-          <w:bCs/>
-          <w:sz w:val="28"/>
-          <w:szCs w:val="28"/>
-        </w:rPr>
-      </w:pPr>
-      <w:r>
-        <w:rPr>
-          <w:rFonts w:ascii="Garamond" w:hAnsi="Garamond" w:eastAsia="Garamond" w:cs="Garamond"/>
-          <w:b/>
-          <w:bCs/>
-          <w:sz w:val="28"/>
-          <w:szCs w:val="28"/>
-        </w:rPr>
-        <w:t xml:space="preserve">Contexte</w:t>
-      </w:r>
-      <w:r>
-        <w:rPr>
-          <w:rFonts w:ascii="Garamond" w:hAnsi="Garamond" w:cs="Garamond"/>
-          <w:b/>
-          <w:bCs/>
-          <w:sz w:val="28"/>
-          <w:szCs w:val="28"/>
-        </w:rPr>
-      </w:r>
-      <w:r>
-        <w:rPr>
-          <w:rFonts w:ascii="Garamond" w:hAnsi="Garamond" w:cs="Garamond"/>
-          <w:b/>
-          <w:bCs/>
-          <w:sz w:val="28"/>
-          <w:szCs w:val="28"/>
-        </w:rPr>
-      </w:r>
-    </w:p>
-    <w:p>
-      <w:pPr>
-        <w:pBdr/>
-        <w:spacing w:line="360" w:lineRule="auto"/>
-        <w:ind/>
-        <w:jc w:val="both"/>
-        <w:rPr>
-          <w:rFonts w:ascii="Garamond" w:hAnsi="Garamond" w:cs="Garamond"/>
-        </w:rPr>
-      </w:pPr>
-      <w:r>
-        <w:rPr>
-          <w:rFonts w:ascii="Garamond" w:hAnsi="Garamond" w:eastAsia="Garamond" w:cs="Garamond"/>
-        </w:rPr>
-        <w:t xml:space="preserve">Dans le cadre de ses activités de recherche, l’</w:t>
-      </w:r>
-      <w:r>
-        <w:rPr>
-          <w:rStyle w:val="941"/>
-          <w:rFonts w:ascii="Garamond" w:hAnsi="Garamond" w:eastAsia="Garamond" w:cs="Garamond" w:eastAsiaTheme="majorEastAsia"/>
-        </w:rPr>
-        <w:t xml:space="preserve">Université Joseph KI-ZERBO</w:t>
-      </w:r>
-      <w:r>
-        <w:rPr>
-          <w:rFonts w:ascii="Garamond" w:hAnsi="Garamond" w:eastAsia="Garamond" w:cs="Garamond"/>
-        </w:rPr>
-        <w:t xml:space="preserve"> collabore avec divers partena</w:t>
-      </w:r>
-      <w:r>
-        <w:rPr>
-          <w:rFonts w:ascii="Garamond" w:hAnsi="Garamond" w:eastAsia="Garamond" w:cs="Garamond"/>
-        </w:rPr>
-        <w:t xml:space="preserve">ires techniques et financiers afin de soutenir ces projets. Ces projets nécessitent des ressources financières importantes, généralement obtenues auprès de ces partenaires sous forme de financements </w:t>
-      </w:r>
-      <w:r>
-        <w:rPr>
-          <w:rFonts w:ascii="Garamond" w:hAnsi="Garamond" w:eastAsia="Garamond" w:cs="Garamond"/>
-        </w:rPr>
-        <w:t xml:space="preserve">formalisé </w:t>
-      </w:r>
-      <w:r>
-        <w:rPr>
-          <w:rFonts w:ascii="Garamond" w:hAnsi="Garamond" w:eastAsia="Garamond" w:cs="Garamond"/>
-        </w:rPr>
-        <w:t xml:space="preserve">par des </w:t>
-      </w:r>
-      <w:r>
-        <w:rPr>
-          <w:rFonts w:ascii="Garamond" w:hAnsi="Garamond" w:eastAsia="Garamond" w:cs="Garamond"/>
-          <w:b/>
-          <w:bCs/>
-        </w:rPr>
-        <w:t xml:space="preserve">conventions</w:t>
-      </w:r>
-      <w:r>
-        <w:rPr>
-          <w:rFonts w:ascii="Garamond" w:hAnsi="Garamond" w:eastAsia="Garamond" w:cs="Garamond"/>
-        </w:rPr>
-        <w:t xml:space="preserve">.</w:t>
-      </w:r>
-      <w:r>
-        <w:rPr>
-          <w:rFonts w:ascii="Garamond" w:hAnsi="Garamond" w:cs="Garamond"/>
-        </w:rPr>
-      </w:r>
-      <w:r>
-        <w:rPr>
-          <w:rFonts w:ascii="Garamond" w:hAnsi="Garamond" w:cs="Garamond"/>
-        </w:rPr>
-      </w:r>
-    </w:p>
-    <w:p>
-      <w:pPr>
-        <w:pBdr/>
-        <w:spacing w:line="360" w:lineRule="auto"/>
-        <w:ind/>
-        <w:jc w:val="both"/>
-        <w:rPr>
-          <w:rFonts w:ascii="Garamond" w:hAnsi="Garamond" w:cs="Garamond"/>
-        </w:rPr>
-      </w:pPr>
-      <w:r>
-        <w:rPr>
-          <w:rFonts w:ascii="Garamond" w:hAnsi="Garamond" w:eastAsia="Garamond" w:cs="Garamond"/>
-        </w:rPr>
-      </w:r>
-      <w:r>
-        <w:rPr>
-          <w:rFonts w:ascii="Garamond" w:hAnsi="Garamond" w:eastAsia="Garamond" w:cs="Garamond"/>
-          <w14:ligatures w14:val="none"/>
-        </w:rPr>
-        <w:t xml:space="preserve">Une fois ces conventions signées, plusieurs opérations doivent être assurées, notamment la </w:t>
-      </w:r>
-      <w:r>
-        <w:rPr>
-          <w:rFonts w:ascii="Garamond" w:hAnsi="Garamond" w:eastAsia="Garamond" w:cs="Garamond"/>
-          <w:b/>
-          <w:bCs/>
-          <w14:ligatures w14:val="none"/>
-        </w:rPr>
-        <w:t xml:space="preserve">réception des fonds</w:t>
-      </w:r>
-      <w:r>
-        <w:rPr>
-          <w:rFonts w:ascii="Garamond" w:hAnsi="Garamond" w:eastAsia="Garamond" w:cs="Garamond"/>
-          <w14:ligatures w14:val="none"/>
-        </w:rPr>
-        <w:t xml:space="preserve">, leur </w:t>
-      </w:r>
-      <w:r>
-        <w:rPr>
-          <w:rFonts w:ascii="Garamond" w:hAnsi="Garamond" w:eastAsia="Garamond" w:cs="Garamond"/>
-          <w:b/>
-          <w:bCs/>
-          <w14:ligatures w14:val="none"/>
-        </w:rPr>
-        <w:t xml:space="preserve">répartition en rubriques budgétaires</w:t>
-      </w:r>
-      <w:r>
-        <w:rPr>
-          <w:rFonts w:ascii="Garamond" w:hAnsi="Garamond" w:eastAsia="Garamond" w:cs="Garamond"/>
-          <w14:ligatures w14:val="none"/>
-        </w:rPr>
-        <w:t xml:space="preserve"> et </w:t>
-      </w:r>
-      <w:r>
-        <w:rPr>
-          <w:rFonts w:ascii="Garamond" w:hAnsi="Garamond" w:eastAsia="Garamond" w:cs="Garamond"/>
-          <w:b/>
-          <w:bCs/>
-          <w14:ligatures w14:val="none"/>
-        </w:rPr>
-        <w:t xml:space="preserve">le suivi d</w:t>
-      </w:r>
-      <w:r>
-        <w:rPr>
-          <w:rFonts w:ascii="Garamond" w:hAnsi="Garamond" w:eastAsia="Garamond" w:cs="Garamond"/>
-          <w:b/>
-          <w:bCs/>
-          <w14:ligatures w14:val="none"/>
-        </w:rPr>
-        <w:t xml:space="preserve">e leur utilisation</w:t>
-      </w:r>
-      <w:r>
-        <w:rPr>
-          <w:rFonts w:ascii="Garamond" w:hAnsi="Garamond" w:eastAsia="Garamond" w:cs="Garamond"/>
-          <w14:ligatures w14:val="none"/>
-        </w:rPr>
-        <w:t xml:space="preserve"> dans le cadre de l’exécution des activités prévues. </w:t>
-      </w:r>
-      <w:r>
-        <w:rPr>
-          <w:rFonts w:ascii="Garamond" w:hAnsi="Garamond" w:cs="Garamond"/>
-        </w:rPr>
-      </w:r>
-      <w:r>
-        <w:rPr>
-          <w:rFonts w:ascii="Garamond" w:hAnsi="Garamond" w:cs="Garamond"/>
-        </w:rPr>
-      </w:r>
-    </w:p>
-    <w:p>
-      <w:pPr>
-        <w:pBdr/>
-        <w:spacing w:line="360" w:lineRule="auto"/>
-        <w:ind/>
-        <w:jc w:val="both"/>
-        <w:rPr>
-          <w:rFonts w:ascii="Garamond" w:hAnsi="Garamond" w:cs="Garamond"/>
-          <w14:ligatures w14:val="none"/>
-        </w:rPr>
-      </w:pPr>
-      <w:r>
-        <w:rPr>
-          <w:rFonts w:ascii="Garamond" w:hAnsi="Garamond" w:eastAsia="Garamond" w:cs="Garamond"/>
-          <w14:ligatures w14:val="none"/>
-        </w:rPr>
-        <w:t xml:space="preserve">C’est dans une logique de modernisation et d’amélioration de ce processus que la DSI s’est engagée dans la mise en place du </w:t>
-      </w:r>
-      <w:r>
-        <w:rPr>
-          <w:rFonts w:ascii="Garamond" w:hAnsi="Garamond" w:eastAsia="Garamond" w:cs="Garamond"/>
-          <w:b/>
-          <w:bCs/>
-          <w14:ligatures w14:val="none"/>
-        </w:rPr>
-        <w:t xml:space="preserve">Circuit Intégré des Financements Extérieurs Universitaires </w:t>
-      </w:r>
-      <w:r>
-        <w:rPr>
-          <w:rFonts w:ascii="Garamond" w:hAnsi="Garamond" w:eastAsia="Garamond" w:cs="Garamond"/>
-          <w14:ligatures w14:val="none"/>
-        </w:rPr>
-        <w:t xml:space="preserve">(CIFEU</w:t>
-      </w:r>
-      <w:r>
-        <w:rPr>
-          <w:rFonts w:ascii="Garamond" w:hAnsi="Garamond" w:eastAsia="Garamond" w:cs="Garamond"/>
-          <w14:ligatures w14:val="none"/>
-        </w:rPr>
-        <w:t xml:space="preserve">),un système d’information destiné à digitaliser la gestion de ces financements.</w:t>
-      </w:r>
-      <w:r>
-        <w:rPr>
-          <w:rFonts w:ascii="Garamond" w:hAnsi="Garamond" w:eastAsia="Garamond" w:cs="Garamond"/>
-          <w14:ligatures w14:val="none"/>
-        </w:rPr>
-        <w:t xml:space="preserve">Le présent stage s’inscrit directement dans ce projet, c’est a dire la conception et le développement d’un module dédié </w:t>
-      </w:r>
-      <w:r>
-        <w:rPr>
-          <w:rFonts w:ascii="Garamond" w:hAnsi="Garamond" w:eastAsia="Garamond" w:cs="Garamond"/>
-          <w14:ligatures w14:val="none"/>
-        </w:rPr>
-        <w:t xml:space="preserve"> au  suivi de la mobilisation des ressources</w:t>
-      </w:r>
-      <w:r>
-        <w:rPr>
-          <w:rFonts w:ascii="Garamond" w:hAnsi="Garamond" w:eastAsia="Garamond" w:cs="Garamond"/>
-          <w14:ligatures w14:val="none"/>
-        </w:rPr>
-        <w:t xml:space="preserve">, a la gestion budgétaire et au contrôle d’exécution des dépenses qui devrait s’intégrer au système de gestion des projet et des conventions déjà présentes.</w:t>
-      </w:r>
-      <w:r>
-        <w:rPr>
-          <w:rFonts w:ascii="Garamond" w:hAnsi="Garamond" w:cs="Garamond"/>
-          <w14:ligatures w14:val="none"/>
-        </w:rPr>
-      </w:r>
-      <w:r>
-        <w:rPr>
-          <w:rFonts w:ascii="Garamond" w:hAnsi="Garamond" w:cs="Garamond"/>
-          <w14:ligatures w14:val="none"/>
-        </w:rPr>
-      </w:r>
-    </w:p>
-    <w:p>
-      <w:pPr>
-        <w:pStyle w:val="935"/>
-        <w:numPr>
-          <w:ilvl w:val="1"/>
-          <w:numId w:val="10"/>
-        </w:numPr>
-        <w:pBdr/>
-        <w:spacing w:line="360" w:lineRule="auto"/>
-        <w:ind/>
-        <w:jc w:val="both"/>
-        <w:rPr>
-          <w:rFonts w:ascii="Garamond" w:hAnsi="Garamond" w:cs="Garamond"/>
-          <w:b/>
-          <w:bCs/>
-          <w:sz w:val="28"/>
-          <w:szCs w:val="28"/>
-        </w:rPr>
-      </w:pPr>
-      <w:r>
-        <w:rPr>
-          <w:rFonts w:ascii="Garamond" w:hAnsi="Garamond" w:eastAsia="Garamond" w:cs="Garamond"/>
-          <w:b/>
-          <w:bCs/>
-          <w:sz w:val="28"/>
-          <w:szCs w:val="28"/>
-        </w:rPr>
-        <w:t xml:space="preserve">Problématique</w:t>
-      </w:r>
-      <w:r>
-        <w:rPr>
-          <w:rFonts w:ascii="Garamond" w:hAnsi="Garamond" w:cs="Garamond"/>
-          <w:b/>
-          <w:bCs/>
-          <w:sz w:val="28"/>
-          <w:szCs w:val="28"/>
-        </w:rPr>
-      </w:r>
-      <w:r>
-        <w:rPr>
-          <w:rFonts w:ascii="Garamond" w:hAnsi="Garamond" w:cs="Garamond"/>
-          <w:b/>
-          <w:bCs/>
-          <w:sz w:val="28"/>
-          <w:szCs w:val="28"/>
-        </w:rPr>
-      </w:r>
-    </w:p>
-    <w:p>
-      <w:pPr>
-        <w:pBdr/>
-        <w:spacing w:line="360" w:lineRule="auto"/>
-        <w:ind/>
-        <w:jc w:val="both"/>
-        <w:rPr>
-          <w:rFonts w:ascii="Garamond" w:hAnsi="Garamond" w:cs="Garamond"/>
-        </w:rPr>
-      </w:pPr>
-      <w:r>
-        <w:rPr>
-          <w:rFonts w:ascii="Garamond" w:hAnsi="Garamond" w:eastAsia="Garamond" w:cs="Garamond"/>
-        </w:rPr>
-        <w:t xml:space="preserve">Malgré l’existence de mécanismes de financement des projets au sein de l’</w:t>
-      </w:r>
-      <w:r>
-        <w:rPr>
-          <w:rFonts w:ascii="Garamond" w:hAnsi="Garamond" w:eastAsia="Garamond" w:cs="Garamond"/>
-        </w:rPr>
-        <w:t xml:space="preserve">UJKZ, la gestion opérationnelle des ressources financières issues des partenaires extérieurs demeure complexe .</w:t>
-      </w:r>
-      <w:r>
-        <w:rPr>
-          <w:rFonts w:ascii="Garamond" w:hAnsi="Garamond" w:eastAsia="Garamond" w:cs="Garamond"/>
-        </w:rPr>
-        <w:t xml:space="preserve">En effet </w:t>
-      </w:r>
-      <w:r>
-        <w:rPr>
-          <w:rFonts w:ascii="Garamond" w:hAnsi="Garamond" w:eastAsia="Garamond" w:cs="Garamond"/>
-        </w:rPr>
-        <w:t xml:space="preserve">les versements des </w:t>
-      </w:r>
-      <w:r>
-        <w:rPr>
-          <w:rFonts w:ascii="Garamond" w:hAnsi="Garamond" w:eastAsia="Garamond" w:cs="Garamond"/>
-          <w:b/>
-          <w:bCs/>
-        </w:rPr>
-        <w:t xml:space="preserve">bailleurs de fonds </w:t>
-      </w:r>
-      <w:r>
-        <w:rPr>
-          <w:rFonts w:ascii="Garamond" w:hAnsi="Garamond" w:eastAsia="Garamond" w:cs="Garamond"/>
-        </w:rPr>
-        <w:t xml:space="preserve">(partenaires financiers) ne suivent pas toujours un calendrier régulier et peuvent prendre des formes variées, ce qui complique le suivi des fonds réellement disponibles à un moment donné. À cela s'ajoute la nécessité de gérer les budgets par rubr</w:t>
-      </w:r>
-      <w:r>
-        <w:rPr>
-          <w:rFonts w:ascii="Garamond" w:hAnsi="Garamond" w:eastAsia="Garamond" w:cs="Garamond"/>
-        </w:rPr>
-        <w:t xml:space="preserve">iques, telles que définies dans les conventions, avec une vigilance constante pour éviter tout dépassement.</w:t>
-      </w:r>
-      <w:r>
-        <w:rPr>
-          <w:rFonts w:ascii="Garamond" w:hAnsi="Garamond" w:cs="Garamond"/>
-        </w:rPr>
-      </w:r>
-      <w:r>
-        <w:rPr>
-          <w:rFonts w:ascii="Garamond" w:hAnsi="Garamond" w:cs="Garamond"/>
-        </w:rPr>
-      </w:r>
-    </w:p>
-    <w:p>
-      <w:pPr>
-        <w:pStyle w:val="940"/>
-        <w:pBdr/>
-        <w:spacing w:line="360" w:lineRule="auto"/>
-        <w:ind/>
-        <w:jc w:val="both"/>
-        <w:rPr>
-          <w:rFonts w:ascii="Garamond" w:hAnsi="Garamond" w:cs="Garamond"/>
-        </w:rPr>
-      </w:pPr>
-      <w:r>
-        <w:rPr>
-          <w:rFonts w:ascii="Garamond" w:hAnsi="Garamond" w:eastAsia="Garamond" w:cs="Garamond"/>
-        </w:rPr>
-        <w:t xml:space="preserve">Le processus d'exécution des dépenses implique également plusieurs acteurs aux rôles distincts : le  </w:t>
-      </w:r>
-      <w:r>
-        <w:rPr>
-          <w:rFonts w:ascii="Garamond" w:hAnsi="Garamond" w:eastAsia="Garamond" w:cs="Garamond"/>
-          <w:b/>
-          <w:bCs/>
-        </w:rPr>
-        <w:t xml:space="preserve">porteur de projets </w:t>
-      </w:r>
-      <w:r>
-        <w:rPr>
-          <w:rFonts w:ascii="Garamond" w:hAnsi="Garamond" w:eastAsia="Garamond" w:cs="Garamond"/>
-        </w:rPr>
-        <w:t xml:space="preserve">(personne qui prend charger de l’exécution du projet), la </w:t>
-      </w:r>
-      <w:r>
-        <w:rPr>
-          <w:rFonts w:ascii="Garamond" w:hAnsi="Garamond" w:eastAsia="Garamond" w:cs="Garamond"/>
-          <w:b/>
-          <w:bCs/>
-        </w:rPr>
-        <w:t xml:space="preserve">Direction de l'Administration et des Finances </w:t>
-      </w:r>
-      <w:r>
-        <w:rPr>
-          <w:rFonts w:ascii="Garamond" w:hAnsi="Garamond" w:eastAsia="Garamond" w:cs="Garamond"/>
-        </w:rPr>
-        <w:t xml:space="preserve">(DAF) et l'</w:t>
-      </w:r>
-      <w:r>
-        <w:rPr>
-          <w:rFonts w:ascii="Garamond" w:hAnsi="Garamond" w:eastAsia="Garamond" w:cs="Garamond"/>
-          <w:b/>
-          <w:bCs/>
-        </w:rPr>
-        <w:t xml:space="preserve">Agent Comptable </w:t>
-      </w:r>
-      <w:r>
-        <w:rPr>
-          <w:rFonts w:ascii="Garamond" w:hAnsi="Garamond" w:eastAsia="Garamond" w:cs="Garamond"/>
-        </w:rPr>
-        <w:t xml:space="preserve">(AC),</w:t>
-      </w:r>
-      <w:r>
-        <w:rPr>
-          <w:rFonts w:ascii="Garamond" w:hAnsi="Garamond" w:eastAsia="Garamond" w:cs="Garamond"/>
-        </w:rPr>
-        <w:t xml:space="preserve"> chacun intervenant à un stade précis selon des procédures spécifiques. En l'absence d'un système intégré, cette multiplicité d'intervenants nuit à la traçabilité des opérations et rend le suivi en temps réel des budgets très difficile.</w:t>
-      </w:r>
-      <w:r>
-        <w:rPr>
-          <w:rFonts w:ascii="Garamond" w:hAnsi="Garamond" w:cs="Garamond"/>
-        </w:rPr>
-      </w:r>
-      <w:r>
-        <w:rPr>
-          <w:rFonts w:ascii="Garamond" w:hAnsi="Garamond" w:cs="Garamond"/>
-        </w:rPr>
-      </w:r>
-    </w:p>
-    <w:p>
-      <w:pPr>
-        <w:pStyle w:val="940"/>
-        <w:pBdr/>
-        <w:spacing w:line="360" w:lineRule="auto"/>
-        <w:ind/>
-        <w:jc w:val="both"/>
-        <w:rPr>
-          <w:rFonts w:ascii="Garamond" w:hAnsi="Garamond" w:cs="Garamond"/>
-          <w:highlight w:val="none"/>
-        </w:rPr>
-      </w:pPr>
-      <w:r>
-        <w:rPr>
-          <w:rFonts w:ascii="Garamond" w:hAnsi="Garamond" w:eastAsia="Garamond" w:cs="Garamond"/>
-        </w:rPr>
-      </w:r>
-      <w:r>
-        <w:rPr>
-          <w:rFonts w:ascii="Garamond" w:hAnsi="Garamond" w:eastAsia="Garamond" w:cs="Garamond"/>
-        </w:rPr>
-        <w:t xml:space="preserve">La question centrale qui se pose est donc la suivante : </w:t>
-      </w:r>
-      <w:r>
-        <w:rPr>
-          <w:rFonts w:ascii="Garamond" w:hAnsi="Garamond" w:eastAsia="Garamond" w:cs="Garamond"/>
-          <w:b/>
-          <w:bCs/>
-        </w:rPr>
-        <w:t xml:space="preserve">c</w:t>
-      </w:r>
-      <w:r>
-        <w:rPr>
-          <w:rFonts w:ascii="Garamond" w:hAnsi="Garamond" w:eastAsia="Garamond" w:cs="Garamond"/>
-          <w:b/>
-          <w:bCs/>
-        </w:rPr>
-        <w:t xml:space="preserve">omment concevoir un système permettant d'assurer un suivi efficace de la mobilisation des ressources extérieures, une gestion rigoureuse des budgets par rubriques et un contrôle fiable de l'exécution </w:t>
-      </w:r>
-      <w:r>
-        <w:rPr>
-          <w:rFonts w:ascii="Garamond" w:hAnsi="Garamond" w:eastAsia="Garamond" w:cs="Garamond"/>
-          <w:b/>
-          <w:bCs/>
-        </w:rPr>
-        <w:t xml:space="preserve">des dépenses, dans le respect des procédures établies</w:t>
-      </w:r>
-      <w:r>
-        <w:rPr>
-          <w:rFonts w:ascii="Garamond" w:hAnsi="Garamond" w:eastAsia="Garamond" w:cs="Garamond"/>
-        </w:rPr>
-        <w:t xml:space="preserve"> ?</w:t>
-      </w:r>
-      <w:r>
-        <w:rPr>
-          <w:rFonts w:ascii="Garamond" w:hAnsi="Garamond" w:cs="Garamond"/>
-          <w:highlight w:val="none"/>
-        </w:rPr>
-      </w:r>
-      <w:r>
-        <w:rPr>
-          <w:rFonts w:ascii="Garamond" w:hAnsi="Garamond" w:cs="Garamond"/>
-          <w:highlight w:val="none"/>
-        </w:rPr>
-      </w:r>
-    </w:p>
-    <w:p>
-      <w:pPr>
-        <w:pStyle w:val="935"/>
-        <w:numPr>
-          <w:ilvl w:val="1"/>
-          <w:numId w:val="10"/>
-        </w:numPr>
-        <w:pBdr/>
-        <w:spacing w:line="360" w:lineRule="auto"/>
-        <w:ind/>
-        <w:jc w:val="both"/>
-        <w:rPr>
-          <w:rFonts w:ascii="Garamond" w:hAnsi="Garamond" w:cs="Garamond"/>
-          <w:b/>
-          <w:bCs/>
-          <w:sz w:val="28"/>
-          <w:szCs w:val="28"/>
-        </w:rPr>
-      </w:pPr>
-      <w:r>
-        <w:rPr>
-          <w:rFonts w:ascii="Garamond" w:hAnsi="Garamond" w:eastAsia="Garamond" w:cs="Garamond"/>
-          <w:b/>
-          <w:bCs/>
-          <w:sz w:val="28"/>
-          <w:szCs w:val="28"/>
-        </w:rPr>
-        <w:t xml:space="preserve">Objectifs de l’étude</w:t>
-      </w:r>
-      <w:r>
-        <w:rPr>
-          <w:rFonts w:ascii="Garamond" w:hAnsi="Garamond" w:cs="Garamond"/>
-          <w:b/>
-          <w:bCs/>
-          <w:sz w:val="28"/>
-          <w:szCs w:val="28"/>
-        </w:rPr>
-      </w:r>
-      <w:r>
-        <w:rPr>
-          <w:rFonts w:ascii="Garamond" w:hAnsi="Garamond" w:cs="Garamond"/>
-          <w:b/>
-          <w:bCs/>
-          <w:sz w:val="28"/>
-          <w:szCs w:val="28"/>
-        </w:rPr>
-      </w:r>
-    </w:p>
-    <w:p>
-      <w:pPr>
-        <w:pBdr/>
-        <w:spacing w:line="360" w:lineRule="auto"/>
-        <w:ind/>
-        <w:jc w:val="both"/>
-        <w:rPr>
-          <w:rFonts w:ascii="Garamond" w:hAnsi="Garamond" w:cs="Garamond"/>
-        </w:rPr>
-      </w:pPr>
-      <w:r>
-        <w:rPr>
-          <w:rFonts w:ascii="Garamond" w:hAnsi="Garamond" w:eastAsia="Garamond" w:cs="Garamond"/>
-        </w:rPr>
-        <w:t xml:space="preserve">L’objectif de cette étude est </w:t>
-      </w:r>
-      <w:r>
-        <w:rPr>
-          <w:rFonts w:ascii="Garamond" w:hAnsi="Garamond" w:eastAsia="Garamond" w:cs="Garamond"/>
-        </w:rPr>
-        <w:t xml:space="preserve">de concevoir et de proposer une solution informatique permettant d’améliorer la gestion des financements extérieurs au sein de l’université, en assurant le suivi des ressources mobilisées, la gestion des budgets et le contrôle de l’exécution des dépenses. </w:t>
-      </w:r>
-      <w:r>
-        <w:rPr>
-          <w:rFonts w:ascii="Garamond" w:hAnsi="Garamond" w:cs="Garamond"/>
-        </w:rPr>
-      </w:r>
-      <w:r>
-        <w:rPr>
-          <w:rFonts w:ascii="Garamond" w:hAnsi="Garamond" w:cs="Garamond"/>
-        </w:rPr>
-      </w:r>
-    </w:p>
-    <w:p>
-      <w:pPr>
-        <w:pBdr/>
-        <w:spacing w:line="360" w:lineRule="auto"/>
-        <w:ind/>
-        <w:jc w:val="both"/>
-        <w:rPr>
-          <w:rFonts w:ascii="Garamond" w:hAnsi="Garamond" w:cs="Garamond"/>
-        </w:rPr>
-      </w:pPr>
-      <w:r>
-        <w:rPr>
-          <w:rFonts w:ascii="Garamond" w:hAnsi="Garamond" w:eastAsia="Garamond" w:cs="Garamond"/>
-        </w:rPr>
-        <w:t xml:space="preserve">De </w:t>
-      </w:r>
-      <w:r>
-        <w:rPr>
-          <w:rFonts w:ascii="Garamond" w:hAnsi="Garamond" w:eastAsia="Garamond" w:cs="Garamond"/>
-        </w:rPr>
-        <w:t xml:space="preserve">façon</w:t>
-      </w:r>
-      <w:r>
-        <w:rPr>
-          <w:rFonts w:ascii="Garamond" w:hAnsi="Garamond" w:eastAsia="Garamond" w:cs="Garamond"/>
-        </w:rPr>
-        <w:t xml:space="preserve"> plus </w:t>
-      </w:r>
-      <w:r>
-        <w:rPr>
-          <w:rFonts w:ascii="Garamond" w:hAnsi="Garamond" w:eastAsia="Garamond" w:cs="Garamond"/>
-        </w:rPr>
-        <w:t xml:space="preserve">spécifique</w:t>
-      </w:r>
-      <w:r>
-        <w:rPr>
-          <w:rFonts w:ascii="Garamond" w:hAnsi="Garamond" w:eastAsia="Garamond" w:cs="Garamond"/>
-        </w:rPr>
-        <w:t xml:space="preserve">, il s’agit de </w:t>
-      </w:r>
-      <w:r>
-        <w:rPr>
-          <w:rFonts w:ascii="Garamond" w:hAnsi="Garamond" w:eastAsia="Garamond" w:cs="Garamond"/>
-        </w:rPr>
-        <w:t xml:space="preserve">:</w:t>
-      </w:r>
-      <w:r>
-        <w:rPr>
-          <w:rFonts w:ascii="Garamond" w:hAnsi="Garamond" w:eastAsia="Garamond" w:cs="Garamond"/>
-        </w:rPr>
-        <w:t xml:space="preserve"> </w:t>
-      </w:r>
-      <w:r>
-        <w:rPr>
-          <w:rFonts w:ascii="Garamond" w:hAnsi="Garamond" w:cs="Garamond"/>
-        </w:rPr>
-      </w:r>
-      <w:r>
-        <w:rPr>
-          <w:rFonts w:ascii="Garamond" w:hAnsi="Garamond" w:cs="Garamond"/>
-        </w:rPr>
-      </w:r>
-    </w:p>
-    <w:p>
-      <w:pPr>
-        <w:pStyle w:val="935"/>
-        <w:numPr>
-          <w:ilvl w:val="0"/>
-          <w:numId w:val="8"/>
-        </w:numPr>
-        <w:pBdr/>
-        <w:spacing w:line="360" w:lineRule="auto"/>
-        <w:ind/>
-        <w:jc w:val="both"/>
-        <w:rPr>
-          <w:rFonts w:ascii="Garamond" w:hAnsi="Garamond" w:cs="Garamond"/>
-        </w:rPr>
-      </w:pPr>
-      <w:r>
-        <w:rPr>
-          <w:rFonts w:ascii="Garamond" w:hAnsi="Garamond" w:eastAsia="Garamond" w:cs="Garamond"/>
-        </w:rPr>
-        <w:t xml:space="preserve">Mettre en place un mécanisme de suivi</w:t>
-      </w:r>
-      <w:r>
-        <w:rPr>
-          <w:rFonts w:ascii="Garamond" w:hAnsi="Garamond" w:eastAsia="Garamond" w:cs="Garamond"/>
-        </w:rPr>
-        <w:t xml:space="preserve"> et d’enregistrement</w:t>
-      </w:r>
-      <w:r>
-        <w:rPr>
-          <w:rFonts w:ascii="Garamond" w:hAnsi="Garamond" w:eastAsia="Garamond" w:cs="Garamond"/>
-        </w:rPr>
-        <w:t xml:space="preserve"> des ressources financières mobilisées auprès des bailleurs </w:t>
-      </w:r>
-      <w:r>
-        <w:rPr>
-          <w:rFonts w:ascii="Garamond" w:hAnsi="Garamond" w:eastAsia="Garamond" w:cs="Garamond"/>
-        </w:rPr>
-        <w:t xml:space="preserve">;</w:t>
-      </w:r>
-      <w:r>
-        <w:rPr>
-          <w:rFonts w:ascii="Garamond" w:hAnsi="Garamond" w:cs="Garamond"/>
-        </w:rPr>
-      </w:r>
-      <w:r>
-        <w:rPr>
-          <w:rFonts w:ascii="Garamond" w:hAnsi="Garamond" w:cs="Garamond"/>
-        </w:rPr>
-      </w:r>
-    </w:p>
-    <w:p>
-      <w:pPr>
-        <w:pStyle w:val="935"/>
-        <w:numPr>
-          <w:ilvl w:val="0"/>
-          <w:numId w:val="8"/>
-        </w:numPr>
-        <w:pBdr/>
-        <w:spacing w:line="360" w:lineRule="auto"/>
-        <w:ind/>
-        <w:jc w:val="both"/>
-        <w:rPr>
-          <w:rFonts w:ascii="Garamond" w:hAnsi="Garamond" w:cs="Garamond"/>
-        </w:rPr>
-      </w:pPr>
-      <w:r>
-        <w:rPr>
-          <w:rFonts w:ascii="Garamond" w:hAnsi="Garamond" w:eastAsia="Garamond" w:cs="Garamond"/>
-        </w:rPr>
-        <w:t xml:space="preserve">Assurer une gestion structurée des budgets par rubriques conformément aux conventions </w:t>
-      </w:r>
-      <w:r>
-        <w:rPr>
-          <w:rFonts w:ascii="Garamond" w:hAnsi="Garamond" w:cs="Garamond"/>
-        </w:rPr>
-      </w:r>
-      <w:r>
-        <w:rPr>
-          <w:rFonts w:ascii="Garamond" w:hAnsi="Garamond" w:cs="Garamond"/>
-        </w:rPr>
-      </w:r>
-    </w:p>
-    <w:p>
-      <w:pPr>
-        <w:pStyle w:val="935"/>
-        <w:numPr>
-          <w:ilvl w:val="0"/>
-          <w:numId w:val="8"/>
-        </w:numPr>
-        <w:pBdr/>
-        <w:spacing w:line="360" w:lineRule="auto"/>
-        <w:ind/>
-        <w:jc w:val="both"/>
-        <w:rPr>
-          <w:rFonts w:ascii="Garamond" w:hAnsi="Garamond" w:cs="Garamond"/>
-        </w:rPr>
-      </w:pPr>
-      <w:r>
-        <w:rPr>
-          <w:rFonts w:ascii="Garamond" w:hAnsi="Garamond" w:eastAsia="Garamond" w:cs="Garamond"/>
-        </w:rPr>
-        <w:t xml:space="preserve">Permettre le suivi des dépenses en lien avec les activités des projets </w:t>
-      </w:r>
-      <w:r>
-        <w:rPr>
-          <w:rFonts w:ascii="Garamond" w:hAnsi="Garamond" w:eastAsia="Garamond" w:cs="Garamond"/>
-        </w:rPr>
-        <w:t xml:space="preserve">;</w:t>
-      </w:r>
-      <w:r>
-        <w:rPr>
-          <w:rFonts w:ascii="Garamond" w:hAnsi="Garamond" w:cs="Garamond"/>
-        </w:rPr>
-      </w:r>
-      <w:r>
-        <w:rPr>
-          <w:rFonts w:ascii="Garamond" w:hAnsi="Garamond" w:cs="Garamond"/>
-        </w:rPr>
-      </w:r>
-    </w:p>
-    <w:p>
-      <w:pPr>
-        <w:pStyle w:val="935"/>
-        <w:numPr>
-          <w:ilvl w:val="0"/>
-          <w:numId w:val="8"/>
-        </w:numPr>
-        <w:pBdr/>
-        <w:spacing w:line="360" w:lineRule="auto"/>
-        <w:ind/>
-        <w:jc w:val="both"/>
-        <w:rPr>
-          <w:rFonts w:ascii="Garamond" w:hAnsi="Garamond" w:cs="Garamond"/>
-        </w:rPr>
-      </w:pPr>
-      <w:r>
-        <w:rPr>
-          <w:rFonts w:ascii="Garamond" w:hAnsi="Garamond" w:eastAsia="Garamond" w:cs="Garamond"/>
-        </w:rPr>
-        <w:t xml:space="preserve">Intégrer un système de contrôle automatique afin d</w:t>
-      </w:r>
-      <w:r>
-        <w:rPr>
-          <w:rFonts w:ascii="Garamond" w:hAnsi="Garamond" w:eastAsia="Garamond" w:cs="Garamond"/>
-        </w:rPr>
-        <w:t xml:space="preserve">’éviter </w:t>
-      </w:r>
-      <w:r>
-        <w:rPr>
-          <w:rFonts w:ascii="Garamond" w:hAnsi="Garamond" w:eastAsia="Garamond" w:cs="Garamond"/>
-        </w:rPr>
-        <w:t xml:space="preserve">les dépassements </w:t>
-      </w:r>
-      <w:r>
-        <w:rPr>
-          <w:rFonts w:ascii="Garamond" w:hAnsi="Garamond" w:eastAsia="Garamond" w:cs="Garamond"/>
-        </w:rPr>
-        <w:t xml:space="preserve">budgétaires</w:t>
-      </w:r>
-      <w:r>
-        <w:rPr>
-          <w:rFonts w:ascii="Garamond" w:hAnsi="Garamond" w:eastAsia="Garamond" w:cs="Garamond"/>
-        </w:rPr>
-        <w:t xml:space="preserve"> ;</w:t>
-      </w:r>
-      <w:r>
-        <w:rPr>
-          <w:rFonts w:ascii="Garamond" w:hAnsi="Garamond" w:cs="Garamond"/>
-        </w:rPr>
-      </w:r>
-      <w:r>
-        <w:rPr>
-          <w:rFonts w:ascii="Garamond" w:hAnsi="Garamond" w:cs="Garamond"/>
-        </w:rPr>
-      </w:r>
-    </w:p>
-    <w:p>
-      <w:pPr>
-        <w:pStyle w:val="935"/>
-        <w:numPr>
-          <w:ilvl w:val="0"/>
-          <w:numId w:val="8"/>
-        </w:numPr>
-        <w:pBdr/>
-        <w:spacing w:line="360" w:lineRule="auto"/>
-        <w:ind/>
-        <w:jc w:val="both"/>
-        <w:rPr>
-          <w:rFonts w:ascii="Garamond" w:hAnsi="Garamond" w:cs="Garamond"/>
-        </w:rPr>
-      </w:pPr>
-      <w:r>
-        <w:rPr>
-          <w:rFonts w:ascii="Garamond" w:hAnsi="Garamond" w:eastAsia="Garamond" w:cs="Garamond"/>
-        </w:rPr>
-        <w:t xml:space="preserve">Modéliser et implémenter le circuit de validation des dépenses en fonction de leur </w:t>
-      </w:r>
-      <w:r>
-        <w:rPr>
-          <w:rFonts w:ascii="Garamond" w:hAnsi="Garamond" w:eastAsia="Garamond" w:cs="Garamond"/>
-        </w:rPr>
-        <w:t xml:space="preserve">nature</w:t>
-      </w:r>
-      <w:r>
-        <w:rPr>
-          <w:rFonts w:ascii="Garamond" w:hAnsi="Garamond" w:eastAsia="Garamond" w:cs="Garamond"/>
-        </w:rPr>
-        <w:t xml:space="preserve"> ;</w:t>
-      </w:r>
-      <w:r>
-        <w:rPr>
-          <w:rFonts w:ascii="Garamond" w:hAnsi="Garamond" w:cs="Garamond"/>
-        </w:rPr>
-      </w:r>
-      <w:r>
-        <w:rPr>
-          <w:rFonts w:ascii="Garamond" w:hAnsi="Garamond" w:cs="Garamond"/>
-        </w:rPr>
-      </w:r>
-    </w:p>
-    <w:p>
-      <w:pPr>
-        <w:pStyle w:val="935"/>
-        <w:numPr>
-          <w:ilvl w:val="0"/>
-          <w:numId w:val="8"/>
-        </w:numPr>
-        <w:pBdr/>
-        <w:spacing w:line="360" w:lineRule="auto"/>
-        <w:ind/>
-        <w:jc w:val="both"/>
-        <w:rPr>
-          <w:rFonts w:ascii="Garamond" w:hAnsi="Garamond" w:cs="Garamond"/>
-        </w:rPr>
-      </w:pPr>
-      <w:r>
-        <w:rPr>
-          <w:rFonts w:ascii="Garamond" w:hAnsi="Garamond" w:eastAsia="Garamond" w:cs="Garamond"/>
-        </w:rPr>
-        <w:t xml:space="preserve">Garantir la traçabilité de l’ensemble des opérations financières </w:t>
-      </w:r>
-      <w:r>
-        <w:rPr>
-          <w:rFonts w:ascii="Garamond" w:hAnsi="Garamond" w:eastAsia="Garamond" w:cs="Garamond"/>
-        </w:rPr>
-        <w:t xml:space="preserve">;</w:t>
-      </w:r>
-      <w:r>
-        <w:rPr>
-          <w:rFonts w:ascii="Garamond" w:hAnsi="Garamond" w:cs="Garamond"/>
-        </w:rPr>
-      </w:r>
-      <w:r>
-        <w:rPr>
-          <w:rFonts w:ascii="Garamond" w:hAnsi="Garamond" w:cs="Garamond"/>
-        </w:rPr>
-      </w:r>
-    </w:p>
-    <w:p>
-      <w:pPr>
-        <w:pStyle w:val="935"/>
-        <w:numPr>
-          <w:ilvl w:val="0"/>
-          <w:numId w:val="8"/>
-        </w:numPr>
-        <w:pBdr/>
-        <w:spacing w:line="360" w:lineRule="auto"/>
-        <w:ind/>
-        <w:jc w:val="both"/>
-        <w:rPr>
-          <w:rFonts w:ascii="Garamond" w:hAnsi="Garamond" w:cs="Garamond"/>
-        </w:rPr>
-      </w:pPr>
-      <w:r>
-        <w:rPr>
-          <w:rFonts w:ascii="Garamond" w:hAnsi="Garamond" w:eastAsia="Garamond" w:cs="Garamond"/>
-        </w:rPr>
-        <w:t xml:space="preserve">Fournir des outils de </w:t>
-      </w:r>
-      <w:r>
-        <w:rPr>
-          <w:rFonts w:ascii="Garamond" w:hAnsi="Garamond" w:eastAsia="Garamond" w:cs="Garamond"/>
-        </w:rPr>
-        <w:t xml:space="preserve">reportions</w:t>
-      </w:r>
-      <w:r>
-        <w:rPr>
-          <w:rFonts w:ascii="Garamond" w:hAnsi="Garamond" w:eastAsia="Garamond" w:cs="Garamond"/>
-        </w:rPr>
-        <w:t xml:space="preserve"> pour le suivi et l’aide à la décision</w:t>
-      </w:r>
-      <w:r>
-        <w:rPr>
-          <w:rFonts w:ascii="Garamond" w:hAnsi="Garamond" w:eastAsia="Garamond" w:cs="Garamond"/>
-        </w:rPr>
-        <w:t xml:space="preserve">.</w:t>
-      </w:r>
-      <w:r>
-        <w:rPr>
-          <w:rFonts w:ascii="Garamond" w:hAnsi="Garamond" w:cs="Garamond"/>
-        </w:rPr>
-      </w:r>
-      <w:r>
-        <w:rPr>
-          <w:rFonts w:ascii="Garamond" w:hAnsi="Garamond" w:cs="Garamond"/>
-        </w:rPr>
-      </w:r>
-    </w:p>
-    <w:p>
-      <w:pPr>
-        <w:pStyle w:val="935"/>
-        <w:numPr>
-          <w:ilvl w:val="1"/>
-          <w:numId w:val="10"/>
-        </w:numPr>
-        <w:pBdr/>
-        <w:spacing w:line="360" w:lineRule="auto"/>
-        <w:ind/>
-        <w:jc w:val="both"/>
-        <w:rPr>
-          <w:rFonts w:ascii="Garamond" w:hAnsi="Garamond" w:cs="Garamond"/>
-          <w:b/>
-          <w:bCs/>
-          <w:sz w:val="28"/>
-          <w:szCs w:val="28"/>
-        </w:rPr>
-      </w:pPr>
-      <w:r>
-        <w:rPr>
-          <w:rFonts w:ascii="Garamond" w:hAnsi="Garamond" w:eastAsia="Garamond" w:cs="Garamond"/>
-          <w:b/>
-          <w:bCs/>
-          <w:sz w:val="28"/>
-          <w:szCs w:val="28"/>
-        </w:rPr>
-        <w:t xml:space="preserve">Résultats</w:t>
-      </w:r>
-      <w:r>
-        <w:rPr>
-          <w:rFonts w:ascii="Garamond" w:hAnsi="Garamond" w:eastAsia="Garamond" w:cs="Garamond"/>
-          <w:b/>
-          <w:bCs/>
-          <w:sz w:val="28"/>
-          <w:szCs w:val="28"/>
-        </w:rPr>
-        <w:t xml:space="preserve"> attendus</w:t>
-      </w:r>
-      <w:r>
-        <w:rPr>
-          <w:rFonts w:ascii="Garamond" w:hAnsi="Garamond" w:cs="Garamond"/>
-          <w:b/>
-          <w:bCs/>
-          <w:sz w:val="28"/>
-          <w:szCs w:val="28"/>
-        </w:rPr>
-      </w:r>
-      <w:r>
-        <w:rPr>
-          <w:rFonts w:ascii="Garamond" w:hAnsi="Garamond" w:cs="Garamond"/>
-          <w:b/>
-          <w:bCs/>
-          <w:sz w:val="28"/>
-          <w:szCs w:val="28"/>
-        </w:rPr>
-      </w:r>
-    </w:p>
-    <w:p>
-      <w:pPr>
-        <w:pBdr/>
-        <w:spacing w:line="360" w:lineRule="auto"/>
-        <w:ind w:firstLine="0" w:left="0"/>
-        <w:jc w:val="both"/>
-        <w:rPr>
-          <w:rFonts w:ascii="Garamond" w:hAnsi="Garamond" w:cs="Garamond"/>
-        </w:rPr>
-      </w:pPr>
-      <w:r>
-        <w:rPr>
-          <w:rFonts w:ascii="Garamond" w:hAnsi="Garamond" w:eastAsia="Garamond" w:cs="Garamond"/>
-        </w:rPr>
-      </w:r>
-      <w:r>
-        <w:rPr>
-          <w:rFonts w:ascii="Garamond" w:hAnsi="Garamond" w:eastAsia="Garamond" w:cs="Garamond"/>
-        </w:rPr>
-        <w:t xml:space="preserve">A l'issue du projet, le système livré devra permettre à chaque acteur de disposer d'une visibilité claire et en temps réel sur les fonds mobilisés et les budgets disponibles, d'un circuit de validation des dépenses formalisé et traçable, d'un historique co</w:t>
-      </w:r>
-      <w:r>
-        <w:rPr>
-          <w:rFonts w:ascii="Garamond" w:hAnsi="Garamond" w:eastAsia="Garamond" w:cs="Garamond"/>
-        </w:rPr>
-        <w:t xml:space="preserve">mplet et immuable de toutes les opérations financières, et de rapports fiables générés automatiquement pour les décideurs et les bailleurs de fonds.</w:t>
-      </w:r>
-      <w:r>
-        <w:rPr>
-          <w:rFonts w:ascii="Garamond" w:hAnsi="Garamond" w:cs="Garamond"/>
-        </w:rPr>
-      </w:r>
-      <w:r>
-        <w:rPr>
-          <w:rFonts w:ascii="Garamond" w:hAnsi="Garamond" w:cs="Garamond"/>
-        </w:rPr>
-      </w:r>
-    </w:p>
-    <w:p>
-      <w:pPr>
-        <w:pBdr/>
-        <w:spacing w:line="360" w:lineRule="auto"/>
-        <w:ind/>
-        <w:jc w:val="both"/>
-        <w:rPr>
-          <w:rFonts w:ascii="Garamond" w:hAnsi="Garamond" w:cs="Garamond"/>
-        </w:rPr>
-      </w:pPr>
-      <w:r>
-        <w:rPr>
-          <w:rFonts w:ascii="Garamond" w:hAnsi="Garamond" w:eastAsia="Garamond" w:cs="Garamond"/>
-        </w:rPr>
-      </w:r>
-      <w:r>
-        <w:rPr>
-          <w:rFonts w:ascii="Garamond" w:hAnsi="Garamond" w:cs="Garamond"/>
-        </w:rPr>
-      </w:r>
-      <w:r>
-        <w:rPr>
-          <w:rFonts w:ascii="Garamond" w:hAnsi="Garamond" w:cs="Garamond"/>
-        </w:rPr>
-      </w:r>
-    </w:p>
-    <w:p>
-      <w:pPr>
-        <w:pStyle w:val="935"/>
-        <w:numPr>
-          <w:ilvl w:val="1"/>
-          <w:numId w:val="10"/>
-        </w:numPr>
-        <w:pBdr/>
-        <w:spacing w:line="360" w:lineRule="auto"/>
-        <w:ind/>
-        <w:jc w:val="both"/>
-        <w:rPr>
-          <w:rFonts w:ascii="Garamond" w:hAnsi="Garamond" w:cs="Garamond"/>
-          <w:b/>
-          <w:bCs/>
-          <w:sz w:val="28"/>
-          <w:szCs w:val="28"/>
-        </w:rPr>
-      </w:pPr>
-      <w:r>
-        <w:rPr>
-          <w:rFonts w:ascii="Garamond" w:hAnsi="Garamond" w:eastAsia="Garamond" w:cs="Garamond"/>
-          <w:b/>
-          <w:bCs/>
-          <w:sz w:val="28"/>
-          <w:szCs w:val="28"/>
-        </w:rPr>
-      </w:r>
-      <w:r>
-        <w:rPr>
-          <w:rFonts w:ascii="Garamond" w:hAnsi="Garamond" w:eastAsia="Garamond" w:cs="Garamond"/>
-          <w:b/>
-          <w:bCs/>
-          <w:sz w:val="28"/>
-          <w:szCs w:val="28"/>
-        </w:rPr>
-        <w:t xml:space="preserve">Acteurs et organisation du projet</w:t>
-      </w:r>
-      <w:r>
-        <w:rPr>
-          <w:rFonts w:ascii="Garamond" w:hAnsi="Garamond" w:cs="Garamond"/>
-          <w:b/>
-          <w:bCs/>
-          <w:sz w:val="28"/>
-          <w:szCs w:val="28"/>
-        </w:rPr>
-      </w:r>
-      <w:r>
-        <w:rPr>
-          <w:rFonts w:ascii="Garamond" w:hAnsi="Garamond" w:cs="Garamond"/>
-          <w:b/>
-          <w:bCs/>
-          <w:sz w:val="28"/>
-          <w:szCs w:val="28"/>
-        </w:rPr>
-      </w:r>
-    </w:p>
-    <w:p>
-      <w:pPr>
-        <w:pStyle w:val="935"/>
-        <w:numPr>
-          <w:ilvl w:val="2"/>
-          <w:numId w:val="10"/>
-        </w:numPr>
-        <w:pBdr/>
-        <w:spacing w:line="360" w:lineRule="auto"/>
-        <w:ind/>
-        <w:jc w:val="both"/>
-        <w:rPr>
-          <w:rFonts w:ascii="Garamond" w:hAnsi="Garamond" w:cs="Garamond"/>
-          <w:b/>
-          <w:bCs/>
-          <w:sz w:val="28"/>
-          <w:szCs w:val="28"/>
-        </w:rPr>
-      </w:pPr>
-      <w:r>
-        <w:rPr>
-          <w:rFonts w:ascii="Garamond" w:hAnsi="Garamond" w:eastAsia="Garamond" w:cs="Garamond"/>
-          <w:b/>
-          <w:bCs/>
-          <w:sz w:val="28"/>
-          <w:szCs w:val="28"/>
-        </w:rPr>
-        <w:t xml:space="preserve">Acteur du projet</w:t>
-      </w:r>
-      <w:r>
-        <w:rPr>
-          <w:rFonts w:ascii="Garamond" w:hAnsi="Garamond" w:cs="Garamond"/>
           <w:b/>
           <w:bCs/>
           <w:sz w:val="28"/>
@@ -3346,7 +3340,7 @@
       </w:r>
       <w:r>
         <w:rPr>
-          <w:rFonts w:ascii="Garamond" w:hAnsi="Garamond" w:cs="Garamond"/>
+          <w:rFonts w:ascii="Garamond" w:hAnsi="Garamond" w:eastAsia="Garamond" w:cs="Garamond"/>
         </w:rPr>
       </w:r>
       <w:r>
@@ -3397,7 +3391,7 @@
       </w:r>
       <w:r>
         <w:rPr>
-          <w:rFonts w:ascii="Garamond" w:hAnsi="Garamond" w:cs="Garamond"/>
+          <w:rFonts w:ascii="Garamond" w:hAnsi="Garamond" w:eastAsia="Garamond" w:cs="Garamond"/>
         </w:rPr>
       </w:r>
       <w:r>
@@ -3440,7 +3434,7 @@
       </w:r>
       <w:r>
         <w:rPr>
-          <w:rFonts w:ascii="Garamond" w:hAnsi="Garamond" w:cs="Garamond"/>
+          <w:rFonts w:ascii="Garamond" w:hAnsi="Garamond" w:eastAsia="Garamond" w:cs="Garamond"/>
         </w:rPr>
       </w:r>
       <w:r>
@@ -3483,7 +3477,7 @@
       </w:r>
       <w:r>
         <w:rPr>
-          <w:rFonts w:ascii="Garamond" w:hAnsi="Garamond" w:cs="Garamond"/>
+          <w:rFonts w:ascii="Garamond" w:hAnsi="Garamond" w:eastAsia="Garamond" w:cs="Garamond"/>
         </w:rPr>
       </w:r>
       <w:r>
@@ -3512,7 +3506,7 @@
       </w:r>
       <w:r>
         <w:rPr>
-          <w:rFonts w:ascii="Garamond" w:hAnsi="Garamond" w:cs="Garamond"/>
+          <w:rFonts w:ascii="Garamond" w:hAnsi="Garamond" w:eastAsia="Garamond" w:cs="Garamond"/>
           <w:highlight w:val="none"/>
         </w:rPr>
       </w:r>
@@ -3564,6 +3558,15 @@
       </w:r>
       <w:r>
         <w:rPr>
+          <w:rFonts w:ascii="Garamond" w:hAnsi="Garamond" w:eastAsia="Garamond" w:cs="Garamond"/>
+          <w:b/>
+          <w:bCs/>
+          <w:sz w:val="28"/>
+          <w:szCs w:val="28"/>
+        </w:rPr>
+      </w:r>
+      <w:r>
+        <w:rPr>
           <w:rFonts w:ascii="Garamond" w:hAnsi="Garamond" w:cs="Garamond"/>
           <w:b/>
           <w:bCs/>
@@ -3571,15 +3574,6 @@
           <w:szCs w:val="28"/>
         </w:rPr>
       </w:r>
-      <w:r>
-        <w:rPr>
-          <w:rFonts w:ascii="Garamond" w:hAnsi="Garamond" w:cs="Garamond"/>
-          <w:b/>
-          <w:bCs/>
-          <w:sz w:val="28"/>
-          <w:szCs w:val="28"/>
-        </w:rPr>
-      </w:r>
     </w:p>
     <w:p>
       <w:pPr>
@@ -3599,7 +3593,7 @@
       </w:r>
       <w:r>
         <w:rPr>
-          <w:rFonts w:ascii="Garamond" w:hAnsi="Garamond" w:cs="Garamond"/>
+          <w:rFonts w:ascii="Garamond" w:hAnsi="Garamond" w:eastAsia="Garamond" w:cs="Garamond"/>
         </w:rPr>
       </w:r>
       <w:r>
@@ -3632,7 +3626,7 @@
       </w:r>
       <w:r>
         <w:rPr>
-          <w:rFonts w:ascii="Garamond" w:hAnsi="Garamond" w:cs="Garamond"/>
+          <w:rFonts w:ascii="Garamond" w:hAnsi="Garamond" w:eastAsia="Garamond" w:cs="Garamond"/>
         </w:rPr>
       </w:r>
       <w:r>
@@ -3680,7 +3674,7 @@
             </w:r>
             <w:r>
               <w:rPr>
-                <w:rFonts w:ascii="Garamond" w:hAnsi="Garamond" w:cs="Garamond"/>
+                <w:rFonts w:ascii="Garamond" w:hAnsi="Garamond" w:eastAsia="Garamond" w:cs="Garamond"/>
               </w:rPr>
             </w:r>
             <w:r>
@@ -3713,7 +3707,7 @@
             </w:r>
             <w:r>
               <w:rPr>
-                <w:rFonts w:ascii="Garamond" w:hAnsi="Garamond" w:cs="Garamond"/>
+                <w:rFonts w:ascii="Garamond" w:hAnsi="Garamond" w:eastAsia="Garamond" w:cs="Garamond"/>
               </w:rPr>
             </w:r>
             <w:r>
@@ -3746,7 +3740,7 @@
             </w:r>
             <w:r>
               <w:rPr>
-                <w:rFonts w:ascii="Garamond" w:hAnsi="Garamond" w:cs="Garamond"/>
+                <w:rFonts w:ascii="Garamond" w:hAnsi="Garamond" w:eastAsia="Garamond" w:cs="Garamond"/>
               </w:rPr>
             </w:r>
             <w:r>
@@ -3779,7 +3773,7 @@
             </w:r>
             <w:r>
               <w:rPr>
-                <w:rFonts w:ascii="Garamond" w:hAnsi="Garamond" w:cs="Garamond"/>
+                <w:rFonts w:ascii="Garamond" w:hAnsi="Garamond" w:eastAsia="Garamond" w:cs="Garamond"/>
               </w:rPr>
             </w:r>
             <w:r>
@@ -3817,7 +3811,7 @@
             </w:r>
             <w:r>
               <w:rPr>
-                <w:rFonts w:ascii="Garamond" w:hAnsi="Garamond" w:cs="Garamond"/>
+                <w:rFonts w:ascii="Garamond" w:hAnsi="Garamond" w:eastAsia="Garamond" w:cs="Garamond"/>
               </w:rPr>
             </w:r>
             <w:r>
@@ -3850,7 +3844,7 @@
             </w:r>
             <w:r>
               <w:rPr>
-                <w:rFonts w:ascii="Garamond" w:hAnsi="Garamond" w:cs="Garamond"/>
+                <w:rFonts w:ascii="Garamond" w:hAnsi="Garamond" w:eastAsia="Garamond" w:cs="Garamond"/>
               </w:rPr>
             </w:r>
             <w:r>
@@ -3883,7 +3877,7 @@
             </w:r>
             <w:r>
               <w:rPr>
-                <w:rFonts w:ascii="Garamond" w:hAnsi="Garamond" w:cs="Garamond"/>
+                <w:rFonts w:ascii="Garamond" w:hAnsi="Garamond" w:eastAsia="Garamond" w:cs="Garamond"/>
               </w:rPr>
             </w:r>
             <w:r>
@@ -3916,7 +3910,7 @@
             </w:r>
             <w:r>
               <w:rPr>
-                <w:rFonts w:ascii="Garamond" w:hAnsi="Garamond" w:cs="Garamond"/>
+                <w:rFonts w:ascii="Garamond" w:hAnsi="Garamond" w:eastAsia="Garamond" w:cs="Garamond"/>
               </w:rPr>
             </w:r>
             <w:r>
@@ -3954,7 +3948,7 @@
             </w:r>
             <w:r>
               <w:rPr>
-                <w:rFonts w:ascii="Garamond" w:hAnsi="Garamond" w:cs="Garamond"/>
+                <w:rFonts w:ascii="Garamond" w:hAnsi="Garamond" w:eastAsia="Garamond" w:cs="Garamond"/>
               </w:rPr>
             </w:r>
             <w:r>
@@ -3987,7 +3981,7 @@
             </w:r>
             <w:r>
               <w:rPr>
-                <w:rFonts w:ascii="Garamond" w:hAnsi="Garamond" w:cs="Garamond"/>
+                <w:rFonts w:ascii="Garamond" w:hAnsi="Garamond" w:eastAsia="Garamond" w:cs="Garamond"/>
               </w:rPr>
             </w:r>
             <w:r>
@@ -4020,7 +4014,7 @@
             </w:r>
             <w:r>
               <w:rPr>
-                <w:rFonts w:ascii="Garamond" w:hAnsi="Garamond" w:cs="Garamond"/>
+                <w:rFonts w:ascii="Garamond" w:hAnsi="Garamond" w:eastAsia="Garamond" w:cs="Garamond"/>
               </w:rPr>
             </w:r>
             <w:r>
@@ -4053,7 +4047,7 @@
             </w:r>
             <w:r>
               <w:rPr>
-                <w:rFonts w:ascii="Garamond" w:hAnsi="Garamond" w:cs="Garamond"/>
+                <w:rFonts w:ascii="Garamond" w:hAnsi="Garamond" w:eastAsia="Garamond" w:cs="Garamond"/>
               </w:rPr>
             </w:r>
             <w:r>
@@ -4089,7 +4083,7 @@
             </w:r>
             <w:r>
               <w:rPr>
-                <w:rFonts w:ascii="Garamond" w:hAnsi="Garamond" w:cs="Garamond"/>
+                <w:rFonts w:ascii="Garamond" w:hAnsi="Garamond" w:eastAsia="Garamond" w:cs="Garamond"/>
               </w:rPr>
             </w:r>
             <w:r>
@@ -4122,7 +4116,7 @@
             </w:r>
             <w:r>
               <w:rPr>
-                <w:rFonts w:ascii="Garamond" w:hAnsi="Garamond" w:cs="Garamond"/>
+                <w:rFonts w:ascii="Garamond" w:hAnsi="Garamond" w:eastAsia="Garamond" w:cs="Garamond"/>
               </w:rPr>
             </w:r>
             <w:r>
@@ -4155,7 +4149,7 @@
             </w:r>
             <w:r>
               <w:rPr>
-                <w:rFonts w:ascii="Garamond" w:hAnsi="Garamond" w:cs="Garamond"/>
+                <w:rFonts w:ascii="Garamond" w:hAnsi="Garamond" w:eastAsia="Garamond" w:cs="Garamond"/>
               </w:rPr>
             </w:r>
             <w:r>
@@ -4188,7 +4182,7 @@
             </w:r>
             <w:r>
               <w:rPr>
-                <w:rFonts w:ascii="Garamond" w:hAnsi="Garamond" w:cs="Garamond"/>
+                <w:rFonts w:ascii="Garamond" w:hAnsi="Garamond" w:eastAsia="Garamond" w:cs="Garamond"/>
               </w:rPr>
             </w:r>
             <w:r>
@@ -4224,7 +4218,7 @@
             </w:r>
             <w:r>
               <w:rPr>
-                <w:rFonts w:ascii="Garamond" w:hAnsi="Garamond" w:cs="Garamond"/>
+                <w:rFonts w:ascii="Garamond" w:hAnsi="Garamond" w:eastAsia="Garamond" w:cs="Garamond"/>
               </w:rPr>
             </w:r>
             <w:r>
@@ -4257,7 +4251,7 @@
             </w:r>
             <w:r>
               <w:rPr>
-                <w:rFonts w:ascii="Garamond" w:hAnsi="Garamond" w:cs="Garamond"/>
+                <w:rFonts w:ascii="Garamond" w:hAnsi="Garamond" w:eastAsia="Garamond" w:cs="Garamond"/>
               </w:rPr>
             </w:r>
             <w:r>
@@ -4290,7 +4284,7 @@
             </w:r>
             <w:r>
               <w:rPr>
-                <w:rFonts w:ascii="Garamond" w:hAnsi="Garamond" w:cs="Garamond"/>
+                <w:rFonts w:ascii="Garamond" w:hAnsi="Garamond" w:eastAsia="Garamond" w:cs="Garamond"/>
               </w:rPr>
             </w:r>
             <w:r>
@@ -4323,7 +4317,7 @@
             </w:r>
             <w:r>
               <w:rPr>
-                <w:rFonts w:ascii="Garamond" w:hAnsi="Garamond" w:cs="Garamond"/>
+                <w:rFonts w:ascii="Garamond" w:hAnsi="Garamond" w:eastAsia="Garamond" w:cs="Garamond"/>
               </w:rPr>
             </w:r>
             <w:r>
@@ -4359,7 +4353,7 @@
             </w:r>
             <w:r>
               <w:rPr>
-                <w:rFonts w:ascii="Garamond" w:hAnsi="Garamond" w:cs="Garamond"/>
+                <w:rFonts w:ascii="Garamond" w:hAnsi="Garamond" w:eastAsia="Garamond" w:cs="Garamond"/>
               </w:rPr>
             </w:r>
             <w:r>
@@ -4392,7 +4386,7 @@
             </w:r>
             <w:r>
               <w:rPr>
-                <w:rFonts w:ascii="Garamond" w:hAnsi="Garamond" w:cs="Garamond"/>
+                <w:rFonts w:ascii="Garamond" w:hAnsi="Garamond" w:eastAsia="Garamond" w:cs="Garamond"/>
               </w:rPr>
             </w:r>
             <w:r>
@@ -4425,7 +4419,7 @@
             </w:r>
             <w:r>
               <w:rPr>
-                <w:rFonts w:ascii="Garamond" w:hAnsi="Garamond" w:cs="Garamond"/>
+                <w:rFonts w:ascii="Garamond" w:hAnsi="Garamond" w:eastAsia="Garamond" w:cs="Garamond"/>
               </w:rPr>
             </w:r>
             <w:r>
@@ -4458,7 +4452,7 @@
             </w:r>
             <w:r>
               <w:rPr>
-                <w:rFonts w:ascii="Garamond" w:hAnsi="Garamond" w:cs="Garamond"/>
+                <w:rFonts w:ascii="Garamond" w:hAnsi="Garamond" w:eastAsia="Garamond" w:cs="Garamond"/>
               </w:rPr>
             </w:r>
             <w:r>
@@ -4494,7 +4488,7 @@
             </w:r>
             <w:r>
               <w:rPr>
-                <w:rFonts w:ascii="Garamond" w:hAnsi="Garamond" w:cs="Garamond"/>
+                <w:rFonts w:ascii="Garamond" w:hAnsi="Garamond" w:eastAsia="Garamond" w:cs="Garamond"/>
               </w:rPr>
             </w:r>
             <w:r>
@@ -4527,7 +4521,7 @@
             </w:r>
             <w:r>
               <w:rPr>
-                <w:rFonts w:ascii="Garamond" w:hAnsi="Garamond" w:cs="Garamond"/>
+                <w:rFonts w:ascii="Garamond" w:hAnsi="Garamond" w:eastAsia="Garamond" w:cs="Garamond"/>
               </w:rPr>
             </w:r>
             <w:r>
@@ -4560,7 +4554,7 @@
             </w:r>
             <w:r>
               <w:rPr>
-                <w:rFonts w:ascii="Garamond" w:hAnsi="Garamond" w:cs="Garamond"/>
+                <w:rFonts w:ascii="Garamond" w:hAnsi="Garamond" w:eastAsia="Garamond" w:cs="Garamond"/>
               </w:rPr>
             </w:r>
             <w:r>
@@ -4593,7 +4587,7 @@
             </w:r>
             <w:r>
               <w:rPr>
-                <w:rFonts w:ascii="Garamond" w:hAnsi="Garamond" w:cs="Garamond"/>
+                <w:rFonts w:ascii="Garamond" w:hAnsi="Garamond" w:eastAsia="Garamond" w:cs="Garamond"/>
               </w:rPr>
             </w:r>
             <w:r>
@@ -4629,7 +4623,7 @@
             </w:r>
             <w:r>
               <w:rPr>
-                <w:rFonts w:ascii="Garamond" w:hAnsi="Garamond" w:cs="Garamond"/>
+                <w:rFonts w:ascii="Garamond" w:hAnsi="Garamond" w:eastAsia="Garamond" w:cs="Garamond"/>
               </w:rPr>
             </w:r>
             <w:r>
@@ -4662,7 +4656,7 @@
             </w:r>
             <w:r>
               <w:rPr>
-                <w:rFonts w:ascii="Garamond" w:hAnsi="Garamond" w:cs="Garamond"/>
+                <w:rFonts w:ascii="Garamond" w:hAnsi="Garamond" w:eastAsia="Garamond" w:cs="Garamond"/>
               </w:rPr>
             </w:r>
             <w:r>
@@ -4695,7 +4689,7 @@
             </w:r>
             <w:r>
               <w:rPr>
-                <w:rFonts w:ascii="Garamond" w:hAnsi="Garamond" w:cs="Garamond"/>
+                <w:rFonts w:ascii="Garamond" w:hAnsi="Garamond" w:eastAsia="Garamond" w:cs="Garamond"/>
               </w:rPr>
             </w:r>
             <w:r>
@@ -4728,7 +4722,7 @@
             </w:r>
             <w:r>
               <w:rPr>
-                <w:rFonts w:ascii="Garamond" w:hAnsi="Garamond" w:cs="Garamond"/>
+                <w:rFonts w:ascii="Garamond" w:hAnsi="Garamond" w:eastAsia="Garamond" w:cs="Garamond"/>
               </w:rPr>
             </w:r>
             <w:r>
@@ -4764,7 +4758,7 @@
             </w:r>
             <w:r>
               <w:rPr>
-                <w:rFonts w:ascii="Garamond" w:hAnsi="Garamond" w:cs="Garamond"/>
+                <w:rFonts w:ascii="Garamond" w:hAnsi="Garamond" w:eastAsia="Garamond" w:cs="Garamond"/>
               </w:rPr>
             </w:r>
             <w:r>
@@ -4797,7 +4791,7 @@
             </w:r>
             <w:r>
               <w:rPr>
-                <w:rFonts w:ascii="Garamond" w:hAnsi="Garamond" w:cs="Garamond"/>
+                <w:rFonts w:ascii="Garamond" w:hAnsi="Garamond" w:eastAsia="Garamond" w:cs="Garamond"/>
               </w:rPr>
             </w:r>
             <w:r>
@@ -4830,7 +4824,7 @@
             </w:r>
             <w:r>
               <w:rPr>
-                <w:rFonts w:ascii="Garamond" w:hAnsi="Garamond" w:cs="Garamond"/>
+                <w:rFonts w:ascii="Garamond" w:hAnsi="Garamond" w:eastAsia="Garamond" w:cs="Garamond"/>
               </w:rPr>
             </w:r>
             <w:r>
@@ -4863,7 +4857,7 @@
             </w:r>
             <w:r>
               <w:rPr>
-                <w:rFonts w:ascii="Garamond" w:hAnsi="Garamond" w:cs="Garamond"/>
+                <w:rFonts w:ascii="Garamond" w:hAnsi="Garamond" w:eastAsia="Garamond" w:cs="Garamond"/>
               </w:rPr>
             </w:r>
             <w:r>
@@ -4892,7 +4886,7 @@
       </w:r>
       <w:r>
         <w:rPr>
-          <w:rFonts w:ascii="Garamond" w:hAnsi="Garamond" w:cs="Garamond"/>
+          <w:rFonts w:ascii="Garamond" w:hAnsi="Garamond" w:eastAsia="Garamond" w:cs="Garamond"/>
         </w:rPr>
       </w:r>
       <w:r>
@@ -4927,6 +4921,15 @@
       </w:r>
       <w:r>
         <w:rPr>
+          <w:rFonts w:ascii="Garamond" w:hAnsi="Garamond" w:eastAsia="Garamond" w:cs="Garamond"/>
+          <w:b/>
+          <w:bCs/>
+          <w:sz w:val="28"/>
+          <w:szCs w:val="28"/>
+        </w:rPr>
+      </w:r>
+      <w:r>
+        <w:rPr>
           <w:rFonts w:ascii="Garamond" w:hAnsi="Garamond" w:cs="Garamond"/>
           <w:b/>
           <w:bCs/>
@@ -4934,15 +4937,6 @@
           <w:szCs w:val="28"/>
         </w:rPr>
       </w:r>
-      <w:r>
-        <w:rPr>
-          <w:rFonts w:ascii="Garamond" w:hAnsi="Garamond" w:cs="Garamond"/>
-          <w:b/>
-          <w:bCs/>
-          <w:sz w:val="28"/>
-          <w:szCs w:val="28"/>
-        </w:rPr>
-      </w:r>
     </w:p>
     <w:p>
       <w:pPr>
@@ -4965,56 +4959,18 @@
         <w:rPr>
           <w:rFonts w:ascii="Garamond" w:hAnsi="Garamond" w:eastAsia="Garamond" w:cs="Garamond"/>
         </w:rPr>
-        <w:t xml:space="preserve">Ce chapitre a permis de poser le cadre général du stage. La présentation de l'ESI et de la DSI de l'UJKZ a situé les deux structures où ce travail prend place. </w:t>
+        <w:t xml:space="preserve">Ce chapitre a présenté le cadre du stage ainsi que les différentes structures impliquées dans le projet CIFEU. Il a également permis de mieux comprendre le contexte du projet et les enjeux liés à la gestion des financements extérieurs à l’UJKZ. Le chapitre </w:t>
       </w:r>
       <w:r>
         <w:rPr>
           <w:rFonts w:ascii="Garamond" w:hAnsi="Garamond" w:eastAsia="Garamond" w:cs="Garamond"/>
-          <w:highlight w:val="none"/>
-        </w:rPr>
-        <w:t xml:space="preserve">La description du projet a ensuite mis en évidence la problématique de la gestion des financements extérieurs, les objectifs poursuivis et les résultats attendus.</w:t>
+        </w:rPr>
+        <w:t xml:space="preserve">suivant portera sur l’étude du système actuel et les limites observées.</w:t>
       </w:r>
       <w:r>
         <w:rPr>
           <w:rFonts w:ascii="Garamond" w:hAnsi="Garamond" w:eastAsia="Garamond" w:cs="Garamond"/>
         </w:rPr>
-        <w:t xml:space="preserve">Enfin, l’identification des acteurs ainsi que la planification du projet ont permis de structurer la démarche adoptée pour la réalisation du </w:t>
-      </w:r>
-      <w:r>
-        <w:rPr>
-          <w:rFonts w:ascii="Garamond" w:hAnsi="Garamond" w:eastAsia="Garamond" w:cs="Garamond"/>
-        </w:rPr>
-        <w:t xml:space="preserve">module. Ce</w:t>
-      </w:r>
-      <w:r>
-        <w:rPr>
-          <w:rFonts w:ascii="Garamond" w:hAnsi="Garamond" w:eastAsia="Garamond" w:cs="Garamond"/>
-        </w:rPr>
-        <w:t xml:space="preserve"> cadrage constitue une base</w:t>
-      </w:r>
-      <w:r>
-        <w:rPr>
-          <w:rFonts w:ascii="Garamond" w:hAnsi="Garamond" w:eastAsia="Garamond" w:cs="Garamond"/>
-        </w:rPr>
-        <w:t xml:space="preserve"> </w:t>
-      </w:r>
-      <w:r>
-        <w:rPr>
-          <w:rFonts w:ascii="Garamond" w:hAnsi="Garamond" w:eastAsia="Garamond" w:cs="Garamond"/>
-        </w:rPr>
-        <w:t xml:space="preserve">essentielle pour la suite du travail, qui portera sur </w:t>
-      </w:r>
-      <w:r>
-        <w:rPr>
-          <w:rFonts w:ascii="Garamond" w:hAnsi="Garamond" w:eastAsia="Garamond" w:cs="Garamond"/>
-        </w:rPr>
-        <w:t xml:space="preserve">l</w:t>
-      </w:r>
-      <w:r>
-        <w:rPr>
-          <w:rFonts w:ascii="Garamond" w:hAnsi="Garamond" w:eastAsia="Garamond" w:cs="Garamond"/>
-        </w:rPr>
-        <w:t xml:space="preserve">’analyse détaillée des besoins et la conception du système.</w:t>
       </w:r>
       <w:r>
         <w:rPr>
@@ -5022,12 +4978,6 @@
           <w:highlight w:val="none"/>
         </w:rPr>
       </w:r>
-      <w:r>
-        <w:rPr>
-          <w:rFonts w:ascii="Garamond" w:hAnsi="Garamond" w:cs="Garamond"/>
-          <w:highlight w:val="none"/>
-        </w:rPr>
-      </w:r>
     </w:p>
     <w:p>
       <w:pPr>
@@ -5046,7 +4996,7 @@
       </w:r>
       <w:r>
         <w:rPr>
-          <w:rFonts w:ascii="Garamond" w:hAnsi="Garamond" w:cs="Garamond"/>
+          <w:rFonts w:ascii="Garamond" w:hAnsi="Garamond" w:eastAsia="Garamond" w:cs="Garamond"/>
         </w:rPr>
       </w:r>
       <w:r>

</xml_diff>